<commit_message>
Doc: #S05: Dashboard UI v1.0.2, Statistics Ui v1.0.0 - L00183767 - 19/10/2026
</commit_message>
<xml_diff>
--- a/CPDCA1_L00183767_Turner.docx
+++ b/CPDCA1_L00183767_Turner.docx
@@ -67,7 +67,6 @@
         </w:rPr>
         <w:t xml:space="preserve">pplication design for </w:t>
       </w:r>
-      <w:proofErr w:type="spellStart"/>
       <w:r>
         <w:rPr>
           <w:b/>
@@ -75,18 +74,16 @@
           <w:sz w:val="32"/>
           <w:szCs w:val="32"/>
         </w:rPr>
-        <w:t>HealthTrack</w:t>
-      </w:r>
-      <w:proofErr w:type="spellEnd"/>
-      <w:r>
-        <w:rPr>
-          <w:b/>
-          <w:bCs/>
+        <w:t>HealthTrack - a next generation mobile application for Digital Health Ireland</w:t>
+      </w:r>
+    </w:p>
+    <w:p>
+      <w:pPr>
+        <w:rPr>
           <w:sz w:val="32"/>
           <w:szCs w:val="32"/>
         </w:rPr>
-        <w:t xml:space="preserve"> - a next generation mobile application for Digital Health Ireland</w:t>
-      </w:r>
+      </w:pPr>
     </w:p>
     <w:p>
       <w:pPr>
@@ -111,71 +108,56 @@
           <w:szCs w:val="32"/>
         </w:rPr>
       </w:pPr>
-    </w:p>
-    <w:p>
-      <w:pPr>
+      <w:r>
         <w:rPr>
           <w:sz w:val="32"/>
           <w:szCs w:val="32"/>
         </w:rPr>
-      </w:pPr>
+        <w:t xml:space="preserve">Student: </w:t>
+      </w:r>
       <w:r>
         <w:rPr>
           <w:sz w:val="32"/>
           <w:szCs w:val="32"/>
         </w:rPr>
-        <w:t xml:space="preserve">Student: </w:t>
-      </w:r>
-      <w:r>
+        <w:t>Ryan Turner</w:t>
+      </w:r>
+    </w:p>
+    <w:p>
+      <w:pPr>
         <w:rPr>
           <w:sz w:val="32"/>
           <w:szCs w:val="32"/>
         </w:rPr>
-        <w:t>Ryan Turner</w:t>
-      </w:r>
-    </w:p>
-    <w:p>
-      <w:pPr>
+      </w:pPr>
+      <w:r>
         <w:rPr>
           <w:sz w:val="32"/>
           <w:szCs w:val="32"/>
         </w:rPr>
-      </w:pPr>
+        <w:t>Student number: L00</w:t>
+      </w:r>
       <w:r>
         <w:rPr>
           <w:sz w:val="32"/>
           <w:szCs w:val="32"/>
         </w:rPr>
-        <w:t>Student number: L00</w:t>
-      </w:r>
-      <w:r>
+        <w:t>183767</w:t>
+      </w:r>
+    </w:p>
+    <w:p>
+      <w:pPr>
         <w:rPr>
           <w:sz w:val="32"/>
           <w:szCs w:val="32"/>
         </w:rPr>
-        <w:t>183767</w:t>
-      </w:r>
-    </w:p>
-    <w:p>
-      <w:pPr>
+      </w:pPr>
+      <w:r>
         <w:rPr>
           <w:sz w:val="32"/>
           <w:szCs w:val="32"/>
         </w:rPr>
-      </w:pPr>
-      <w:r>
-        <w:rPr>
-          <w:sz w:val="32"/>
-          <w:szCs w:val="32"/>
-        </w:rPr>
-        <w:t xml:space="preserve">GitHub repository link: </w:t>
-      </w:r>
-      <w:r>
-        <w:rPr>
-          <w:sz w:val="32"/>
-          <w:szCs w:val="32"/>
-        </w:rPr>
-        <w:t xml:space="preserve"> </w:t>
+        <w:t>GitHub repository link:</w:t>
       </w:r>
     </w:p>
     <w:p>
@@ -193,6 +175,32 @@
           <w:docGrid w:linePitch="360"/>
         </w:sectPr>
       </w:pPr>
+      <w:hyperlink r:id="rId10" w:history="1">
+        <w:r>
+          <w:rPr>
+            <w:rStyle w:val="Hyperlink"/>
+            <w:sz w:val="32"/>
+            <w:szCs w:val="32"/>
+          </w:rPr>
+          <w:t>https://git</w:t>
+        </w:r>
+        <w:r>
+          <w:rPr>
+            <w:rStyle w:val="Hyperlink"/>
+            <w:sz w:val="32"/>
+            <w:szCs w:val="32"/>
+          </w:rPr>
+          <w:t>h</w:t>
+        </w:r>
+        <w:r>
+          <w:rPr>
+            <w:rStyle w:val="Hyperlink"/>
+            <w:sz w:val="32"/>
+            <w:szCs w:val="32"/>
+          </w:rPr>
+          <w:t>ub.com/Turner2405/CrossPlatformDev---L00183767---Project</w:t>
+        </w:r>
+      </w:hyperlink>
     </w:p>
     <w:sdt>
       <w:sdtPr>
@@ -1137,11 +1145,64 @@
         <w:tabs>
           <w:tab w:val="right" w:leader="dot" w:pos="9016"/>
         </w:tabs>
+      </w:pPr>
+      <w:r>
+        <w:t>Figure 1 An image showing the Apps Navigation bar</w:t>
+      </w:r>
+      <w:r>
+        <w:tab/>
+        <w:t>1</w:t>
+      </w:r>
+    </w:p>
+    <w:p>
+      <w:pPr>
+        <w:pStyle w:val="TableofFigures"/>
+        <w:tabs>
+          <w:tab w:val="right" w:leader="dot" w:pos="9016"/>
+        </w:tabs>
+      </w:pPr>
+      <w:r>
+        <w:t xml:space="preserve">Figure </w:t>
+      </w:r>
+      <w:r>
+        <w:t>2</w:t>
+      </w:r>
+      <w:r>
+        <w:t xml:space="preserve"> An image showing the Apps Navigation bar</w:t>
+      </w:r>
+      <w:r>
+        <w:tab/>
+      </w:r>
+      <w:r>
+        <w:t>2</w:t>
+      </w:r>
+    </w:p>
+    <w:p>
+      <w:pPr>
+        <w:pStyle w:val="TableofFigures"/>
+        <w:tabs>
+          <w:tab w:val="right" w:leader="dot" w:pos="9016"/>
+        </w:tabs>
         <w:rPr>
           <w:noProof/>
         </w:rPr>
       </w:pPr>
       <w:r>
+        <w:t xml:space="preserve">Figure </w:t>
+      </w:r>
+      <w:r>
+        <w:t>3</w:t>
+      </w:r>
+      <w:r>
+        <w:t xml:space="preserve"> An image showing the Apps Navigation bar</w:t>
+      </w:r>
+      <w:r>
+        <w:tab/>
+      </w:r>
+      <w:r>
+        <w:t>3</w:t>
+      </w:r>
+      <w:r>
         <w:fldChar w:fldCharType="begin"/>
       </w:r>
       <w:r>
@@ -1150,63 +1211,31 @@
       <w:r>
         <w:fldChar w:fldCharType="separate"/>
       </w:r>
-      <w:hyperlink w:anchor="_Toc184306733" w:history="1">
-        <w:r>
-          <w:rPr>
-            <w:rStyle w:val="Hyperlink"/>
-            <w:noProof/>
-          </w:rPr>
-          <w:t>Figure 1 Screenshot of the first prompt used to generate initial code for the programming task</w:t>
-        </w:r>
-        <w:r>
-          <w:rPr>
-            <w:noProof/>
-            <w:webHidden/>
-          </w:rPr>
-          <w:tab/>
-        </w:r>
-        <w:r>
-          <w:rPr>
-            <w:noProof/>
-            <w:webHidden/>
-          </w:rPr>
-          <w:fldChar w:fldCharType="begin"/>
-        </w:r>
-        <w:r>
-          <w:rPr>
-            <w:noProof/>
-            <w:webHidden/>
-          </w:rPr>
-          <w:instrText xml:space="preserve"> PAGEREF _Toc184306733 \h </w:instrText>
-        </w:r>
-        <w:r>
-          <w:rPr>
-            <w:noProof/>
-            <w:webHidden/>
-          </w:rPr>
-        </w:r>
-        <w:r>
-          <w:rPr>
-            <w:noProof/>
-            <w:webHidden/>
-          </w:rPr>
-          <w:fldChar w:fldCharType="separate"/>
-        </w:r>
-        <w:r>
-          <w:rPr>
-            <w:noProof/>
-            <w:webHidden/>
-          </w:rPr>
-          <w:t>1</w:t>
-        </w:r>
-        <w:r>
-          <w:rPr>
-            <w:noProof/>
-            <w:webHidden/>
-          </w:rPr>
-          <w:fldChar w:fldCharType="end"/>
-        </w:r>
-      </w:hyperlink>
+      <w:hyperlink w:anchor="_Toc184306733" w:history="1"/>
+    </w:p>
+    <w:p>
+      <w:pPr>
+        <w:pStyle w:val="TableofFigures"/>
+        <w:tabs>
+          <w:tab w:val="right" w:leader="dot" w:pos="9016"/>
+        </w:tabs>
+        <w:rPr>
+          <w:noProof/>
+        </w:rPr>
+      </w:pPr>
+      <w:r>
+        <w:fldChar w:fldCharType="end"/>
+      </w:r>
+      <w:r>
+        <w:fldChar w:fldCharType="begin"/>
+      </w:r>
+      <w:r>
+        <w:instrText xml:space="preserve"> TOC \h \z \c "Figure" </w:instrText>
+      </w:r>
+      <w:r>
+        <w:fldChar w:fldCharType="separate"/>
+      </w:r>
+      <w:hyperlink w:anchor="_Toc184306733" w:history="1"/>
     </w:p>
     <w:p>
       <w:r>
@@ -1239,7 +1268,7 @@
           <w:iCs/>
         </w:rPr>
         <w:sectPr>
-          <w:footerReference w:type="default" r:id="rId10"/>
+          <w:footerReference w:type="default" r:id="rId11"/>
           <w:pgSz w:w="11906" w:h="16838"/>
           <w:pgMar w:top="1440" w:right="1440" w:bottom="1440" w:left="1440" w:header="708" w:footer="708" w:gutter="0"/>
           <w:pgNumType w:fmt="lowerRoman" w:start="1"/>
@@ -1274,127 +1303,557 @@
       </w:r>
     </w:p>
     <w:p>
-      <w:r>
-        <w:t xml:space="preserve">You should use this section of the report to provide a written justification for the UX decisions that you made. These should be informed by established UX guidelines, best practices and the requirements for the </w:t>
-      </w:r>
-      <w:proofErr w:type="spellStart"/>
-      <w:r>
-        <w:t>HealthTrack</w:t>
-      </w:r>
-      <w:proofErr w:type="spellEnd"/>
-      <w:r>
-        <w:t xml:space="preserve"> application. Elements that this section of the report should address includes but is not limited to:</w:t>
-      </w:r>
-    </w:p>
-    <w:p>
-      <w:pPr>
-        <w:pStyle w:val="ListParagraph"/>
+      <w:pPr>
+        <w:pStyle w:val="Heading2"/>
         <w:numPr>
-          <w:ilvl w:val="0"/>
-          <w:numId w:val="10"/>
+          <w:ilvl w:val="1"/>
+          <w:numId w:val="4"/>
         </w:numPr>
       </w:pPr>
       <w:r>
-        <w:t>Navigation structure</w:t>
-      </w:r>
-    </w:p>
-    <w:p>
-      <w:pPr>
-        <w:pStyle w:val="ListParagraph"/>
+        <w:t>Design Approac</w:t>
+      </w:r>
+      <w:r>
+        <w:t>h</w:t>
+      </w:r>
+    </w:p>
+    <w:p>
+      <w:pPr>
+        <w:ind w:left="360"/>
+      </w:pPr>
+      <w:r>
+        <w:t>I designed the HealthTrack application to give users a simple,</w:t>
+      </w:r>
+      <w:r>
+        <w:t xml:space="preserve"> accessible way to monitor their health and physical activity. The interface focuses on clarity, consistency</w:t>
+      </w:r>
+      <w:r>
+        <w:t>,</w:t>
+      </w:r>
+      <w:r>
+        <w:t xml:space="preserve"> and ease of </w:t>
+      </w:r>
+      <w:r>
+        <w:t>navigation</w:t>
+      </w:r>
+      <w:r>
+        <w:t xml:space="preserve">, allowing users to access important health information without unnecessary complexity. Design decisions were informed by established usability principles, </w:t>
+      </w:r>
+      <w:r>
+        <w:t xml:space="preserve">including Nielsen’s usability heuristics, which emphasize consistency, visibility of system status, and recognition rather than recall </w:t>
+      </w:r>
+      <w:r>
+        <w:fldChar w:fldCharType="begin"/>
+      </w:r>
+      <w:r>
+        <w:instrText xml:space="preserve"> ADDIN ZOTERO_ITEM CSL_CITATION {"citationID":"BQFhWpRG","properties":{"unsorted":false,"formattedCitation":"(Nielson 1994)","plainCitation":"(Nielson 1994)","noteIndex":0},"citationItems":[{"id":66,"uris":["http://zotero.org/users/local/ALZH0Phn/items/MYXDIZC3"],"itemData":{"id":66,"type":"webpage","abstract":"Jakob Nielsen's 10 principles for interaction design. They are called \"heuristics\" because they are broad rules of thumb and not specific usability guidelines.","container-title":"Nielsen Norman Group","language":"en","title":"10 Usability Heuristics for User Interface Design","URL":"https://www.nngroup.com/articles/ten-usability-heuristics/","author":[{"family":"Nielson","given":"Jakob"}],"accessed":{"date-parts":[["2026",10,16]]},"issued":{"date-parts":[["1994",4,24]]}}}],"schema":"https://github.com/citation-style-language/schema/raw/master/csl-citation.json"} </w:instrText>
+      </w:r>
+      <w:r>
+        <w:fldChar w:fldCharType="separate"/>
+      </w:r>
+      <w:r>
+        <w:t>(Nielson 1994)</w:t>
+      </w:r>
+      <w:r>
+        <w:fldChar w:fldCharType="end"/>
+      </w:r>
+      <w:r>
+        <w:t>.</w:t>
+      </w:r>
+    </w:p>
+    <w:p>
+      <w:pPr>
+        <w:ind w:left="360"/>
+      </w:pPr>
+      <w:r>
+        <w:t>The current wireframe establishes the application's visual layout and intended interactions. The planned backend implementation will connect these interface elements to user data, allowing the app to store and display health measurements, activity records, and statistics dynamically.</w:t>
+      </w:r>
+    </w:p>
+    <w:p>
+      <w:pPr>
+        <w:pStyle w:val="ListParagraph"/>
+        <w:ind w:left="360"/>
+        <w:jc w:val="center"/>
+      </w:pPr>
+    </w:p>
+    <w:p>
+      <w:pPr>
+        <w:pStyle w:val="Heading2"/>
         <w:numPr>
-          <w:ilvl w:val="0"/>
-          <w:numId w:val="10"/>
+          <w:ilvl w:val="1"/>
+          <w:numId w:val="4"/>
         </w:numPr>
-      </w:pPr>
-      <w:r>
-        <w:t>Screen layouts</w:t>
-      </w:r>
-    </w:p>
-    <w:p>
-      <w:pPr>
-        <w:pStyle w:val="ListParagraph"/>
-        <w:numPr>
-          <w:ilvl w:val="0"/>
-          <w:numId w:val="10"/>
-        </w:numPr>
-      </w:pPr>
-      <w:r>
-        <w:t>Information hierarchy</w:t>
-      </w:r>
-    </w:p>
-    <w:p>
-      <w:pPr>
-        <w:pStyle w:val="ListParagraph"/>
-        <w:numPr>
-          <w:ilvl w:val="0"/>
-          <w:numId w:val="10"/>
-        </w:numPr>
-      </w:pPr>
-      <w:r>
-        <w:t>Interaction patterns</w:t>
-      </w:r>
-    </w:p>
-    <w:p>
-      <w:pPr>
-        <w:pStyle w:val="ListParagraph"/>
-        <w:numPr>
-          <w:ilvl w:val="0"/>
-          <w:numId w:val="10"/>
-        </w:numPr>
-      </w:pPr>
-      <w:r>
-        <w:t>Input controls</w:t>
-      </w:r>
-    </w:p>
-    <w:p>
-      <w:pPr>
-        <w:pStyle w:val="ListParagraph"/>
-        <w:numPr>
-          <w:ilvl w:val="0"/>
-          <w:numId w:val="10"/>
-        </w:numPr>
-      </w:pPr>
-      <w:r>
-        <w:t>Feedback mechanisms</w:t>
-      </w:r>
-    </w:p>
-    <w:p>
-      <w:pPr>
-        <w:pStyle w:val="ListParagraph"/>
-        <w:numPr>
-          <w:ilvl w:val="0"/>
-          <w:numId w:val="10"/>
-        </w:numPr>
-      </w:pPr>
-      <w:r>
-        <w:t>Data visualisation approaches</w:t>
-      </w:r>
-    </w:p>
-    <w:p>
-      <w:pPr>
-        <w:pStyle w:val="ListParagraph"/>
-        <w:numPr>
-          <w:ilvl w:val="0"/>
-          <w:numId w:val="10"/>
-        </w:numPr>
-      </w:pPr>
-      <w:r>
-        <w:t>Use of colour, icons, fonts and images</w:t>
-      </w:r>
-    </w:p>
-    <w:p>
-      <w:pPr>
-        <w:pStyle w:val="ListParagraph"/>
-        <w:numPr>
-          <w:ilvl w:val="0"/>
-          <w:numId w:val="10"/>
-        </w:numPr>
-      </w:pPr>
-      <w:r>
-        <w:t>Accessibility considerations</w:t>
+        <w:ind w:hanging="440"/>
+      </w:pPr>
+      <w:r>
+        <w:t xml:space="preserve">      </w:t>
+      </w:r>
+      <w:r>
+        <w:t>Screen Layout and Information Hierarchy</w:t>
+      </w:r>
+    </w:p>
+    <w:p>
+      <w:pPr>
+        <w:pStyle w:val="ListParagraph"/>
+        <w:ind w:left="360"/>
+      </w:pPr>
+      <w:r>
+        <w:t xml:space="preserve">The navigation in my version of HealthTrack uses a bottom navigation bar containing four sections: Home, Statistics, Goals, and Settings. This navbar allows users to move between </w:t>
+      </w:r>
+      <w:r>
+        <w:t xml:space="preserve">the application’s main features without having to return to the main dashboard. The navbar features icons alongside text that match the page each tab links to, helping users recognize each section. The current tab is highlighted in teal, making it easier for users to identify their location in the app. This design </w:t>
+      </w:r>
+      <w:r>
+        <w:t>follows</w:t>
+      </w:r>
+      <w:r>
+        <w:t xml:space="preserve"> the usability principle of consistency and standards</w:t>
+      </w:r>
+      <w:r>
+        <w:t xml:space="preserve"> or Jakubs Law</w:t>
+      </w:r>
+      <w:r>
+        <w:t>, as many people are familiar with bottom navigation from many mobile applications</w:t>
+      </w:r>
+      <w:r>
+        <w:t>.</w:t>
+      </w:r>
+      <w:r>
+        <w:fldChar w:fldCharType="begin"/>
+      </w:r>
+      <w:r>
+        <w:instrText xml:space="preserve"> ADDIN ZOTERO_ITEM CSL_CITATION {"citationID":"BQFhWpRG","properties":{"unsorted":false,"formattedCitation":"(Nielson 1994)","plainCitation":"(Nielson 1994)","noteIndex":0},"citationItems":[{"id":66,"uris":["http://zotero.org/users/local/ALZH0Phn/items/MYXDIZC3"],"itemData":{"id":66,"type":"webpage","abstract":"Jakob Nielsen's 10 principles for interaction design. They are called \"heuristics\" because they are broad rules of thumb and not specific usability guidelines.","container-title":"Nielsen Norman Group","language":"en","title":"10 Usability Heuristics for User Interface Design","URL":"https://www.nngroup.com/articles/ten-usability-heuristics/","author":[{"family":"Nielson","given":"Jakob"}],"accessed":{"date-parts":[["2026",10,16]]},"issued":{"date-parts":[["1994",4,24]]}}}],"schema":"https://github.com/citation-style-language/schema/raw/master/csl-citation.json"} </w:instrText>
+      </w:r>
+      <w:r>
+        <w:fldChar w:fldCharType="separate"/>
+      </w:r>
+      <w:r>
+        <w:t>(Nielson 1994)</w:t>
+      </w:r>
+      <w:r>
+        <w:fldChar w:fldCharType="end"/>
+      </w:r>
+      <w:r>
+        <w:t xml:space="preserve"> </w:t>
+      </w:r>
+      <w:r>
+        <w:t>The navbar is shown in Figure 1.</w:t>
+      </w:r>
+    </w:p>
+    <w:p>
+      <w:pPr>
+        <w:pStyle w:val="ListParagraph"/>
+        <w:ind w:left="360"/>
+      </w:pPr>
+    </w:p>
+    <w:p>
+      <w:pPr>
+        <w:pStyle w:val="ListParagraph"/>
+        <w:ind w:left="360"/>
+        <w:jc w:val="center"/>
+      </w:pPr>
+      <w:r>
+        <w:drawing>
+          <wp:inline distT="0" distB="0" distL="0" distR="0" wp14:anchorId="1465D5BC" wp14:editId="21C53C0E">
+            <wp:extent cx="3877216" cy="771633"/>
+            <wp:effectExtent l="0" t="0" r="0" b="9525"/>
+            <wp:docPr id="93584625" name="Picture 1"/>
+            <wp:cNvGraphicFramePr>
+              <a:graphicFrameLocks xmlns:a="http://schemas.openxmlformats.org/drawingml/2006/main" noChangeAspect="1"/>
+            </wp:cNvGraphicFramePr>
+            <a:graphic xmlns:a="http://schemas.openxmlformats.org/drawingml/2006/main">
+              <a:graphicData uri="http://schemas.openxmlformats.org/drawingml/2006/picture">
+                <pic:pic xmlns:pic="http://schemas.openxmlformats.org/drawingml/2006/picture">
+                  <pic:nvPicPr>
+                    <pic:cNvPr id="93584625" name=""/>
+                    <pic:cNvPicPr/>
+                  </pic:nvPicPr>
+                  <pic:blipFill>
+                    <a:blip r:embed="rId12"/>
+                    <a:stretch>
+                      <a:fillRect/>
+                    </a:stretch>
+                  </pic:blipFill>
+                  <pic:spPr>
+                    <a:xfrm>
+                      <a:off x="0" y="0"/>
+                      <a:ext cx="3877216" cy="771633"/>
+                    </a:xfrm>
+                    <a:prstGeom prst="rect">
+                      <a:avLst/>
+                    </a:prstGeom>
+                  </pic:spPr>
+                </pic:pic>
+              </a:graphicData>
+            </a:graphic>
+          </wp:inline>
+        </w:drawing>
+      </w:r>
+    </w:p>
+    <w:p>
+      <w:pPr>
+        <w:pStyle w:val="ListParagraph"/>
+        <w:ind w:left="360"/>
+        <w:jc w:val="center"/>
+      </w:pPr>
+      <w:r>
+        <w:t>Figure 1: App Navbar</w:t>
+      </w:r>
+    </w:p>
+    <w:p>
+      <w:pPr>
+        <w:pStyle w:val="ListParagraph"/>
+        <w:ind w:left="360"/>
+        <w:jc w:val="center"/>
+      </w:pPr>
+    </w:p>
+    <w:p>
+      <w:r>
+        <w:t>The dashboard</w:t>
+      </w:r>
+      <w:r>
+        <w:t>, the main page, uses a structured layout to present key</w:t>
+      </w:r>
+      <w:r>
+        <w:t xml:space="preserve"> health information </w:t>
+      </w:r>
+      <w:proofErr w:type="gramStart"/>
+      <w:r>
+        <w:t>at a glance</w:t>
+      </w:r>
+      <w:proofErr w:type="gramEnd"/>
+      <w:r>
+        <w:t xml:space="preserve">. A </w:t>
+      </w:r>
+      <w:r>
+        <w:t xml:space="preserve">personalized greeting and daily report heading appear at the top, followed by four summary cards showing the current day's steps, calories, and weight (in kilograms), and the previous night's sleep (in hours and minutes). The entire page is wrapped in a scroll view, as the information will not fit on one standard screen. The report cards use </w:t>
+      </w:r>
+      <w:r>
+        <w:t>a 2-column grid layout to group related information and allow several measurements to be viewed without navigating</w:t>
+      </w:r>
+      <w:r>
+        <w:t xml:space="preserve"> to separate screens.</w:t>
+      </w:r>
+    </w:p>
+    <w:p>
+      <w:r>
+        <w:t xml:space="preserve">The most prominent information within each card is the recorded measurement, such as the daily step count. Smaller text provides additional context, such as the daily step goal and the estimated calories burned. This creates a visual hierarchy </w:t>
+      </w:r>
+      <w:r>
+        <w:t xml:space="preserve">that makes the most relevant information </w:t>
+      </w:r>
+      <w:r>
+        <w:t xml:space="preserve">easier to identify </w:t>
+      </w:r>
+      <w:r>
+        <w:t xml:space="preserve">quickly. The dashboard also </w:t>
+      </w:r>
+      <w:r>
+        <w:t xml:space="preserve">includes a quick-action section, allowing you to </w:t>
+      </w:r>
+      <w:r>
+        <w:t>log measurements, activity</w:t>
+      </w:r>
+      <w:r>
+        <w:t>,</w:t>
+      </w:r>
+      <w:r>
+        <w:t xml:space="preserve"> or sleep</w:t>
+      </w:r>
+      <w:r>
+        <w:t>.</w:t>
       </w:r>
     </w:p>
     <w:p/>
+    <w:p>
+      <w:pPr>
+        <w:jc w:val="center"/>
+      </w:pPr>
+      <w:r>
+        <w:lastRenderedPageBreak/>
+        <w:drawing>
+          <wp:inline distT="0" distB="0" distL="0" distR="0" wp14:anchorId="24614FF6" wp14:editId="0AB6E7EB">
+            <wp:extent cx="2473569" cy="5157784"/>
+            <wp:effectExtent l="0" t="0" r="3175" b="5080"/>
+            <wp:docPr id="905665307" name="Picture 1"/>
+            <wp:cNvGraphicFramePr>
+              <a:graphicFrameLocks xmlns:a="http://schemas.openxmlformats.org/drawingml/2006/main" noChangeAspect="1"/>
+            </wp:cNvGraphicFramePr>
+            <a:graphic xmlns:a="http://schemas.openxmlformats.org/drawingml/2006/main">
+              <a:graphicData uri="http://schemas.openxmlformats.org/drawingml/2006/picture">
+                <pic:pic xmlns:pic="http://schemas.openxmlformats.org/drawingml/2006/picture">
+                  <pic:nvPicPr>
+                    <pic:cNvPr id="905665307" name=""/>
+                    <pic:cNvPicPr/>
+                  </pic:nvPicPr>
+                  <pic:blipFill>
+                    <a:blip r:embed="rId13"/>
+                    <a:stretch>
+                      <a:fillRect/>
+                    </a:stretch>
+                  </pic:blipFill>
+                  <pic:spPr>
+                    <a:xfrm>
+                      <a:off x="0" y="0"/>
+                      <a:ext cx="2479088" cy="5169291"/>
+                    </a:xfrm>
+                    <a:prstGeom prst="rect">
+                      <a:avLst/>
+                    </a:prstGeom>
+                  </pic:spPr>
+                </pic:pic>
+              </a:graphicData>
+            </a:graphic>
+          </wp:inline>
+        </w:drawing>
+      </w:r>
+    </w:p>
+    <w:p>
+      <w:pPr>
+        <w:jc w:val="center"/>
+      </w:pPr>
+      <w:r>
+        <w:t>Figure 2: Dashboard UI</w:t>
+      </w:r>
+    </w:p>
+    <w:p>
+      <w:pPr>
+        <w:jc w:val="center"/>
+      </w:pPr>
+    </w:p>
+    <w:p>
+      <w:r>
+        <w:t>The remaining screens follow the same overall visual style to provide a consistent experience throughout the application. Each screen is designed around its primary purpose, whether displaying personal information, recording health measurements, reviewing activity history, or examining progress towards goals.</w:t>
+      </w:r>
+    </w:p>
+    <w:p>
+      <w:pPr>
+        <w:pStyle w:val="ListParagraph"/>
+        <w:ind w:left="360"/>
+      </w:pPr>
+    </w:p>
+    <w:p>
+      <w:pPr>
+        <w:pStyle w:val="ListParagraph"/>
+        <w:ind w:left="360"/>
+      </w:pPr>
+    </w:p>
+    <w:p>
+      <w:pPr>
+        <w:pStyle w:val="ListParagraph"/>
+        <w:ind w:left="360"/>
+      </w:pPr>
+    </w:p>
+    <w:p>
+      <w:pPr>
+        <w:pStyle w:val="Heading2"/>
+      </w:pPr>
+      <w:r>
+        <w:t>1.3     Information Hierarchy and Screen Layouts</w:t>
+      </w:r>
+    </w:p>
+    <w:p>
+      <w:pPr>
+        <w:pStyle w:val="ListParagraph"/>
+        <w:ind w:left="360"/>
+      </w:pPr>
+      <w:r>
+        <w:t>The interface uses font size, font weight, spacing</w:t>
+      </w:r>
+      <w:r>
+        <w:t>, and colour</w:t>
+      </w:r>
+      <w:r>
+        <w:t xml:space="preserve"> to establish an information hierarchy. On the dashboard, important measurements, such as </w:t>
+      </w:r>
+      <w:r>
+        <w:t>daily step count and calories burned, appear in larger, bold text, while supporting information appears in smaller text. This helps users quickly identify the most relevant information.</w:t>
+      </w:r>
+    </w:p>
+    <w:p>
+      <w:pPr>
+        <w:pStyle w:val="ListParagraph"/>
+        <w:ind w:left="360"/>
+      </w:pPr>
+      <w:r>
+        <w:lastRenderedPageBreak/>
+        <w:t>Related information is grouped into cards with consistent padding, rounded corners and background colours. This supports the Gestalt principle of proximity, where elements positioned close together are perceived as related [citation]. Dividers and spacing separate main dashboard sections, reducing visual clutter and making the information easier to scan.</w:t>
+      </w:r>
+    </w:p>
+    <w:p>
+      <w:pPr>
+        <w:pStyle w:val="ListParagraph"/>
+        <w:ind w:left="360"/>
+      </w:pPr>
+    </w:p>
+    <w:p>
+      <w:pPr>
+        <w:pStyle w:val="ListParagraph"/>
+        <w:ind w:left="360"/>
+      </w:pPr>
+    </w:p>
+    <w:p>
+      <w:pPr>
+        <w:pStyle w:val="ListParagraph"/>
+        <w:ind w:left="360"/>
+      </w:pPr>
+    </w:p>
+    <w:p>
+      <w:pPr>
+        <w:pStyle w:val="ListParagraph"/>
+        <w:ind w:left="360"/>
+      </w:pPr>
+    </w:p>
+    <w:p>
+      <w:pPr>
+        <w:pStyle w:val="ListParagraph"/>
+        <w:ind w:left="360"/>
+      </w:pPr>
+    </w:p>
+    <w:p>
+      <w:pPr>
+        <w:pStyle w:val="ListParagraph"/>
+        <w:ind w:left="360"/>
+      </w:pPr>
+    </w:p>
+    <w:p>
+      <w:pPr>
+        <w:pStyle w:val="ListParagraph"/>
+        <w:ind w:left="360"/>
+      </w:pPr>
+    </w:p>
+    <w:p>
+      <w:pPr>
+        <w:pStyle w:val="ListParagraph"/>
+        <w:ind w:left="360"/>
+      </w:pPr>
+    </w:p>
+    <w:p>
+      <w:pPr>
+        <w:pStyle w:val="ListParagraph"/>
+        <w:ind w:left="360"/>
+      </w:pPr>
+    </w:p>
+    <w:p>
+      <w:pPr>
+        <w:pStyle w:val="ListParagraph"/>
+        <w:ind w:left="360"/>
+      </w:pPr>
+    </w:p>
+    <w:p>
+      <w:pPr>
+        <w:pStyle w:val="ListParagraph"/>
+        <w:ind w:left="360"/>
+      </w:pPr>
+    </w:p>
+    <w:p>
+      <w:pPr>
+        <w:pStyle w:val="ListParagraph"/>
+        <w:ind w:left="360"/>
+      </w:pPr>
+    </w:p>
+    <w:p>
+      <w:pPr>
+        <w:pStyle w:val="ListParagraph"/>
+        <w:ind w:left="360"/>
+      </w:pPr>
+    </w:p>
+    <w:p>
+      <w:pPr>
+        <w:pStyle w:val="ListParagraph"/>
+        <w:ind w:left="360"/>
+      </w:pPr>
+    </w:p>
+    <w:p>
+      <w:pPr>
+        <w:pStyle w:val="ListParagraph"/>
+        <w:ind w:left="360"/>
+      </w:pPr>
+    </w:p>
+    <w:p>
+      <w:pPr>
+        <w:pStyle w:val="ListParagraph"/>
+        <w:ind w:left="360"/>
+      </w:pPr>
+    </w:p>
+    <w:p>
+      <w:pPr>
+        <w:pStyle w:val="ListParagraph"/>
+        <w:ind w:left="360"/>
+      </w:pPr>
+    </w:p>
+    <w:p>
+      <w:pPr>
+        <w:pStyle w:val="ListParagraph"/>
+        <w:ind w:left="360"/>
+      </w:pPr>
+    </w:p>
+    <w:p>
+      <w:pPr>
+        <w:pStyle w:val="ListParagraph"/>
+        <w:ind w:left="360"/>
+      </w:pPr>
+    </w:p>
+    <w:p>
+      <w:pPr>
+        <w:pStyle w:val="ListParagraph"/>
+        <w:ind w:left="360"/>
+      </w:pPr>
+    </w:p>
+    <w:p>
+      <w:pPr>
+        <w:pStyle w:val="ListParagraph"/>
+        <w:ind w:left="360"/>
+      </w:pPr>
+    </w:p>
+    <w:p>
+      <w:pPr>
+        <w:pStyle w:val="ListParagraph"/>
+        <w:ind w:left="360"/>
+      </w:pPr>
+    </w:p>
+    <w:p>
+      <w:pPr>
+        <w:pStyle w:val="ListParagraph"/>
+        <w:ind w:left="360"/>
+      </w:pPr>
+    </w:p>
+    <w:p>
+      <w:pPr>
+        <w:pStyle w:val="ListParagraph"/>
+        <w:ind w:left="360"/>
+      </w:pPr>
+    </w:p>
+    <w:p>
+      <w:pPr>
+        <w:pStyle w:val="ListParagraph"/>
+        <w:ind w:left="360"/>
+      </w:pPr>
+    </w:p>
+    <w:p>
+      <w:pPr>
+        <w:pStyle w:val="ListParagraph"/>
+        <w:ind w:left="360"/>
+      </w:pPr>
+    </w:p>
+    <w:p>
+      <w:pPr>
+        <w:pStyle w:val="ListParagraph"/>
+        <w:ind w:left="360"/>
+      </w:pPr>
+    </w:p>
+    <w:p>
+      <w:pPr>
+        <w:pStyle w:val="ListParagraph"/>
+        <w:ind w:left="360"/>
+      </w:pPr>
+    </w:p>
+    <w:p>
+      <w:pPr>
+        <w:pStyle w:val="ListParagraph"/>
+        <w:ind w:left="360"/>
+      </w:pPr>
+    </w:p>
     <w:p>
       <w:pPr>
         <w:pStyle w:val="Heading1"/>
@@ -1426,6 +1885,7 @@
         <w:rPr>
           <w:noProof/>
         </w:rPr>
+        <w:lastRenderedPageBreak/>
         <w:drawing>
           <wp:inline distT="0" distB="0" distL="0" distR="0" wp14:anchorId="71926E04" wp14:editId="19937CC7">
             <wp:extent cx="4674358" cy="3334824"/>
@@ -1442,7 +1902,7 @@
                     <pic:cNvPicPr/>
                   </pic:nvPicPr>
                   <pic:blipFill>
-                    <a:blip r:embed="rId11"/>
+                    <a:blip r:embed="rId14"/>
                     <a:stretch>
                       <a:fillRect/>
                     </a:stretch>
@@ -1569,21 +2029,12 @@
           <w:b/>
           <w:bCs/>
         </w:rPr>
-        <w:lastRenderedPageBreak/>
         <w:t>Architectural considerations</w:t>
       </w:r>
     </w:p>
     <w:p>
       <w:r>
-        <w:t xml:space="preserve">Your architecture for the </w:t>
-      </w:r>
-      <w:proofErr w:type="spellStart"/>
-      <w:r>
-        <w:t>HealthTrack</w:t>
-      </w:r>
-      <w:proofErr w:type="spellEnd"/>
-      <w:r>
-        <w:t xml:space="preserve"> application should address, where applicable the following considerations</w:t>
+        <w:t>Your architecture for the HealthTrack application should address, where applicable the following considerations</w:t>
       </w:r>
     </w:p>
     <w:p>
@@ -1598,11 +2049,16 @@
         <w:t>Architectural pattern</w:t>
       </w:r>
       <w:r>
-        <w:t xml:space="preserve"> employed </w:t>
+        <w:t xml:space="preserve"> </w:t>
+      </w:r>
+      <w:proofErr w:type="gramStart"/>
+      <w:r>
+        <w:t xml:space="preserve">employed </w:t>
       </w:r>
       <w:r>
         <w:t xml:space="preserve"> (</w:t>
       </w:r>
+      <w:proofErr w:type="gramEnd"/>
       <w:r>
         <w:t>e.g.</w:t>
       </w:r>
@@ -1756,6 +2212,7 @@
     </w:p>
     <w:p>
       <w:r>
+        <w:lastRenderedPageBreak/>
         <w:t xml:space="preserve">You should provide </w:t>
       </w:r>
       <w:r>
@@ -1782,7 +2239,15 @@
     </w:p>
     <w:p>
       <w:r>
-        <w:t xml:space="preserve">Your application must be developed using C# and .NET MAUI, however there exist many </w:t>
+        <w:t xml:space="preserve">Your application must be developed using C# and .NET MAUI, </w:t>
+      </w:r>
+      <w:proofErr w:type="gramStart"/>
+      <w:r>
+        <w:t>however</w:t>
+      </w:r>
+      <w:proofErr w:type="gramEnd"/>
+      <w:r>
+        <w:t xml:space="preserve"> there exist many </w:t>
       </w:r>
       <w:r>
         <w:t>third-party</w:t>
@@ -1791,15 +2256,7 @@
         <w:t xml:space="preserve"> </w:t>
       </w:r>
       <w:r>
-        <w:t xml:space="preserve">solutions and toolkits that you could use to assist you in developing the </w:t>
-      </w:r>
-      <w:proofErr w:type="spellStart"/>
-      <w:r>
-        <w:t>HealthTrack</w:t>
-      </w:r>
-      <w:proofErr w:type="spellEnd"/>
-      <w:r>
-        <w:t xml:space="preserve"> application. </w:t>
+        <w:t xml:space="preserve">solutions and toolkits that you could use to assist you in developing the HealthTrack application. </w:t>
       </w:r>
       <w:r>
         <w:t xml:space="preserve">You should use this section of the report to present a justification for why the technology or approach you have selected is appropriate rather than simply describing what technologies you are going to use and what they do. </w:t>
@@ -1828,16 +2285,23 @@
     </w:p>
     <w:p>
       <w:r>
-        <w:t xml:space="preserve">Navigation within .NET MAUI applications can be implemented in many different ways, provide a justification of what approach you are going to use and how it provides a consistent and accessible approach to navigation for the user. </w:t>
+        <w:t xml:space="preserve">Navigation within .NET MAUI applications can be implemented in </w:t>
+      </w:r>
+      <w:proofErr w:type="gramStart"/>
+      <w:r>
+        <w:t>many different ways</w:t>
+      </w:r>
+      <w:proofErr w:type="gramEnd"/>
+      <w:r>
+        <w:t xml:space="preserve">, provide a justification of what approach you are going to use and how it provides a consistent and accessible approach to navigation for the user. </w:t>
       </w:r>
     </w:p>
     <w:p/>
     <w:p>
       <w:r>
-        <w:lastRenderedPageBreak/>
         <w:t xml:space="preserve">The look and feel of .NET MAUI applications is highly configurable. Google’s Material 3 design can be enabled as an opt-in feature in .NET MAUI 10 onwards (see: </w:t>
       </w:r>
-      <w:hyperlink r:id="rId12" w:history="1">
+      <w:hyperlink r:id="rId15" w:history="1">
         <w:r>
           <w:rPr>
             <w:rStyle w:val="Hyperlink"/>
@@ -1848,7 +2312,7 @@
       <w:r>
         <w:t>) or by using the Uranium UI extension (</w:t>
       </w:r>
-      <w:hyperlink r:id="rId13" w:history="1">
+      <w:hyperlink r:id="rId16" w:history="1">
         <w:r>
           <w:rPr>
             <w:rStyle w:val="Hyperlink"/>
@@ -1866,7 +2330,15 @@
         <w:t>rd</w:t>
       </w:r>
       <w:r>
-        <w:t xml:space="preserve"> party free and paid for UI toolkits for .NET MAUI. You are strongly encourage to research available toolkits and extensions that you could use to enhance the visual appeal and consistent design of your application. </w:t>
+        <w:t xml:space="preserve"> party free and paid for UI toolkits for .NET MAUI. You are strongly </w:t>
+      </w:r>
+      <w:proofErr w:type="gramStart"/>
+      <w:r>
+        <w:t>encourage</w:t>
+      </w:r>
+      <w:proofErr w:type="gramEnd"/>
+      <w:r>
+        <w:t xml:space="preserve"> to research available toolkits and extensions that you could use to enhance the visual appeal and consistent design of your application. </w:t>
       </w:r>
     </w:p>
     <w:p/>
@@ -1894,13 +2366,8 @@
       <w:r>
         <w:t xml:space="preserve">The </w:t>
       </w:r>
-      <w:proofErr w:type="spellStart"/>
-      <w:r>
-        <w:t>HealthTrack</w:t>
-      </w:r>
-      <w:proofErr w:type="spellEnd"/>
-      <w:r>
-        <w:t xml:space="preserve"> application should be visually attractive and use appropriate graphics and charting solution to display data, trends, statistics and summary information. You should </w:t>
+      <w:r>
+        <w:t xml:space="preserve">HealthTrack application should be visually attractive and use appropriate graphics and charting solution to display data, trends, statistics and summary information. You should </w:t>
       </w:r>
       <w:r>
         <w:t xml:space="preserve">research charting and graphics solutions for .NET MAUI applications and justify the selection of any tools based on the requirements of the application. </w:t>
@@ -1932,61 +2399,114 @@
       <w:r>
         <w:t xml:space="preserve">Provide an outline of the project plan required to complete the </w:t>
       </w:r>
+      <w:r>
+        <w:t>HealthTrack</w:t>
+      </w:r>
+      <w:r>
+        <w:t xml:space="preserve"> application by the end of the semester. Detail tasks, deliverables and milestones </w:t>
+      </w:r>
+      <w:r>
+        <w:t>with</w:t>
+      </w:r>
+      <w:r>
+        <w:t xml:space="preserve"> appropriate dates.</w:t>
+      </w:r>
+    </w:p>
+    <w:p>
+      <w:pPr>
+        <w:pStyle w:val="Heading1"/>
+      </w:pPr>
+    </w:p>
+    <w:p>
+      <w:pPr>
+        <w:pStyle w:val="Heading1"/>
+      </w:pPr>
+      <w:bookmarkStart w:id="8" w:name="_Toc240468794"/>
+      <w:r>
+        <w:t>References</w:t>
+      </w:r>
+      <w:bookmarkEnd w:id="8"/>
+    </w:p>
+    <w:p>
+      <w:r>
+        <w:t xml:space="preserve">Nielsen Norman Group. ‘10 Usability Heuristics for User Interface Design’. Accessed 16 October 2026. </w:t>
+      </w:r>
+      <w:hyperlink r:id="rId17" w:history="1">
+        <w:r>
+          <w:rPr>
+            <w:rStyle w:val="Hyperlink"/>
+          </w:rPr>
+          <w:t>https://www.nngroup.com/articles/ten-usability-heuristics/</w:t>
+        </w:r>
+      </w:hyperlink>
+      <w:r>
+        <w:t>.</w:t>
+      </w:r>
+    </w:p>
+    <w:p>
+      <w:r>
+        <w:t>‘The-Basics-of-</w:t>
+      </w:r>
       <w:proofErr w:type="spellStart"/>
       <w:r>
-        <w:t>HealthTrack</w:t>
+        <w:t>Ux</w:t>
       </w:r>
       <w:proofErr w:type="spellEnd"/>
       <w:r>
-        <w:t xml:space="preserve"> application by the end of the semester. Detail tasks, deliverables and milestones </w:t>
-      </w:r>
-      <w:r>
-        <w:t>with</w:t>
-      </w:r>
-      <w:r>
-        <w:t xml:space="preserve"> appropriate dates.</w:t>
-      </w:r>
-    </w:p>
-    <w:p>
-      <w:pPr>
-        <w:pStyle w:val="Heading1"/>
-      </w:pPr>
-    </w:p>
-    <w:p>
-      <w:pPr>
-        <w:pStyle w:val="Heading1"/>
-      </w:pPr>
-      <w:bookmarkStart w:id="8" w:name="_Toc240468794"/>
-      <w:r>
-        <w:t>References</w:t>
-      </w:r>
-      <w:bookmarkEnd w:id="8"/>
-    </w:p>
-    <w:p>
-      <w:pPr>
-        <w:rPr>
-          <w:rFonts w:cstheme="majorHAnsi"/>
-        </w:rPr>
-      </w:pPr>
-      <w:r>
-        <w:t>Ensure that you format references correctly</w:t>
-      </w:r>
-      <w:r>
-        <w:t xml:space="preserve"> </w:t>
-      </w:r>
-      <w:r>
-        <w:t xml:space="preserve">(Harvard, IEEE or ACM) </w:t>
-      </w:r>
-      <w:r>
-        <w:t xml:space="preserve">and provide full </w:t>
-      </w:r>
-      <w:r>
-        <w:t xml:space="preserve">and complete </w:t>
-      </w:r>
-      <w:r>
-        <w:t>references.</w:t>
-      </w:r>
-    </w:p>
+        <w:t xml:space="preserve">-Design’. n.d. Accessed 16 October 2026. </w:t>
+      </w:r>
+      <w:hyperlink r:id="rId18" w:history="1">
+        <w:r>
+          <w:rPr>
+            <w:rStyle w:val="Hyperlink"/>
+          </w:rPr>
+          <w:t>https://bpb-eu-w2.wpmucdn.com/sites.aub.edu.lb/dist/c/13/files/2019/06/the-basics-of-ux-design.pdf</w:t>
+        </w:r>
+      </w:hyperlink>
+      <w:r>
+        <w:t>.</w:t>
+      </w:r>
+    </w:p>
+    <w:p>
+      <w:proofErr w:type="spellStart"/>
+      <w:r>
+        <w:t>Galavi</w:t>
+      </w:r>
+      <w:proofErr w:type="spellEnd"/>
+      <w:r>
+        <w:t xml:space="preserve">, Zahra, </w:t>
+      </w:r>
+      <w:proofErr w:type="spellStart"/>
+      <w:r>
+        <w:t>Somaye</w:t>
+      </w:r>
+      <w:proofErr w:type="spellEnd"/>
+      <w:r>
+        <w:t xml:space="preserve"> Norouzi, and Reza Khajouei. ‘Heuristics Used for Evaluating the Usability of Mobile Health Applications: A Systematic Literature Review’. </w:t>
+      </w:r>
+      <w:r>
+        <w:rPr>
+          <w:i/>
+          <w:iCs/>
+        </w:rPr>
+        <w:t>DIGITAL HEALTH</w:t>
+      </w:r>
+      <w:r>
+        <w:t xml:space="preserve"> 10 (September 2024): 20552076241253539. </w:t>
+      </w:r>
+      <w:hyperlink r:id="rId19" w:history="1">
+        <w:r>
+          <w:rPr>
+            <w:rStyle w:val="Hyperlink"/>
+          </w:rPr>
+          <w:t>https://doi.org/10.1177/20552076241253539</w:t>
+        </w:r>
+      </w:hyperlink>
+      <w:r>
+        <w:t>.</w:t>
+      </w:r>
+    </w:p>
+    <w:p/>
     <w:p>
       <w:pPr>
         <w:rPr>
@@ -2082,7 +2602,6 @@
         <w:rPr>
           <w:rFonts w:cstheme="majorHAnsi"/>
         </w:rPr>
-        <w:lastRenderedPageBreak/>
         <w:t>Submitting work as your own for assessment, which has been completed partially or entirely by someone else (including a peer, a family member, or other third party).</w:t>
       </w:r>
     </w:p>
@@ -2101,19 +2620,47 @@
         <w:rPr>
           <w:rFonts w:cstheme="majorHAnsi"/>
         </w:rPr>
-        <w:t>Cheating in projects (e.g., collusion; using ‘essay mills’ or similar services to carry out</w:t>
-      </w:r>
+        <w:t xml:space="preserve">Cheating in projects (e.g., collusion; using ‘essay </w:t>
+      </w:r>
+      <w:proofErr w:type="gramStart"/>
       <w:r>
         <w:rPr>
           <w:rFonts w:cstheme="majorHAnsi"/>
         </w:rPr>
+        <w:t>mills’</w:t>
+      </w:r>
+      <w:proofErr w:type="gramEnd"/>
+      <w:r>
+        <w:rPr>
+          <w:rFonts w:cstheme="majorHAnsi"/>
+        </w:rPr>
+        <w:t xml:space="preserve"> or similar services to carry out</w:t>
+      </w:r>
+      <w:r>
+        <w:rPr>
+          <w:rFonts w:cstheme="majorHAnsi"/>
+        </w:rPr>
         <w:t xml:space="preserve"> </w:t>
       </w:r>
       <w:r>
         <w:rPr>
           <w:rFonts w:cstheme="majorHAnsi"/>
         </w:rPr>
-        <w:t>some or all of the assigned work).</w:t>
+        <w:t xml:space="preserve">some or </w:t>
+      </w:r>
+      <w:proofErr w:type="gramStart"/>
+      <w:r>
+        <w:rPr>
+          <w:rFonts w:cstheme="majorHAnsi"/>
+        </w:rPr>
+        <w:t>all of</w:t>
+      </w:r>
+      <w:proofErr w:type="gramEnd"/>
+      <w:r>
+        <w:rPr>
+          <w:rFonts w:cstheme="majorHAnsi"/>
+        </w:rPr>
+        <w:t xml:space="preserve"> the assigned work).</w:t>
       </w:r>
     </w:p>
     <w:p>
@@ -2199,6 +2746,7 @@
         <w:rPr>
           <w:rFonts w:cstheme="majorHAnsi"/>
         </w:rPr>
+        <w:lastRenderedPageBreak/>
         <w:t>You are required to familiarise yourself with the academic integrity policy and associated documents which are available on the student hub area of the ATU website.</w:t>
       </w:r>
     </w:p>
@@ -2303,7 +2851,27 @@
           <w:color w:val="000000"/>
           <w:lang w:eastAsia="en-GB"/>
         </w:rPr>
-        <w:t>Provide a general description of how you used GenAI to assist you in completing this assignment. For example, did you use it to suggest colour schemes or similar applications to evaluate or did you use it to write prototype code?</w:t>
+        <w:t xml:space="preserve">Provide a general description of how you used GenAI to assist you in completing this assignment. For example, did you use it to suggest colour schemes or similar applications to </w:t>
+      </w:r>
+      <w:proofErr w:type="gramStart"/>
+      <w:r>
+        <w:rPr>
+          <w:rFonts w:cs="Arial"/>
+          <w:bCs/>
+          <w:color w:val="000000"/>
+          <w:lang w:eastAsia="en-GB"/>
+        </w:rPr>
+        <w:t>evaluate</w:t>
+      </w:r>
+      <w:proofErr w:type="gramEnd"/>
+      <w:r>
+        <w:rPr>
+          <w:rFonts w:cs="Arial"/>
+          <w:bCs/>
+          <w:color w:val="000000"/>
+          <w:lang w:eastAsia="en-GB"/>
+        </w:rPr>
+        <w:t xml:space="preserve"> or did you use it to write prototype code?</w:t>
       </w:r>
       <w:r>
         <w:rPr>
@@ -2553,7 +3121,6 @@
         <w:rPr>
           <w:lang w:eastAsia="en-GB"/>
         </w:rPr>
-        <w:lastRenderedPageBreak/>
         <w:t xml:space="preserve">How the output was changed for use or incorporation into a piece of work (e.g. a tracked-changes document or a descriptive paragraph). If an AI tool was used to generate source code, add comments to your source code clearly labelling AI generated code segments. </w:t>
       </w:r>
     </w:p>
@@ -2573,7 +3140,7 @@
         </w:rPr>
         <w:t xml:space="preserve">For a guide on citing generative AI output see: </w:t>
       </w:r>
-      <w:hyperlink r:id="rId14" w:history="1">
+      <w:hyperlink r:id="rId20" w:history="1">
         <w:r>
           <w:rPr>
             <w:rStyle w:val="Hyperlink"/>
@@ -2587,7 +3154,7 @@
     </w:p>
     <w:p/>
     <w:sectPr>
-      <w:footerReference w:type="default" r:id="rId15"/>
+      <w:footerReference w:type="default" r:id="rId21"/>
       <w:pgSz w:w="11906" w:h="16838"/>
       <w:pgMar w:top="1440" w:right="1440" w:bottom="1440" w:left="1440" w:header="708" w:footer="708" w:gutter="0"/>
       <w:pgNumType w:start="1"/>
@@ -4686,7 +5253,6 @@
   <w:style w:type="character" w:default="1" w:styleId="DefaultParagraphFont">
     <w:name w:val="Default Paragraph Font"/>
     <w:uiPriority w:val="1"/>
-    <w:semiHidden/>
     <w:unhideWhenUsed/>
   </w:style>
   <w:style w:type="table" w:default="1" w:styleId="TableNormal">
@@ -4963,6 +5529,18 @@
       <w:sz w:val="28"/>
       <w:szCs w:val="24"/>
       <w14:ligatures w14:val="none"/>
+    </w:rPr>
+  </w:style>
+  <w:style w:type="character" w:styleId="FollowedHyperlink">
+    <w:name w:val="FollowedHyperlink"/>
+    <w:basedOn w:val="DefaultParagraphFont"/>
+    <w:uiPriority w:val="99"/>
+    <w:semiHidden/>
+    <w:unhideWhenUsed/>
+    <w:rsid w:val="00401F69"/>
+    <w:rPr>
+      <w:color w:val="954F72" w:themeColor="followedHyperlink"/>
+      <w:u w:val="single"/>
     </w:rPr>
   </w:style>
 </w:styles>

</xml_diff>

<commit_message>
Doc: #S08: Settings Page Complete, Activity page complete, measurement and sleep page to do, and form pages - L00183767
</commit_message>
<xml_diff>
--- a/CPDCA1_L00183767_Turner.docx
+++ b/CPDCA1_L00183767_Turner.docx
@@ -2,35 +2,6 @@
 <file path=word/document.xml><?xml version="1.0" encoding="utf-8"?>
 <w:document xmlns:wpc="http://schemas.microsoft.com/office/word/2010/wordprocessingCanvas" xmlns:cx="http://schemas.microsoft.com/office/drawing/2014/chartex" xmlns:cx1="http://schemas.microsoft.com/office/drawing/2015/9/8/chartex" xmlns:cx2="http://schemas.microsoft.com/office/drawing/2015/10/21/chartex" xmlns:cx3="http://schemas.microsoft.com/office/drawing/2016/5/9/chartex" xmlns:cx4="http://schemas.microsoft.com/office/drawing/2016/5/10/chartex" xmlns:cx5="http://schemas.microsoft.com/office/drawing/2016/5/11/chartex" xmlns:cx6="http://schemas.microsoft.com/office/drawing/2016/5/12/chartex" xmlns:cx7="http://schemas.microsoft.com/office/drawing/2016/5/13/chartex" xmlns:cx8="http://schemas.microsoft.com/office/drawing/2016/5/14/chartex" xmlns:mc="http://schemas.openxmlformats.org/markup-compatibility/2006" xmlns:aink="http://schemas.microsoft.com/office/drawing/2016/ink" xmlns:am3d="http://schemas.microsoft.com/office/drawing/2017/model3d" xmlns:o="urn:schemas-microsoft-com:office:office" xmlns:oel="http://schemas.microsoft.com/office/2019/extlst" xmlns:r="http://schemas.openxmlformats.org/officeDocument/2006/relationships" xmlns:m="http://schemas.openxmlformats.org/officeDocument/2006/math" xmlns:v="urn:schemas-microsoft-com:vml" xmlns:wp14="http://schemas.microsoft.com/office/word/2010/wordprocessingDrawing" xmlns:wp="http://schemas.openxmlformats.org/drawingml/2006/wordprocessingDrawing" xmlns:w10="urn:schemas-microsoft-com:office:word" xmlns:w="http://schemas.openxmlformats.org/wordprocessingml/2006/main" xmlns:w14="http://schemas.microsoft.com/office/word/2010/wordml" xmlns:w15="http://schemas.microsoft.com/office/word/2012/wordml" xmlns:w16cex="http://schemas.microsoft.com/office/word/2018/wordml/cex" xmlns:w16cid="http://schemas.microsoft.com/office/word/2016/wordml/cid" xmlns:w16="http://schemas.microsoft.com/office/word/2018/wordml" xmlns:w16du="http://schemas.microsoft.com/office/word/2023/wordml/word16du" xmlns:w16sdtdh="http://schemas.microsoft.com/office/word/2020/wordml/sdtdatahash" xmlns:w16sdtfl="http://schemas.microsoft.com/office/word/2024/wordml/sdtformatlock" xmlns:w16se="http://schemas.microsoft.com/office/word/2015/wordml/symex" xmlns:wpg="http://schemas.microsoft.com/office/word/2010/wordprocessingGroup" xmlns:wpi="http://schemas.microsoft.com/office/word/2010/wordprocessingInk" xmlns:wne="http://schemas.microsoft.com/office/word/2006/wordml" xmlns:wps="http://schemas.microsoft.com/office/word/2010/wordprocessingShape" mc:Ignorable="w14 w15 w16se w16cid w16 w16cex w16sdtdh w16sdtfl w16du wp14">
   <w:body>
-    <w:p>
-      <w:pPr>
-        <w:pStyle w:val="Heading1"/>
-      </w:pPr>
-    </w:p>
-    <w:p>
-      <w:pPr>
-        <w:rPr>
-          <w:sz w:val="32"/>
-          <w:szCs w:val="32"/>
-        </w:rPr>
-      </w:pPr>
-    </w:p>
-    <w:p>
-      <w:pPr>
-        <w:rPr>
-          <w:sz w:val="32"/>
-          <w:szCs w:val="32"/>
-        </w:rPr>
-      </w:pPr>
-    </w:p>
-    <w:p>
-      <w:pPr>
-        <w:rPr>
-          <w:sz w:val="32"/>
-          <w:szCs w:val="32"/>
-        </w:rPr>
-      </w:pPr>
-    </w:p>
     <w:p>
       <w:pPr>
         <w:rPr>
@@ -182,23 +153,7 @@
             <w:sz w:val="32"/>
             <w:szCs w:val="32"/>
           </w:rPr>
-          <w:t>https://git</w:t>
-        </w:r>
-        <w:r>
-          <w:rPr>
-            <w:rStyle w:val="Hyperlink"/>
-            <w:sz w:val="32"/>
-            <w:szCs w:val="32"/>
-          </w:rPr>
-          <w:t>h</w:t>
-        </w:r>
-        <w:r>
-          <w:rPr>
-            <w:rStyle w:val="Hyperlink"/>
-            <w:sz w:val="32"/>
-            <w:szCs w:val="32"/>
-          </w:rPr>
-          <w:t>ub.com/Turner2405/CrossPlatformDev---L00183767---Project</w:t>
+          <w:t>https://github.com/Turner2405/CrossPlatformDev---L00183767---Project</w:t>
         </w:r>
       </w:hyperlink>
     </w:p>
@@ -1172,8 +1127,6 @@
       </w:r>
       <w:r>
         <w:tab/>
-      </w:r>
-      <w:r>
         <w:t>2</w:t>
       </w:r>
     </w:p>
@@ -1183,25 +1136,222 @@
         <w:tabs>
           <w:tab w:val="right" w:leader="dot" w:pos="9016"/>
         </w:tabs>
+      </w:pPr>
+      <w:r>
+        <w:t xml:space="preserve">Figure </w:t>
+      </w:r>
+      <w:r>
+        <w:t>3</w:t>
+      </w:r>
+      <w:r>
+        <w:t xml:space="preserve"> An image showing the Apps Navigation bar</w:t>
+      </w:r>
+      <w:r>
+        <w:tab/>
+        <w:t>3</w:t>
+      </w:r>
+    </w:p>
+    <w:p>
+      <w:pPr>
+        <w:pStyle w:val="TableofFigures"/>
+        <w:tabs>
+          <w:tab w:val="right" w:leader="dot" w:pos="9016"/>
+        </w:tabs>
+      </w:pPr>
+      <w:r>
+        <w:t xml:space="preserve">Figure </w:t>
+      </w:r>
+      <w:r>
+        <w:t>4</w:t>
+      </w:r>
+      <w:r>
+        <w:t xml:space="preserve"> An image showing the Apps Navigation bar</w:t>
+      </w:r>
+      <w:r>
+        <w:tab/>
+        <w:t>3</w:t>
+      </w:r>
+    </w:p>
+    <w:p>
+      <w:pPr>
+        <w:pStyle w:val="TableofFigures"/>
+        <w:tabs>
+          <w:tab w:val="right" w:leader="dot" w:pos="9016"/>
+        </w:tabs>
+      </w:pPr>
+      <w:r>
+        <w:t xml:space="preserve">Figure </w:t>
+      </w:r>
+      <w:r>
+        <w:t>5</w:t>
+      </w:r>
+      <w:r>
+        <w:t xml:space="preserve"> An image showing the Apps Navigation bar</w:t>
+      </w:r>
+      <w:r>
+        <w:tab/>
+        <w:t>3</w:t>
+      </w:r>
+    </w:p>
+    <w:p>
+      <w:pPr>
+        <w:pStyle w:val="TableofFigures"/>
+        <w:tabs>
+          <w:tab w:val="right" w:leader="dot" w:pos="9016"/>
+        </w:tabs>
+      </w:pPr>
+      <w:r>
+        <w:t xml:space="preserve">Figure </w:t>
+      </w:r>
+      <w:r>
+        <w:t>6</w:t>
+      </w:r>
+      <w:r>
+        <w:t xml:space="preserve"> An image showing the Apps Navigation bar</w:t>
+      </w:r>
+      <w:r>
+        <w:tab/>
+        <w:t>3</w:t>
+      </w:r>
+    </w:p>
+    <w:p>
+      <w:pPr>
+        <w:pStyle w:val="TableofFigures"/>
+        <w:tabs>
+          <w:tab w:val="right" w:leader="dot" w:pos="9016"/>
+        </w:tabs>
+      </w:pPr>
+      <w:r>
+        <w:t xml:space="preserve">Figure </w:t>
+      </w:r>
+      <w:r>
+        <w:t>7</w:t>
+      </w:r>
+      <w:r>
+        <w:t xml:space="preserve"> An image showing the Apps Navigation bar</w:t>
+      </w:r>
+      <w:r>
+        <w:tab/>
+        <w:t>3</w:t>
+      </w:r>
+    </w:p>
+    <w:p>
+      <w:pPr>
+        <w:pStyle w:val="TableofFigures"/>
+        <w:tabs>
+          <w:tab w:val="right" w:leader="dot" w:pos="9016"/>
+        </w:tabs>
+      </w:pPr>
+      <w:r>
+        <w:t xml:space="preserve">Figure </w:t>
+      </w:r>
+      <w:r>
+        <w:t>8</w:t>
+      </w:r>
+      <w:r>
+        <w:t xml:space="preserve"> An image showing the Apps Navigation bar</w:t>
+      </w:r>
+      <w:r>
+        <w:tab/>
+        <w:t>3</w:t>
+      </w:r>
+    </w:p>
+    <w:p>
+      <w:pPr>
+        <w:pStyle w:val="TableofFigures"/>
+        <w:tabs>
+          <w:tab w:val="right" w:leader="dot" w:pos="9016"/>
+        </w:tabs>
+      </w:pPr>
+      <w:r>
+        <w:t xml:space="preserve">Figure </w:t>
+      </w:r>
+      <w:r>
+        <w:t xml:space="preserve">9 </w:t>
+      </w:r>
+      <w:r>
+        <w:t>An image showing the Apps Navigation bar</w:t>
+      </w:r>
+      <w:r>
+        <w:tab/>
+        <w:t>3</w:t>
+      </w:r>
+    </w:p>
+    <w:p>
+      <w:pPr>
+        <w:pStyle w:val="TableofFigures"/>
+        <w:tabs>
+          <w:tab w:val="right" w:leader="dot" w:pos="9016"/>
+        </w:tabs>
+      </w:pPr>
+      <w:r>
+        <w:t xml:space="preserve">Figure </w:t>
+      </w:r>
+      <w:r>
+        <w:t>10</w:t>
+      </w:r>
+      <w:r>
+        <w:t xml:space="preserve"> An image showing the Apps Navigation bar</w:t>
+      </w:r>
+      <w:r>
+        <w:tab/>
+        <w:t>3</w:t>
+      </w:r>
+    </w:p>
+    <w:p>
+      <w:pPr>
+        <w:pStyle w:val="TableofFigures"/>
+        <w:tabs>
+          <w:tab w:val="right" w:leader="dot" w:pos="9016"/>
+        </w:tabs>
+      </w:pPr>
+      <w:r>
+        <w:t xml:space="preserve">Figure </w:t>
+      </w:r>
+      <w:r>
+        <w:t>11</w:t>
+      </w:r>
+      <w:r>
+        <w:t xml:space="preserve"> An image showing the Apps Navigation bar</w:t>
+      </w:r>
+      <w:r>
+        <w:tab/>
+        <w:t>3</w:t>
+      </w:r>
+    </w:p>
+    <w:p>
+      <w:pPr>
+        <w:pStyle w:val="TableofFigures"/>
+        <w:tabs>
+          <w:tab w:val="right" w:leader="dot" w:pos="9016"/>
+        </w:tabs>
+      </w:pPr>
+      <w:r>
+        <w:t xml:space="preserve">Figure </w:t>
+      </w:r>
+      <w:r>
+        <w:t>12</w:t>
+      </w:r>
+      <w:r>
+        <w:t xml:space="preserve"> An image showing the Apps Navigation bar</w:t>
+      </w:r>
+      <w:r>
+        <w:tab/>
+        <w:t>3</w:t>
+      </w:r>
+    </w:p>
+    <w:p/>
+    <w:p/>
+    <w:p>
+      <w:pPr>
+        <w:pStyle w:val="TableofFigures"/>
+        <w:tabs>
+          <w:tab w:val="right" w:leader="dot" w:pos="9016"/>
+        </w:tabs>
         <w:rPr>
           <w:noProof/>
         </w:rPr>
       </w:pPr>
-      <w:r>
-        <w:t xml:space="preserve">Figure </w:t>
-      </w:r>
-      <w:r>
-        <w:t>3</w:t>
-      </w:r>
-      <w:r>
-        <w:t xml:space="preserve"> An image showing the Apps Navigation bar</w:t>
-      </w:r>
-      <w:r>
-        <w:tab/>
-      </w:r>
-      <w:r>
-        <w:t>3</w:t>
-      </w:r>
       <w:r>
         <w:fldChar w:fldCharType="begin"/>
       </w:r>
@@ -1371,88 +1521,42 @@
     </w:p>
     <w:p>
       <w:pPr>
+        <w:ind w:left="360"/>
+      </w:pPr>
+    </w:p>
+    <w:p/>
+    <w:p>
+      <w:pPr>
+        <w:pStyle w:val="Heading2"/>
+      </w:pPr>
+      <w:r>
+        <w:t>1.2</w:t>
+      </w:r>
+      <w:r>
+        <w:t xml:space="preserve">      </w:t>
+      </w:r>
+      <w:r>
+        <w:t>Screen Layout and Information Hierarchy</w:t>
+      </w:r>
+    </w:p>
+    <w:p>
+      <w:pPr>
+        <w:ind w:left="360"/>
+      </w:pPr>
+      <w:r>
+        <w:t>I used a bottom navigation bar with four main sections: Home, Statistics, Goals, and Settings. This lets users move between the most important areas without returning to the dashboard each time. I included both icons and text labels and used teal to highlight the selected tab. I chose this familiar mobile layout because users should be able to recognize where they are and find the next section easily (Neilson 1994). Figure 1 shows the navigation bar.</w:t>
+      </w:r>
+    </w:p>
+    <w:p>
+      <w:pPr>
         <w:pStyle w:val="ListParagraph"/>
         <w:ind w:left="360"/>
         <w:jc w:val="center"/>
       </w:pPr>
-    </w:p>
-    <w:p>
-      <w:pPr>
-        <w:pStyle w:val="Heading2"/>
-        <w:numPr>
-          <w:ilvl w:val="1"/>
-          <w:numId w:val="4"/>
-        </w:numPr>
-        <w:ind w:hanging="440"/>
-      </w:pPr>
-      <w:r>
-        <w:t xml:space="preserve">      </w:t>
-      </w:r>
-      <w:r>
-        <w:t>Screen Layout and Information Hierarchy</w:t>
-      </w:r>
-    </w:p>
-    <w:p>
-      <w:pPr>
-        <w:pStyle w:val="ListParagraph"/>
-        <w:ind w:left="360"/>
-      </w:pPr>
-      <w:r>
-        <w:t xml:space="preserve">The navigation in my version of HealthTrack uses a bottom navigation bar containing four sections: Home, Statistics, Goals, and Settings. This navbar allows users to move between </w:t>
-      </w:r>
-      <w:r>
-        <w:t xml:space="preserve">the application’s main features without having to return to the main dashboard. The navbar features icons alongside text that match the page each tab links to, helping users recognize each section. The current tab is highlighted in teal, making it easier for users to identify their location in the app. This design </w:t>
-      </w:r>
-      <w:r>
-        <w:t>follows</w:t>
-      </w:r>
-      <w:r>
-        <w:t xml:space="preserve"> the usability principle of consistency and standards</w:t>
-      </w:r>
-      <w:r>
-        <w:t xml:space="preserve"> or Jakubs Law</w:t>
-      </w:r>
-      <w:r>
-        <w:t>, as many people are familiar with bottom navigation from many mobile applications</w:t>
-      </w:r>
-      <w:r>
-        <w:t>.</w:t>
-      </w:r>
-      <w:r>
-        <w:fldChar w:fldCharType="begin"/>
-      </w:r>
-      <w:r>
-        <w:instrText xml:space="preserve"> ADDIN ZOTERO_ITEM CSL_CITATION {"citationID":"BQFhWpRG","properties":{"unsorted":false,"formattedCitation":"(Nielson 1994)","plainCitation":"(Nielson 1994)","noteIndex":0},"citationItems":[{"id":66,"uris":["http://zotero.org/users/local/ALZH0Phn/items/MYXDIZC3"],"itemData":{"id":66,"type":"webpage","abstract":"Jakob Nielsen's 10 principles for interaction design. They are called \"heuristics\" because they are broad rules of thumb and not specific usability guidelines.","container-title":"Nielsen Norman Group","language":"en","title":"10 Usability Heuristics for User Interface Design","URL":"https://www.nngroup.com/articles/ten-usability-heuristics/","author":[{"family":"Nielson","given":"Jakob"}],"accessed":{"date-parts":[["2026",10,16]]},"issued":{"date-parts":[["1994",4,24]]}}}],"schema":"https://github.com/citation-style-language/schema/raw/master/csl-citation.json"} </w:instrText>
-      </w:r>
-      <w:r>
-        <w:fldChar w:fldCharType="separate"/>
-      </w:r>
-      <w:r>
-        <w:t>(Nielson 1994)</w:t>
-      </w:r>
-      <w:r>
-        <w:fldChar w:fldCharType="end"/>
-      </w:r>
-      <w:r>
-        <w:t xml:space="preserve"> </w:t>
-      </w:r>
-      <w:r>
-        <w:t>The navbar is shown in Figure 1.</w:t>
-      </w:r>
-    </w:p>
-    <w:p>
-      <w:pPr>
-        <w:pStyle w:val="ListParagraph"/>
-        <w:ind w:left="360"/>
-      </w:pPr>
-    </w:p>
-    <w:p>
-      <w:pPr>
-        <w:pStyle w:val="ListParagraph"/>
-        <w:ind w:left="360"/>
-        <w:jc w:val="center"/>
-      </w:pPr>
-      <w:r>
+      <w:r>
+        <w:rPr>
+          <w:noProof/>
+        </w:rPr>
         <w:drawing>
           <wp:inline distT="0" distB="0" distL="0" distR="0" wp14:anchorId="1465D5BC" wp14:editId="21C53C0E">
             <wp:extent cx="3877216" cy="771633"/>
@@ -1508,60 +1612,91 @@
       </w:pPr>
     </w:p>
     <w:p>
-      <w:r>
-        <w:t>The dashboard</w:t>
-      </w:r>
-      <w:r>
-        <w:t>, the main page, uses a structured layout to present key</w:t>
-      </w:r>
-      <w:r>
-        <w:t xml:space="preserve"> health information </w:t>
+      <w:pPr>
+        <w:rPr>
+          <w:lang w:val="en-IE"/>
+        </w:rPr>
+      </w:pPr>
+      <w:r>
+        <w:rPr>
+          <w:lang w:val="en-IE"/>
+        </w:rPr>
+        <w:t xml:space="preserve">The dashboard is the first screen users see and is designed to show their daily health information </w:t>
       </w:r>
       <w:proofErr w:type="gramStart"/>
       <w:r>
+        <w:rPr>
+          <w:lang w:val="en-IE"/>
+        </w:rPr>
         <w:t>at a glance</w:t>
       </w:r>
       <w:proofErr w:type="gramEnd"/>
       <w:r>
-        <w:t xml:space="preserve">. A </w:t>
-      </w:r>
-      <w:r>
-        <w:t xml:space="preserve">personalized greeting and daily report heading appear at the top, followed by four summary cards showing the current day's steps, calories, and weight (in kilograms), and the previous night's sleep (in hours and minutes). The entire page is wrapped in a scroll view, as the information will not fit on one standard screen. The report cards use </w:t>
-      </w:r>
-      <w:r>
-        <w:t>a 2-column grid layout to group related information and allow several measurements to be viewed without navigating</w:t>
-      </w:r>
-      <w:r>
-        <w:t xml:space="preserve"> to separate screens.</w:t>
-      </w:r>
-    </w:p>
-    <w:p>
-      <w:r>
-        <w:t xml:space="preserve">The most prominent information within each card is the recorded measurement, such as the daily step count. Smaller text provides additional context, such as the daily step goal and the estimated calories burned. This creates a visual hierarchy </w:t>
-      </w:r>
-      <w:r>
-        <w:t xml:space="preserve">that makes the most relevant information </w:t>
-      </w:r>
-      <w:r>
-        <w:t xml:space="preserve">easier to identify </w:t>
-      </w:r>
-      <w:r>
-        <w:t xml:space="preserve">quickly. The dashboard also </w:t>
-      </w:r>
-      <w:r>
-        <w:t xml:space="preserve">includes a quick-action section, allowing you to </w:t>
-      </w:r>
-      <w:r>
-        <w:t>log measurements, activity</w:t>
-      </w:r>
-      <w:r>
+        <w:rPr>
+          <w:lang w:val="en-IE"/>
+        </w:rPr>
+        <w:t>. I placed a greeting at the top, followed by four cards for steps, estimated calories burned, sleep</w:t>
+      </w:r>
+      <w:r>
+        <w:rPr>
+          <w:lang w:val="en-IE"/>
+        </w:rPr>
         <w:t>,</w:t>
       </w:r>
       <w:r>
-        <w:t xml:space="preserve"> or sleep</w:t>
-      </w:r>
-      <w:r>
-        <w:t>.</w:t>
+        <w:rPr>
+          <w:lang w:val="en-IE"/>
+        </w:rPr>
+        <w:t xml:space="preserve"> and heart rate. I used a two-column Grid to group these measurements and a </w:t>
+      </w:r>
+      <w:r>
+        <w:rPr>
+          <w:lang w:val="en-IE"/>
+        </w:rPr>
+        <w:t>Scroll View</w:t>
+      </w:r>
+      <w:r>
+        <w:rPr>
+          <w:lang w:val="en-IE"/>
+        </w:rPr>
+        <w:t xml:space="preserve"> so the dashboard can contain more information than fits on one screen.</w:t>
+      </w:r>
+    </w:p>
+    <w:p>
+      <w:pPr>
+        <w:rPr>
+          <w:lang w:val="en-IE"/>
+        </w:rPr>
+      </w:pPr>
+      <w:r>
+        <w:rPr>
+          <w:lang w:val="en-IE"/>
+        </w:rPr>
+        <w:t>Inside the cards, I made the measurement itself the largest text, with smaller labels giving context such as the daily step target or units. Below the cards</w:t>
+      </w:r>
+      <w:r>
+        <w:rPr>
+          <w:lang w:val="en-IE"/>
+        </w:rPr>
+        <w:t>, I added Quick Actions for Activity, Measurement,</w:t>
+      </w:r>
+      <w:r>
+        <w:rPr>
+          <w:lang w:val="en-IE"/>
+        </w:rPr>
+        <w:t xml:space="preserve"> and Sleep, followed by a Recent Activity section. My aim was to make the most common tasks accessible from the home screen</w:t>
+      </w:r>
+      <w:r>
+        <w:rPr>
+          <w:lang w:val="en-IE"/>
+        </w:rPr>
+        <w:t>, so users don't have to dig</w:t>
+      </w:r>
+      <w:r>
+        <w:rPr>
+          <w:lang w:val="en-IE"/>
+        </w:rPr>
+        <w:t xml:space="preserve"> through menus.</w:t>
       </w:r>
     </w:p>
     <w:p/>
@@ -1570,12 +1705,14 @@
         <w:jc w:val="center"/>
       </w:pPr>
       <w:r>
-        <w:lastRenderedPageBreak/>
+        <w:rPr>
+          <w:noProof/>
+        </w:rPr>
         <w:drawing>
-          <wp:inline distT="0" distB="0" distL="0" distR="0" wp14:anchorId="24614FF6" wp14:editId="0AB6E7EB">
-            <wp:extent cx="2473569" cy="5157784"/>
-            <wp:effectExtent l="0" t="0" r="3175" b="5080"/>
-            <wp:docPr id="905665307" name="Picture 1"/>
+          <wp:inline distT="0" distB="0" distL="0" distR="0" wp14:anchorId="769AE00A" wp14:editId="6FD915C0">
+            <wp:extent cx="1746739" cy="3881642"/>
+            <wp:effectExtent l="0" t="0" r="6350" b="5080"/>
+            <wp:docPr id="1201571725" name="Picture 1"/>
             <wp:cNvGraphicFramePr>
               <a:graphicFrameLocks xmlns:a="http://schemas.openxmlformats.org/drawingml/2006/main" noChangeAspect="1"/>
             </wp:cNvGraphicFramePr>
@@ -1583,7 +1720,7 @@
               <a:graphicData uri="http://schemas.openxmlformats.org/drawingml/2006/picture">
                 <pic:pic xmlns:pic="http://schemas.openxmlformats.org/drawingml/2006/picture">
                   <pic:nvPicPr>
-                    <pic:cNvPr id="905665307" name=""/>
+                    <pic:cNvPr id="1201571725" name=""/>
                     <pic:cNvPicPr/>
                   </pic:nvPicPr>
                   <pic:blipFill>
@@ -1595,7 +1732,7 @@
                   <pic:spPr>
                     <a:xfrm>
                       <a:off x="0" y="0"/>
-                      <a:ext cx="2479088" cy="5169291"/>
+                      <a:ext cx="1753644" cy="3896986"/>
                     </a:xfrm>
                     <a:prstGeom prst="rect">
                       <a:avLst/>
@@ -1623,74 +1760,200 @@
     </w:p>
     <w:p>
       <w:r>
-        <w:t>The remaining screens follow the same overall visual style to provide a consistent experience throughout the application. Each screen is designed around its primary purpose, whether displaying personal information, recording health measurements, reviewing activity history, or examining progress towards goals.</w:t>
+        <w:t xml:space="preserve">I also used a profile icon in the top bar as a route to the personal details screen. </w:t>
+      </w:r>
+      <w:r>
+        <w:t xml:space="preserve">Quick Actions provides the intended route to activity and logging pages in this case, measurement and sleep, while Settings holds </w:t>
+      </w:r>
+      <w:r>
+        <w:t xml:space="preserve">less frequently used preferences and support information. This keeps the bottom </w:t>
+      </w:r>
+      <w:r>
+        <w:t>tab bar</w:t>
+      </w:r>
+      <w:r>
+        <w:t xml:space="preserve"> focused on the main areas. Figure 3 is a suggested navigation diagram showing how the pages connect.</w:t>
+      </w:r>
+    </w:p>
+    <w:p/>
+    <w:p>
+      <w:r>
+        <w:t>Figure3: flowchart of navigation</w:t>
+      </w:r>
+    </w:p>
+    <w:p/>
+    <w:p>
+      <w:pPr>
+        <w:pStyle w:val="Heading2"/>
+      </w:pPr>
+      <w:r>
+        <w:t xml:space="preserve">1.3     </w:t>
+      </w:r>
+      <w:r>
+        <w:t xml:space="preserve"> </w:t>
+      </w:r>
+      <w:r>
+        <w:t>Information Hierarchy and Screen Layouts</w:t>
       </w:r>
     </w:p>
     <w:p>
       <w:pPr>
         <w:pStyle w:val="ListParagraph"/>
         <w:ind w:left="360"/>
-      </w:pPr>
+        <w:rPr>
+          <w:lang w:val="en-IE"/>
+        </w:rPr>
+      </w:pPr>
+      <w:r>
+        <w:rPr>
+          <w:lang w:val="en-IE"/>
+        </w:rPr>
+        <w:t>The interface uses font size, font weight, spacing, and colour to establish an information hierarchy. On the dashboard, important measurements, such as daily step count and calories burned, appear in larger, bold text, while supporting information appears in smaller text. This helps users quickly identify the most relevant information.</w:t>
+      </w:r>
     </w:p>
     <w:p>
       <w:pPr>
         <w:pStyle w:val="ListParagraph"/>
         <w:ind w:left="360"/>
+        <w:rPr>
+          <w:lang w:val="en-IE"/>
+        </w:rPr>
       </w:pPr>
     </w:p>
     <w:p>
       <w:pPr>
         <w:pStyle w:val="ListParagraph"/>
         <w:ind w:left="360"/>
-      </w:pPr>
-    </w:p>
-    <w:p>
-      <w:pPr>
-        <w:pStyle w:val="Heading2"/>
-      </w:pPr>
-      <w:r>
-        <w:t>1.3     Information Hierarchy and Screen Layouts</w:t>
-      </w:r>
+        <w:rPr>
+          <w:lang w:val="en-IE"/>
+        </w:rPr>
+      </w:pPr>
     </w:p>
     <w:p>
       <w:pPr>
         <w:pStyle w:val="ListParagraph"/>
         <w:ind w:left="360"/>
-      </w:pPr>
-      <w:r>
-        <w:t>The interface uses font size, font weight, spacing</w:t>
-      </w:r>
-      <w:r>
-        <w:t>, and colour</w:t>
-      </w:r>
-      <w:r>
-        <w:t xml:space="preserve"> to establish an information hierarchy. On the dashboard, important measurements, such as </w:t>
-      </w:r>
-      <w:r>
-        <w:t>daily step count and calories burned, appear in larger, bold text, while supporting information appears in smaller text. This helps users quickly identify the most relevant information.</w:t>
+        <w:rPr>
+          <w:lang w:val="en-IE"/>
+        </w:rPr>
+      </w:pPr>
+      <w:r>
+        <w:rPr>
+          <w:lang w:val="en-IE"/>
+        </w:rPr>
+        <w:t>I grouped related information inside rounded cards with consistent padding, spacing and background colours. This follows the Gestalt principle of proximity: information placed close together is more likely to be understood as a related group</w:t>
+      </w:r>
+      <w:r>
+        <w:rPr>
+          <w:lang w:val="en-IE"/>
+        </w:rPr>
+        <w:t xml:space="preserve"> </w:t>
+      </w:r>
+      <w:r>
+        <w:rPr>
+          <w:lang w:val="en-IE"/>
+        </w:rPr>
+        <w:fldChar w:fldCharType="begin"/>
+      </w:r>
+      <w:r>
+        <w:rPr>
+          <w:lang w:val="en-IE"/>
+        </w:rPr>
+        <w:instrText xml:space="preserve"> ADDIN ZOTERO_ITEM CSL_CITATION {"citationID":"Gx32MZzu","properties":{"unsorted":false,"formattedCitation":"(Harley 2026)","plainCitation":"(Harley 2026)","noteIndex":0},"citationItems":[{"id":73,"uris":["http://zotero.org/users/local/ALZH0Phn/items/ST7DEYNK"],"itemData":{"id":73,"type":"webpage","abstract":"Design elements near each other are perceived as related, while elements spaced apart are perceived as belonging to separate groups.","container-title":"Nielsen Norman Group","language":"en","title":"Proximity Principle in Visual Design","URL":"https://www.nngroup.com/articles/gestalt-proximity/","author":[{"family":"Harley","given":"Aurora"}],"accessed":{"date-parts":[["2026",10,20]]}}}],"schema":"https://github.com/citation-style-language/schema/raw/master/csl-citation.json"} </w:instrText>
+      </w:r>
+      <w:r>
+        <w:rPr>
+          <w:lang w:val="en-IE"/>
+        </w:rPr>
+        <w:fldChar w:fldCharType="separate"/>
+      </w:r>
+      <w:r>
+        <w:rPr>
+          <w:lang w:val="en-IE"/>
+        </w:rPr>
+        <w:t>(Harley 202</w:t>
+      </w:r>
+      <w:r>
+        <w:rPr>
+          <w:lang w:val="en-IE"/>
+        </w:rPr>
+        <w:t>0</w:t>
+      </w:r>
+      <w:r>
+        <w:rPr>
+          <w:lang w:val="en-IE"/>
+        </w:rPr>
+        <w:t>)</w:t>
+      </w:r>
+      <w:r>
+        <w:rPr>
+          <w:lang w:val="en-IE"/>
+        </w:rPr>
+        <w:fldChar w:fldCharType="end"/>
+      </w:r>
+      <w:r>
+        <w:rPr>
+          <w:lang w:val="en-IE"/>
+        </w:rPr>
+        <w:t xml:space="preserve">. I used gaps and dividers between sections so the screens would feel </w:t>
+      </w:r>
+      <w:r>
+        <w:rPr>
+          <w:lang w:val="en-IE"/>
+        </w:rPr>
+        <w:t>organised</w:t>
+      </w:r>
+      <w:r>
+        <w:rPr>
+          <w:lang w:val="en-IE"/>
+        </w:rPr>
+        <w:t xml:space="preserve"> rather than crowded.</w:t>
       </w:r>
     </w:p>
     <w:p>
       <w:pPr>
         <w:pStyle w:val="ListParagraph"/>
         <w:ind w:left="360"/>
-      </w:pPr>
-      <w:r>
-        <w:lastRenderedPageBreak/>
-        <w:t>Related information is grouped into cards with consistent padding, rounded corners and background colours. This supports the Gestalt principle of proximity, where elements positioned close together are perceived as related [citation]. Dividers and spacing separate main dashboard sections, reducing visual clutter and making the information easier to scan.</w:t>
-      </w:r>
+        <w:rPr>
+          <w:lang w:val="en-IE"/>
+        </w:rPr>
+      </w:pPr>
     </w:p>
     <w:p>
       <w:pPr>
         <w:pStyle w:val="ListParagraph"/>
         <w:ind w:left="360"/>
+        <w:rPr>
+          <w:lang w:val="en-IE"/>
+        </w:rPr>
       </w:pPr>
     </w:p>
     <w:p>
       <w:pPr>
         <w:pStyle w:val="ListParagraph"/>
         <w:ind w:left="360"/>
-      </w:pPr>
+        <w:rPr>
+          <w:lang w:val="en-IE"/>
+        </w:rPr>
+      </w:pPr>
+      <w:r>
+        <w:rPr>
+          <w:lang w:val="en-IE"/>
+        </w:rPr>
+        <w:t>I gave each page a layout that reflects what the user is trying to do. On Statistics, I placed the time-range controls before the daily-steps chart, followed by the weekly summary and a short insight. On Profile, I placed the profile image and name above the user's details, including email, height</w:t>
+      </w:r>
+      <w:r>
+        <w:rPr>
+          <w:lang w:val="en-IE"/>
+        </w:rPr>
+        <w:t>,</w:t>
+      </w:r>
+      <w:r>
+        <w:rPr>
+          <w:lang w:val="en-IE"/>
+        </w:rPr>
+        <w:t xml:space="preserve"> and weight, with an Edit Profile button at the bottom. Figures 4 and 5 show these two screens.</w:t>
+      </w:r>
     </w:p>
     <w:p>
       <w:pPr>
@@ -1715,182 +1978,15 @@
         <w:pStyle w:val="ListParagraph"/>
         <w:ind w:left="360"/>
       </w:pPr>
-    </w:p>
-    <w:p>
-      <w:pPr>
-        <w:pStyle w:val="ListParagraph"/>
-        <w:ind w:left="360"/>
-      </w:pPr>
-    </w:p>
-    <w:p>
-      <w:pPr>
-        <w:pStyle w:val="ListParagraph"/>
-        <w:ind w:left="360"/>
-      </w:pPr>
-    </w:p>
-    <w:p>
-      <w:pPr>
-        <w:pStyle w:val="ListParagraph"/>
-        <w:ind w:left="360"/>
-      </w:pPr>
-    </w:p>
-    <w:p>
-      <w:pPr>
-        <w:pStyle w:val="ListParagraph"/>
-        <w:ind w:left="360"/>
-      </w:pPr>
-    </w:p>
-    <w:p>
-      <w:pPr>
-        <w:pStyle w:val="ListParagraph"/>
-        <w:ind w:left="360"/>
-      </w:pPr>
-    </w:p>
-    <w:p>
-      <w:pPr>
-        <w:pStyle w:val="ListParagraph"/>
-        <w:ind w:left="360"/>
-      </w:pPr>
-    </w:p>
-    <w:p>
-      <w:pPr>
-        <w:pStyle w:val="ListParagraph"/>
-        <w:ind w:left="360"/>
-      </w:pPr>
-    </w:p>
-    <w:p>
-      <w:pPr>
-        <w:pStyle w:val="ListParagraph"/>
-        <w:ind w:left="360"/>
-      </w:pPr>
-    </w:p>
-    <w:p>
-      <w:pPr>
-        <w:pStyle w:val="ListParagraph"/>
-        <w:ind w:left="360"/>
-      </w:pPr>
-    </w:p>
-    <w:p>
-      <w:pPr>
-        <w:pStyle w:val="ListParagraph"/>
-        <w:ind w:left="360"/>
-      </w:pPr>
-    </w:p>
-    <w:p>
-      <w:pPr>
-        <w:pStyle w:val="ListParagraph"/>
-        <w:ind w:left="360"/>
-      </w:pPr>
-    </w:p>
-    <w:p>
-      <w:pPr>
-        <w:pStyle w:val="ListParagraph"/>
-        <w:ind w:left="360"/>
-      </w:pPr>
-    </w:p>
-    <w:p>
-      <w:pPr>
-        <w:pStyle w:val="ListParagraph"/>
-        <w:ind w:left="360"/>
-      </w:pPr>
-    </w:p>
-    <w:p>
-      <w:pPr>
-        <w:pStyle w:val="ListParagraph"/>
-        <w:ind w:left="360"/>
-      </w:pPr>
-    </w:p>
-    <w:p>
-      <w:pPr>
-        <w:pStyle w:val="ListParagraph"/>
-        <w:ind w:left="360"/>
-      </w:pPr>
-    </w:p>
-    <w:p>
-      <w:pPr>
-        <w:pStyle w:val="ListParagraph"/>
-        <w:ind w:left="360"/>
-      </w:pPr>
-    </w:p>
-    <w:p>
-      <w:pPr>
-        <w:pStyle w:val="ListParagraph"/>
-        <w:ind w:left="360"/>
-      </w:pPr>
-    </w:p>
-    <w:p>
-      <w:pPr>
-        <w:pStyle w:val="ListParagraph"/>
-        <w:ind w:left="360"/>
-      </w:pPr>
-    </w:p>
-    <w:p>
-      <w:pPr>
-        <w:pStyle w:val="ListParagraph"/>
-        <w:ind w:left="360"/>
-      </w:pPr>
-    </w:p>
-    <w:p>
-      <w:pPr>
-        <w:pStyle w:val="ListParagraph"/>
-        <w:ind w:left="360"/>
-      </w:pPr>
-    </w:p>
-    <w:p>
-      <w:pPr>
-        <w:pStyle w:val="ListParagraph"/>
-        <w:ind w:left="360"/>
-      </w:pPr>
-    </w:p>
-    <w:p>
-      <w:pPr>
-        <w:pStyle w:val="ListParagraph"/>
-        <w:ind w:left="360"/>
-      </w:pPr>
-    </w:p>
-    <w:p>
-      <w:pPr>
-        <w:pStyle w:val="ListParagraph"/>
-        <w:ind w:left="360"/>
-      </w:pPr>
-    </w:p>
-    <w:p>
-      <w:pPr>
-        <w:pStyle w:val="Heading1"/>
-        <w:numPr>
-          <w:ilvl w:val="0"/>
-          <w:numId w:val="4"/>
-        </w:numPr>
-      </w:pPr>
-      <w:bookmarkStart w:id="3" w:name="_Toc240468790"/>
-      <w:r>
-        <w:t>Application architecture</w:t>
-      </w:r>
-      <w:bookmarkEnd w:id="3"/>
-    </w:p>
-    <w:p>
-      <w:r>
-        <w:t xml:space="preserve">You </w:t>
-      </w:r>
-      <w:r>
-        <w:t xml:space="preserve">should carefully consider the architecture of your .NET MAUI application. This should include an architecture diagram showing the major components and their relationships. </w:t>
-      </w:r>
-    </w:p>
-    <w:p>
-      <w:pPr>
-        <w:keepNext/>
-        <w:jc w:val="center"/>
-      </w:pPr>
       <w:r>
         <w:rPr>
           <w:noProof/>
         </w:rPr>
-        <w:lastRenderedPageBreak/>
         <w:drawing>
-          <wp:inline distT="0" distB="0" distL="0" distR="0" wp14:anchorId="71926E04" wp14:editId="19937CC7">
-            <wp:extent cx="4674358" cy="3334824"/>
-            <wp:effectExtent l="0" t="0" r="0" b="0"/>
-            <wp:docPr id="253210922" name="Picture 1"/>
+          <wp:inline distT="0" distB="0" distL="0" distR="0" wp14:anchorId="6D31912D" wp14:editId="35877EF4">
+            <wp:extent cx="1899138" cy="4113605"/>
+            <wp:effectExtent l="0" t="0" r="6350" b="1270"/>
+            <wp:docPr id="2048305174" name="Picture 1"/>
             <wp:cNvGraphicFramePr>
               <a:graphicFrameLocks xmlns:a="http://schemas.openxmlformats.org/drawingml/2006/main" noChangeAspect="1"/>
             </wp:cNvGraphicFramePr>
@@ -1898,7 +1994,7 @@
               <a:graphicData uri="http://schemas.openxmlformats.org/drawingml/2006/picture">
                 <pic:pic xmlns:pic="http://schemas.openxmlformats.org/drawingml/2006/picture">
                   <pic:nvPicPr>
-                    <pic:cNvPr id="253210922" name=""/>
+                    <pic:cNvPr id="2048305174" name=""/>
                     <pic:cNvPicPr/>
                   </pic:nvPicPr>
                   <pic:blipFill>
@@ -1910,7 +2006,7 @@
                   <pic:spPr>
                     <a:xfrm>
                       <a:off x="0" y="0"/>
-                      <a:ext cx="4680358" cy="3339105"/>
+                      <a:ext cx="1910206" cy="4137578"/>
                     </a:xfrm>
                     <a:prstGeom prst="rect">
                       <a:avLst/>
@@ -1922,93 +2018,1915 @@
           </wp:inline>
         </w:drawing>
       </w:r>
-    </w:p>
-    <w:p>
-      <w:pPr>
-        <w:pStyle w:val="Caption"/>
+      <w:r>
+        <w:t xml:space="preserve">                                               </w:t>
+      </w:r>
+      <w:r>
+        <w:rPr>
+          <w:noProof/>
+        </w:rPr>
+        <w:drawing>
+          <wp:inline distT="0" distB="0" distL="0" distR="0" wp14:anchorId="3EFDE600" wp14:editId="01474543">
+            <wp:extent cx="2101880" cy="4108937"/>
+            <wp:effectExtent l="0" t="0" r="0" b="6350"/>
+            <wp:docPr id="440552108" name="Picture 1"/>
+            <wp:cNvGraphicFramePr>
+              <a:graphicFrameLocks xmlns:a="http://schemas.openxmlformats.org/drawingml/2006/main" noChangeAspect="1"/>
+            </wp:cNvGraphicFramePr>
+            <a:graphic xmlns:a="http://schemas.openxmlformats.org/drawingml/2006/main">
+              <a:graphicData uri="http://schemas.openxmlformats.org/drawingml/2006/picture">
+                <pic:pic xmlns:pic="http://schemas.openxmlformats.org/drawingml/2006/picture">
+                  <pic:nvPicPr>
+                    <pic:cNvPr id="440552108" name=""/>
+                    <pic:cNvPicPr/>
+                  </pic:nvPicPr>
+                  <pic:blipFill>
+                    <a:blip r:embed="rId15"/>
+                    <a:stretch>
+                      <a:fillRect/>
+                    </a:stretch>
+                  </pic:blipFill>
+                  <pic:spPr>
+                    <a:xfrm>
+                      <a:off x="0" y="0"/>
+                      <a:ext cx="2109038" cy="4122930"/>
+                    </a:xfrm>
+                    <a:prstGeom prst="rect">
+                      <a:avLst/>
+                    </a:prstGeom>
+                  </pic:spPr>
+                </pic:pic>
+              </a:graphicData>
+            </a:graphic>
+          </wp:inline>
+        </w:drawing>
+      </w:r>
+    </w:p>
+    <w:p>
+      <w:pPr>
+        <w:pStyle w:val="ListParagraph"/>
+        <w:ind w:left="360"/>
+      </w:pPr>
+    </w:p>
+    <w:p>
+      <w:pPr>
+        <w:pStyle w:val="ListParagraph"/>
+        <w:ind w:left="360"/>
+      </w:pPr>
+      <w:r>
+        <w:t xml:space="preserve">    Figure </w:t>
+      </w:r>
+      <w:r>
+        <w:t>4</w:t>
+      </w:r>
+      <w:r>
+        <w:t>: Statistics Page</w:t>
+      </w:r>
+      <w:r>
+        <w:tab/>
+      </w:r>
+      <w:r>
+        <w:tab/>
+      </w:r>
+      <w:r>
+        <w:tab/>
+      </w:r>
+      <w:r>
+        <w:tab/>
+        <w:t xml:space="preserve">       Figure </w:t>
+      </w:r>
+      <w:r>
+        <w:t>5</w:t>
+      </w:r>
+      <w:r>
+        <w:t>: Profile Page</w:t>
+      </w:r>
+    </w:p>
+    <w:p>
+      <w:pPr>
+        <w:pStyle w:val="ListParagraph"/>
+        <w:ind w:left="360"/>
+      </w:pPr>
+    </w:p>
+    <w:p>
+      <w:pPr>
+        <w:pStyle w:val="ListParagraph"/>
+        <w:ind w:left="360"/>
+      </w:pPr>
+    </w:p>
+    <w:p>
+      <w:pPr>
+        <w:pStyle w:val="ListParagraph"/>
+        <w:ind w:left="360"/>
+      </w:pPr>
+    </w:p>
+    <w:p>
+      <w:pPr>
+        <w:pStyle w:val="ListParagraph"/>
+        <w:ind w:left="360"/>
+      </w:pPr>
+    </w:p>
+    <w:p>
+      <w:pPr>
+        <w:pStyle w:val="ListParagraph"/>
+        <w:ind w:left="360"/>
+      </w:pPr>
+    </w:p>
+    <w:p>
+      <w:pPr>
+        <w:pStyle w:val="ListParagraph"/>
+        <w:ind w:left="360"/>
+      </w:pPr>
+    </w:p>
+    <w:p>
+      <w:pPr>
+        <w:pStyle w:val="ListParagraph"/>
+        <w:ind w:left="360"/>
+      </w:pPr>
+    </w:p>
+    <w:p>
+      <w:pPr>
+        <w:pStyle w:val="ListParagraph"/>
+        <w:ind w:left="360"/>
+        <w:rPr>
+          <w:lang w:val="en-IE"/>
+        </w:rPr>
+      </w:pPr>
+      <w:r>
+        <w:rPr>
+          <w:lang w:val="en-IE"/>
+        </w:rPr>
+        <w:t xml:space="preserve">On the Activities page, I used a vertical list of previous sessions </w:t>
+      </w:r>
+      <w:r>
+        <w:rPr>
+          <w:lang w:val="en-IE"/>
+        </w:rPr>
+        <w:t>instead of</w:t>
+      </w:r>
+      <w:r>
+        <w:rPr>
+          <w:lang w:val="en-IE"/>
+        </w:rPr>
+        <w:t xml:space="preserve"> a large table. Each entry includes an activity icon, name, duration, estimated calories</w:t>
+      </w:r>
+      <w:r>
+        <w:rPr>
+          <w:lang w:val="en-IE"/>
+        </w:rPr>
+        <w:t>,</w:t>
+      </w:r>
+      <w:r>
+        <w:rPr>
+          <w:lang w:val="en-IE"/>
+        </w:rPr>
+        <w:t xml:space="preserve"> and date. This gives users a quick overview of what they have done, and the Log Activity button sits above the history </w:t>
+      </w:r>
+      <w:r>
+        <w:rPr>
+          <w:lang w:val="en-IE"/>
+        </w:rPr>
+        <w:t>for easy access</w:t>
+      </w:r>
+      <w:r>
+        <w:rPr>
+          <w:lang w:val="en-IE"/>
+        </w:rPr>
+        <w:t>.</w:t>
+      </w:r>
+    </w:p>
+    <w:p>
+      <w:pPr>
+        <w:pStyle w:val="ListParagraph"/>
+        <w:ind w:left="360"/>
+        <w:rPr>
+          <w:lang w:val="en-IE"/>
+        </w:rPr>
+      </w:pPr>
+    </w:p>
+    <w:p>
+      <w:pPr>
+        <w:pStyle w:val="ListParagraph"/>
+        <w:ind w:left="360"/>
+        <w:rPr>
+          <w:lang w:val="en-IE"/>
+        </w:rPr>
+      </w:pPr>
+    </w:p>
+    <w:p>
+      <w:pPr>
+        <w:pStyle w:val="ListParagraph"/>
+        <w:ind w:left="360"/>
+      </w:pPr>
+      <w:r>
+        <w:rPr>
+          <w:lang w:val="en-IE"/>
+        </w:rPr>
+        <w:t>I designed the Goals page around progress towards targets. It starts with the daily step goal, then separates sleep, exercise</w:t>
+      </w:r>
+      <w:r>
+        <w:rPr>
+          <w:lang w:val="en-IE"/>
+        </w:rPr>
+        <w:t>,</w:t>
+      </w:r>
+      <w:r>
+        <w:rPr>
+          <w:lang w:val="en-IE"/>
+        </w:rPr>
+        <w:t xml:space="preserve"> and water intake into their own sections. A weekly activity breakdown lets users compare </w:t>
+      </w:r>
+      <w:r>
+        <w:rPr>
+          <w:lang w:val="en-IE"/>
+        </w:rPr>
+        <w:t>days, and I included Edit Goal and Add New Goal buttons to show where users</w:t>
+      </w:r>
+      <w:r>
+        <w:rPr>
+          <w:lang w:val="en-IE"/>
+        </w:rPr>
+        <w:t xml:space="preserve"> will eventually manage their targets. This screen keeps goals separate from the historical data on Statistics</w:t>
+      </w:r>
+      <w:r>
+        <w:rPr>
+          <w:lang w:val="en-IE"/>
+        </w:rPr>
+        <w:t>.</w:t>
+      </w:r>
+      <w:r>
+        <w:t xml:space="preserve">  </w:t>
+      </w:r>
+    </w:p>
+    <w:p>
+      <w:pPr>
+        <w:pStyle w:val="ListParagraph"/>
+        <w:ind w:left="360"/>
+      </w:pPr>
+    </w:p>
+    <w:p>
+      <w:pPr>
+        <w:pStyle w:val="ListParagraph"/>
+        <w:ind w:left="360"/>
+        <w:rPr>
+          <w:lang w:val="en-IE"/>
+        </w:rPr>
+      </w:pPr>
+      <w:r>
+        <w:drawing>
+          <wp:inline distT="0" distB="0" distL="0" distR="0" wp14:anchorId="0A6A2AB5" wp14:editId="25F51E5F">
+            <wp:extent cx="2524477" cy="4858428"/>
+            <wp:effectExtent l="0" t="0" r="9525" b="0"/>
+            <wp:docPr id="1676478350" name="Picture 1"/>
+            <wp:cNvGraphicFramePr>
+              <a:graphicFrameLocks xmlns:a="http://schemas.openxmlformats.org/drawingml/2006/main" noChangeAspect="1"/>
+            </wp:cNvGraphicFramePr>
+            <a:graphic xmlns:a="http://schemas.openxmlformats.org/drawingml/2006/main">
+              <a:graphicData uri="http://schemas.openxmlformats.org/drawingml/2006/picture">
+                <pic:pic xmlns:pic="http://schemas.openxmlformats.org/drawingml/2006/picture">
+                  <pic:nvPicPr>
+                    <pic:cNvPr id="1676478350" name=""/>
+                    <pic:cNvPicPr/>
+                  </pic:nvPicPr>
+                  <pic:blipFill>
+                    <a:blip r:embed="rId16"/>
+                    <a:stretch>
+                      <a:fillRect/>
+                    </a:stretch>
+                  </pic:blipFill>
+                  <pic:spPr>
+                    <a:xfrm>
+                      <a:off x="0" y="0"/>
+                      <a:ext cx="2524477" cy="4858428"/>
+                    </a:xfrm>
+                    <a:prstGeom prst="rect">
+                      <a:avLst/>
+                    </a:prstGeom>
+                  </pic:spPr>
+                </pic:pic>
+              </a:graphicData>
+            </a:graphic>
+          </wp:inline>
+        </w:drawing>
+      </w:r>
+      <w:r>
+        <w:t xml:space="preserve">            </w:t>
+      </w:r>
+      <w:r>
+        <w:drawing>
+          <wp:inline distT="0" distB="0" distL="0" distR="0" wp14:anchorId="39DF69DE" wp14:editId="4AED2C8F">
+            <wp:extent cx="2572109" cy="4972744"/>
+            <wp:effectExtent l="0" t="0" r="0" b="0"/>
+            <wp:docPr id="1604754364" name="Picture 1"/>
+            <wp:cNvGraphicFramePr>
+              <a:graphicFrameLocks xmlns:a="http://schemas.openxmlformats.org/drawingml/2006/main" noChangeAspect="1"/>
+            </wp:cNvGraphicFramePr>
+            <a:graphic xmlns:a="http://schemas.openxmlformats.org/drawingml/2006/main">
+              <a:graphicData uri="http://schemas.openxmlformats.org/drawingml/2006/picture">
+                <pic:pic xmlns:pic="http://schemas.openxmlformats.org/drawingml/2006/picture">
+                  <pic:nvPicPr>
+                    <pic:cNvPr id="1604754364" name=""/>
+                    <pic:cNvPicPr/>
+                  </pic:nvPicPr>
+                  <pic:blipFill>
+                    <a:blip r:embed="rId17"/>
+                    <a:stretch>
+                      <a:fillRect/>
+                    </a:stretch>
+                  </pic:blipFill>
+                  <pic:spPr>
+                    <a:xfrm>
+                      <a:off x="0" y="0"/>
+                      <a:ext cx="2572109" cy="4972744"/>
+                    </a:xfrm>
+                    <a:prstGeom prst="rect">
+                      <a:avLst/>
+                    </a:prstGeom>
+                  </pic:spPr>
+                </pic:pic>
+              </a:graphicData>
+            </a:graphic>
+          </wp:inline>
+        </w:drawing>
+      </w:r>
+      <w:r>
+        <w:t xml:space="preserve"> </w:t>
+      </w:r>
+    </w:p>
+    <w:p>
+      <w:pPr>
+        <w:pStyle w:val="ListParagraph"/>
+        <w:ind w:left="360"/>
+      </w:pPr>
+    </w:p>
+    <w:p>
+      <w:pPr>
+        <w:pStyle w:val="ListParagraph"/>
+        <w:ind w:left="1080"/>
+      </w:pPr>
+      <w:r>
+        <w:t>Figure 6: Activities Page</w:t>
+      </w:r>
+      <w:r>
+        <w:tab/>
+      </w:r>
+      <w:r>
+        <w:tab/>
+      </w:r>
+      <w:r>
+        <w:tab/>
+      </w:r>
+      <w:r>
+        <w:tab/>
+        <w:t>Figure 7: Goals Page</w:t>
+      </w:r>
+    </w:p>
+    <w:p>
+      <w:pPr>
+        <w:pStyle w:val="ListParagraph"/>
+        <w:ind w:left="1080"/>
+      </w:pPr>
+    </w:p>
+    <w:p>
+      <w:pPr>
+        <w:pStyle w:val="ListParagraph"/>
+        <w:ind w:left="1080"/>
+      </w:pPr>
+    </w:p>
+    <w:p>
+      <w:pPr>
+        <w:pStyle w:val="ListParagraph"/>
+        <w:ind w:left="1080"/>
+      </w:pPr>
+    </w:p>
+    <w:p>
+      <w:pPr>
+        <w:pStyle w:val="ListParagraph"/>
+        <w:ind w:left="1080"/>
+      </w:pPr>
+    </w:p>
+    <w:p>
+      <w:r>
+        <w:t>For Settings, I divided the information into Preferences, Measurement Units, Help and Support, and About. This makes the screen easier to scan and avoids mixing notification preferences with privacy information. I also kept profile editing on the Profile page rather than repeating it in Settings, so the same task has one main location.</w:t>
+      </w:r>
+    </w:p>
+    <w:p/>
+    <w:p>
+      <w:r>
+        <w:drawing>
+          <wp:inline distT="0" distB="0" distL="0" distR="0" wp14:anchorId="7FE28B16" wp14:editId="30FEB58B">
+            <wp:extent cx="2581635" cy="5391902"/>
+            <wp:effectExtent l="0" t="0" r="9525" b="0"/>
+            <wp:docPr id="424660584" name="Picture 1"/>
+            <wp:cNvGraphicFramePr>
+              <a:graphicFrameLocks xmlns:a="http://schemas.openxmlformats.org/drawingml/2006/main" noChangeAspect="1"/>
+            </wp:cNvGraphicFramePr>
+            <a:graphic xmlns:a="http://schemas.openxmlformats.org/drawingml/2006/main">
+              <a:graphicData uri="http://schemas.openxmlformats.org/drawingml/2006/picture">
+                <pic:pic xmlns:pic="http://schemas.openxmlformats.org/drawingml/2006/picture">
+                  <pic:nvPicPr>
+                    <pic:cNvPr id="424660584" name=""/>
+                    <pic:cNvPicPr/>
+                  </pic:nvPicPr>
+                  <pic:blipFill>
+                    <a:blip r:embed="rId18"/>
+                    <a:stretch>
+                      <a:fillRect/>
+                    </a:stretch>
+                  </pic:blipFill>
+                  <pic:spPr>
+                    <a:xfrm>
+                      <a:off x="0" y="0"/>
+                      <a:ext cx="2581635" cy="5391902"/>
+                    </a:xfrm>
+                    <a:prstGeom prst="rect">
+                      <a:avLst/>
+                    </a:prstGeom>
+                  </pic:spPr>
+                </pic:pic>
+              </a:graphicData>
+            </a:graphic>
+          </wp:inline>
+        </w:drawing>
+      </w:r>
+      <w:r>
+        <w:t xml:space="preserve">                 </w:t>
+      </w:r>
+      <w:r>
+        <w:drawing>
+          <wp:inline distT="0" distB="0" distL="0" distR="0" wp14:anchorId="16909943" wp14:editId="445456A3">
+            <wp:extent cx="2591162" cy="5458587"/>
+            <wp:effectExtent l="0" t="0" r="0" b="0"/>
+            <wp:docPr id="821734598" name="Picture 1"/>
+            <wp:cNvGraphicFramePr>
+              <a:graphicFrameLocks xmlns:a="http://schemas.openxmlformats.org/drawingml/2006/main" noChangeAspect="1"/>
+            </wp:cNvGraphicFramePr>
+            <a:graphic xmlns:a="http://schemas.openxmlformats.org/drawingml/2006/main">
+              <a:graphicData uri="http://schemas.openxmlformats.org/drawingml/2006/picture">
+                <pic:pic xmlns:pic="http://schemas.openxmlformats.org/drawingml/2006/picture">
+                  <pic:nvPicPr>
+                    <pic:cNvPr id="821734598" name=""/>
+                    <pic:cNvPicPr/>
+                  </pic:nvPicPr>
+                  <pic:blipFill>
+                    <a:blip r:embed="rId19"/>
+                    <a:stretch>
+                      <a:fillRect/>
+                    </a:stretch>
+                  </pic:blipFill>
+                  <pic:spPr>
+                    <a:xfrm>
+                      <a:off x="0" y="0"/>
+                      <a:ext cx="2591162" cy="5458587"/>
+                    </a:xfrm>
+                    <a:prstGeom prst="rect">
+                      <a:avLst/>
+                    </a:prstGeom>
+                  </pic:spPr>
+                </pic:pic>
+              </a:graphicData>
+            </a:graphic>
+          </wp:inline>
+        </w:drawing>
+      </w:r>
+    </w:p>
+    <w:p>
+      <w:r>
+        <w:tab/>
+      </w:r>
+      <w:r>
+        <w:tab/>
+      </w:r>
+      <w:r>
+        <w:tab/>
+      </w:r>
+      <w:r>
+        <w:tab/>
+        <w:t xml:space="preserve">      Figure 8: Settings Page</w:t>
+      </w:r>
+    </w:p>
+    <w:p>
+      <w:pPr>
+        <w:pStyle w:val="ListParagraph"/>
+        <w:ind w:left="360"/>
+      </w:pPr>
+    </w:p>
+    <w:p>
+      <w:pPr>
+        <w:pStyle w:val="ListParagraph"/>
+        <w:ind w:left="360"/>
+      </w:pPr>
+    </w:p>
+    <w:p>
+      <w:pPr>
+        <w:pStyle w:val="ListParagraph"/>
+        <w:ind w:left="360"/>
+      </w:pPr>
+    </w:p>
+    <w:p>
+      <w:pPr>
+        <w:pStyle w:val="ListParagraph"/>
+        <w:ind w:left="360"/>
+      </w:pPr>
+    </w:p>
+    <w:p>
+      <w:pPr>
+        <w:pStyle w:val="ListParagraph"/>
+        <w:ind w:left="360"/>
+      </w:pPr>
+    </w:p>
+    <w:p>
+      <w:pPr>
+        <w:pStyle w:val="ListParagraph"/>
+        <w:ind w:left="360"/>
+      </w:pPr>
+    </w:p>
+    <w:p>
+      <w:pPr>
+        <w:pStyle w:val="ListParagraph"/>
+        <w:ind w:left="360"/>
+      </w:pPr>
+    </w:p>
+    <w:p>
+      <w:pPr>
+        <w:pStyle w:val="ListParagraph"/>
+        <w:ind w:left="360"/>
+      </w:pPr>
+    </w:p>
+    <w:p>
+      <w:pPr>
+        <w:pStyle w:val="Heading2"/>
+      </w:pPr>
+      <w:r>
+        <w:t>1.4</w:t>
+      </w:r>
+      <w:r>
+        <w:tab/>
+        <w:t xml:space="preserve">Interaction Patterns and Input Controls </w:t>
+      </w:r>
+    </w:p>
+    <w:p/>
+    <w:p>
+      <w:r>
+        <w:t>Health Track</w:t>
+      </w:r>
+      <w:r>
+        <w:t xml:space="preserve"> uses familiar controls such as buttons, icons, switches</w:t>
+      </w:r>
+      <w:r>
+        <w:t>,</w:t>
+      </w:r>
+      <w:r>
+        <w:t xml:space="preserve"> and pickers. I put the Quick Actions for activity, measurement</w:t>
+      </w:r>
+      <w:r>
+        <w:t>,</w:t>
+      </w:r>
+      <w:r>
+        <w:t xml:space="preserve"> and sleep together on the dashboard because these are tasks users may complete regularly. These shortcuts are shown in Figure </w:t>
+      </w:r>
+      <w:r>
+        <w:t xml:space="preserve">9 </w:t>
+      </w:r>
+      <w:r>
+        <w:t>and</w:t>
+      </w:r>
+      <w:r>
+        <w:t xml:space="preserve"> are designed to reduce the number of steps needed to reach a recording screen.</w:t>
+      </w:r>
+    </w:p>
+    <w:p>
+      <w:pPr>
         <w:jc w:val="center"/>
-        <w:rPr>
-          <w:color w:val="000000" w:themeColor="text1"/>
-          <w:sz w:val="24"/>
-          <w:szCs w:val="24"/>
-        </w:rPr>
-      </w:pPr>
-      <w:bookmarkStart w:id="4" w:name="_Toc184306733"/>
-      <w:r>
-        <w:rPr>
-          <w:color w:val="000000" w:themeColor="text1"/>
-          <w:sz w:val="24"/>
-          <w:szCs w:val="24"/>
-        </w:rPr>
+      </w:pPr>
+      <w:r>
+        <w:rPr>
+          <w:noProof/>
+        </w:rPr>
+        <w:drawing>
+          <wp:inline distT="0" distB="0" distL="0" distR="0" wp14:anchorId="2C3A8296" wp14:editId="5BB082F1">
+            <wp:extent cx="2524477" cy="2191056"/>
+            <wp:effectExtent l="0" t="0" r="0" b="0"/>
+            <wp:docPr id="140741982" name="Picture 1"/>
+            <wp:cNvGraphicFramePr>
+              <a:graphicFrameLocks xmlns:a="http://schemas.openxmlformats.org/drawingml/2006/main" noChangeAspect="1"/>
+            </wp:cNvGraphicFramePr>
+            <a:graphic xmlns:a="http://schemas.openxmlformats.org/drawingml/2006/main">
+              <a:graphicData uri="http://schemas.openxmlformats.org/drawingml/2006/picture">
+                <pic:pic xmlns:pic="http://schemas.openxmlformats.org/drawingml/2006/picture">
+                  <pic:nvPicPr>
+                    <pic:cNvPr id="140741982" name=""/>
+                    <pic:cNvPicPr/>
+                  </pic:nvPicPr>
+                  <pic:blipFill>
+                    <a:blip r:embed="rId20"/>
+                    <a:stretch>
+                      <a:fillRect/>
+                    </a:stretch>
+                  </pic:blipFill>
+                  <pic:spPr>
+                    <a:xfrm>
+                      <a:off x="0" y="0"/>
+                      <a:ext cx="2524477" cy="2191056"/>
+                    </a:xfrm>
+                    <a:prstGeom prst="rect">
+                      <a:avLst/>
+                    </a:prstGeom>
+                  </pic:spPr>
+                </pic:pic>
+              </a:graphicData>
+            </a:graphic>
+          </wp:inline>
+        </w:drawing>
+      </w:r>
+    </w:p>
+    <w:p>
+      <w:pPr>
+        <w:jc w:val="center"/>
+      </w:pPr>
+      <w:r>
         <w:t xml:space="preserve">Figure </w:t>
       </w:r>
       <w:r>
-        <w:rPr>
-          <w:color w:val="000000" w:themeColor="text1"/>
-          <w:sz w:val="24"/>
-          <w:szCs w:val="24"/>
-        </w:rPr>
-        <w:fldChar w:fldCharType="begin"/>
-      </w:r>
-      <w:r>
-        <w:rPr>
-          <w:color w:val="000000" w:themeColor="text1"/>
-          <w:sz w:val="24"/>
-          <w:szCs w:val="24"/>
-        </w:rPr>
-        <w:instrText xml:space="preserve"> SEQ Figure \* ARABIC </w:instrText>
-      </w:r>
-      <w:r>
-        <w:rPr>
-          <w:color w:val="000000" w:themeColor="text1"/>
-          <w:sz w:val="24"/>
-          <w:szCs w:val="24"/>
-        </w:rPr>
-        <w:fldChar w:fldCharType="separate"/>
-      </w:r>
+        <w:t>9</w:t>
+      </w:r>
+      <w:r>
+        <w:t>: Quick Action Buttons</w:t>
+      </w:r>
+    </w:p>
+    <w:p/>
+    <w:p>
+      <w:r>
+        <w:t xml:space="preserve">On Statistics, I added four labelled period buttons: 1 Week, 1 Month, 1 Year and All Time (Figure </w:t>
+      </w:r>
+      <w:r>
+        <w:t>10</w:t>
+      </w:r>
+      <w:r>
+        <w:t xml:space="preserve">). I want these to act as a simple way of changing the data shown in the chart. The Activities screen also has a Log Activity button, while Profile has an Edit Profile button. I used the wording of the task on each button so users can understand what will happen when they </w:t>
+      </w:r>
+      <w:r>
+        <w:t>click</w:t>
+      </w:r>
+      <w:r>
+        <w:t xml:space="preserve"> it.</w:t>
+      </w:r>
+    </w:p>
+    <w:p/>
+    <w:p>
+      <w:pPr>
+        <w:jc w:val="center"/>
+      </w:pPr>
       <w:r>
         <w:rPr>
           <w:noProof/>
-          <w:color w:val="000000" w:themeColor="text1"/>
-          <w:sz w:val="24"/>
-          <w:szCs w:val="24"/>
-        </w:rPr>
+        </w:rPr>
+        <w:drawing>
+          <wp:inline distT="0" distB="0" distL="0" distR="0" wp14:anchorId="65DBFCE1" wp14:editId="43813E19">
+            <wp:extent cx="2143424" cy="409632"/>
+            <wp:effectExtent l="0" t="0" r="9525" b="9525"/>
+            <wp:docPr id="2139289982" name="Picture 1"/>
+            <wp:cNvGraphicFramePr>
+              <a:graphicFrameLocks xmlns:a="http://schemas.openxmlformats.org/drawingml/2006/main" noChangeAspect="1"/>
+            </wp:cNvGraphicFramePr>
+            <a:graphic xmlns:a="http://schemas.openxmlformats.org/drawingml/2006/main">
+              <a:graphicData uri="http://schemas.openxmlformats.org/drawingml/2006/picture">
+                <pic:pic xmlns:pic="http://schemas.openxmlformats.org/drawingml/2006/picture">
+                  <pic:nvPicPr>
+                    <pic:cNvPr id="2139289982" name=""/>
+                    <pic:cNvPicPr/>
+                  </pic:nvPicPr>
+                  <pic:blipFill>
+                    <a:blip r:embed="rId21"/>
+                    <a:stretch>
+                      <a:fillRect/>
+                    </a:stretch>
+                  </pic:blipFill>
+                  <pic:spPr>
+                    <a:xfrm>
+                      <a:off x="0" y="0"/>
+                      <a:ext cx="2143424" cy="409632"/>
+                    </a:xfrm>
+                    <a:prstGeom prst="rect">
+                      <a:avLst/>
+                    </a:prstGeom>
+                  </pic:spPr>
+                </pic:pic>
+              </a:graphicData>
+            </a:graphic>
+          </wp:inline>
+        </w:drawing>
+      </w:r>
+    </w:p>
+    <w:p>
+      <w:pPr>
+        <w:jc w:val="center"/>
+      </w:pPr>
+      <w:r>
+        <w:t xml:space="preserve">Figure </w:t>
+      </w:r>
+      <w:r>
+        <w:t>10</w:t>
+      </w:r>
+      <w:r>
+        <w:t>: Report Period Controls</w:t>
+      </w:r>
+    </w:p>
+    <w:p/>
+    <w:p>
+      <w:pPr>
+        <w:rPr>
+          <w:lang w:val="en-IE"/>
+        </w:rPr>
+      </w:pPr>
+      <w:r>
+        <w:rPr>
+          <w:lang w:val="en-IE"/>
+        </w:rPr>
+        <w:t xml:space="preserve">I used </w:t>
+      </w:r>
+      <w:r>
+        <w:rPr>
+          <w:lang w:val="en-IE"/>
+        </w:rPr>
+        <w:t>s</w:t>
+      </w:r>
+      <w:r>
+        <w:rPr>
+          <w:lang w:val="en-IE"/>
+        </w:rPr>
+        <w:t xml:space="preserve">witch controls in Settings for activity reminders, sleep reminders and goal notifications, </w:t>
+      </w:r>
+      <w:r>
+        <w:rPr>
+          <w:lang w:val="en-IE"/>
+        </w:rPr>
+        <w:t xml:space="preserve">so </w:t>
+      </w:r>
+      <w:r>
+        <w:rPr>
+          <w:lang w:val="en-IE"/>
+        </w:rPr>
+        <w:t xml:space="preserve">each option can be turned on or off. For measurement units, I chose Picker controls instead of text boxes, letting users choose between kilometres and miles, or kilograms and pounds, without typing their own values. This reduces input mistakes and keeps the layout compact. </w:t>
+      </w:r>
+    </w:p>
+    <w:p>
+      <w:pPr>
+        <w:rPr>
+          <w:lang w:val="en-IE"/>
+        </w:rPr>
+      </w:pPr>
+    </w:p>
+    <w:p>
+      <w:r>
+        <w:rPr>
+          <w:lang w:val="en-IE"/>
+        </w:rPr>
+        <w:t xml:space="preserve">When I add the backend, I will also need to validate entries and show feedback when a measurement or activity is saved. </w:t>
+      </w:r>
+      <w:r>
+        <w:rPr>
+          <w:lang w:val="en-IE"/>
+        </w:rPr>
+        <w:t xml:space="preserve">The current wireframe just shows the location of </w:t>
+      </w:r>
+      <w:r>
+        <w:rPr>
+          <w:lang w:val="en-IE"/>
+        </w:rPr>
+        <w:t>the features and interactions.</w:t>
+      </w:r>
+    </w:p>
+    <w:p>
+      <w:pPr>
+        <w:pStyle w:val="Heading2"/>
+      </w:pPr>
+      <w:r>
+        <w:t>1.5</w:t>
+      </w:r>
+      <w:r>
+        <w:tab/>
+        <w:t>Feedback Mechanisms and Data Visualisation</w:t>
+      </w:r>
+    </w:p>
+    <w:p/>
+    <w:p>
+      <w:r>
+        <w:t>I used progress bars and percentages on the Dashboard and Goals pages to provide quick visual feedback on targets such as steps, exercise and water intake. I displayed numerical values beside the bars so the user can see both the exact amount and how close they are to a goal. Figures 1</w:t>
+      </w:r>
+      <w:r>
         <w:t>1</w:t>
       </w:r>
       <w:r>
+        <w:t xml:space="preserve"> and 1</w:t>
+      </w:r>
+      <w:r>
+        <w:t>2</w:t>
+      </w:r>
+      <w:r>
+        <w:t xml:space="preserve"> show examples of these progress indicators. This follows the idea that an interface should make its current state visible to the user (Nielsen 1994).</w:t>
+      </w:r>
+    </w:p>
+    <w:p>
+      <w:r>
         <w:rPr>
           <w:noProof/>
-          <w:color w:val="000000" w:themeColor="text1"/>
-          <w:sz w:val="24"/>
-          <w:szCs w:val="24"/>
-        </w:rPr>
-        <w:fldChar w:fldCharType="end"/>
+        </w:rPr>
+        <w:drawing>
+          <wp:inline distT="0" distB="0" distL="0" distR="0" wp14:anchorId="08F47840" wp14:editId="25B5EEA4">
+            <wp:extent cx="2362530" cy="2143424"/>
+            <wp:effectExtent l="0" t="0" r="0" b="9525"/>
+            <wp:docPr id="263965891" name="Picture 1"/>
+            <wp:cNvGraphicFramePr>
+              <a:graphicFrameLocks xmlns:a="http://schemas.openxmlformats.org/drawingml/2006/main" noChangeAspect="1"/>
+            </wp:cNvGraphicFramePr>
+            <a:graphic xmlns:a="http://schemas.openxmlformats.org/drawingml/2006/main">
+              <a:graphicData uri="http://schemas.openxmlformats.org/drawingml/2006/picture">
+                <pic:pic xmlns:pic="http://schemas.openxmlformats.org/drawingml/2006/picture">
+                  <pic:nvPicPr>
+                    <pic:cNvPr id="263965891" name=""/>
+                    <pic:cNvPicPr/>
+                  </pic:nvPicPr>
+                  <pic:blipFill>
+                    <a:blip r:embed="rId22"/>
+                    <a:stretch>
+                      <a:fillRect/>
+                    </a:stretch>
+                  </pic:blipFill>
+                  <pic:spPr>
+                    <a:xfrm>
+                      <a:off x="0" y="0"/>
+                      <a:ext cx="2362530" cy="2143424"/>
+                    </a:xfrm>
+                    <a:prstGeom prst="rect">
+                      <a:avLst/>
+                    </a:prstGeom>
+                  </pic:spPr>
+                </pic:pic>
+              </a:graphicData>
+            </a:graphic>
+          </wp:inline>
+        </w:drawing>
+      </w:r>
+      <w:r>
+        <w:t xml:space="preserve">                        </w:t>
       </w:r>
       <w:r>
         <w:rPr>
           <w:noProof/>
-          <w:color w:val="000000" w:themeColor="text1"/>
-          <w:sz w:val="24"/>
-          <w:szCs w:val="24"/>
-        </w:rPr>
-        <w:t xml:space="preserve">: </w:t>
-      </w:r>
-      <w:r>
-        <w:rPr>
-          <w:color w:val="000000" w:themeColor="text1"/>
-          <w:sz w:val="24"/>
-          <w:szCs w:val="24"/>
-        </w:rPr>
-        <w:t xml:space="preserve">An exemplar </w:t>
+        </w:rPr>
+        <w:drawing>
+          <wp:inline distT="0" distB="0" distL="0" distR="0" wp14:anchorId="4EA367BE" wp14:editId="6DCFC6C7">
+            <wp:extent cx="2438740" cy="4525006"/>
+            <wp:effectExtent l="0" t="0" r="0" b="9525"/>
+            <wp:docPr id="985109107" name="Picture 1"/>
+            <wp:cNvGraphicFramePr>
+              <a:graphicFrameLocks xmlns:a="http://schemas.openxmlformats.org/drawingml/2006/main" noChangeAspect="1"/>
+            </wp:cNvGraphicFramePr>
+            <a:graphic xmlns:a="http://schemas.openxmlformats.org/drawingml/2006/main">
+              <a:graphicData uri="http://schemas.openxmlformats.org/drawingml/2006/picture">
+                <pic:pic xmlns:pic="http://schemas.openxmlformats.org/drawingml/2006/picture">
+                  <pic:nvPicPr>
+                    <pic:cNvPr id="985109107" name=""/>
+                    <pic:cNvPicPr/>
+                  </pic:nvPicPr>
+                  <pic:blipFill>
+                    <a:blip r:embed="rId23"/>
+                    <a:stretch>
+                      <a:fillRect/>
+                    </a:stretch>
+                  </pic:blipFill>
+                  <pic:spPr>
+                    <a:xfrm>
+                      <a:off x="0" y="0"/>
+                      <a:ext cx="2438740" cy="4525006"/>
+                    </a:xfrm>
+                    <a:prstGeom prst="rect">
+                      <a:avLst/>
+                    </a:prstGeom>
+                  </pic:spPr>
+                </pic:pic>
+              </a:graphicData>
+            </a:graphic>
+          </wp:inline>
+        </w:drawing>
+      </w:r>
+    </w:p>
+    <w:p>
+      <w:r>
+        <w:t xml:space="preserve">Figure </w:t>
+      </w:r>
+      <w:r>
+        <w:t>11</w:t>
+      </w:r>
+      <w:r>
+        <w:t>: Progress bars in dashboard</w:t>
+      </w:r>
+      <w:r>
+        <w:tab/>
+        <w:t xml:space="preserve">                  Figure </w:t>
+      </w:r>
+      <w:r>
+        <w:t>11</w:t>
+      </w:r>
+      <w:r>
+        <w:t>: Progress bars in goals</w:t>
+      </w:r>
+    </w:p>
+    <w:p/>
+    <w:p/>
+    <w:p/>
+    <w:p>
+      <w:pPr>
+        <w:rPr>
+          <w:lang w:val="en-IE"/>
+        </w:rPr>
+      </w:pPr>
+      <w:r>
+        <w:rPr>
+          <w:lang w:val="en-IE"/>
+        </w:rPr>
+        <w:t>The Statistics page uses a bar chart for daily step counts, making it easier to compare the days of the week than reading a list of numbers. I placed day labels underneath and summary cards below the chart to show totals and averages. On the Goals page, the weekly activity bars show how close each day came to the step target, giving users another way of checking their progress.</w:t>
+      </w:r>
+    </w:p>
+    <w:p>
+      <w:pPr>
+        <w:rPr>
+          <w:lang w:val="en-IE"/>
+        </w:rPr>
+      </w:pPr>
+    </w:p>
+    <w:p>
+      <w:r>
+        <w:t>The values shown in the current wireframe are examples to demonstrate the design rather than information recorded by a real user. Once the app is connected to stored data, I plan to update the charts and progress indicators automatically and add clear confirmation or error messages after users save activities, goals or measurements.</w:t>
+      </w:r>
+    </w:p>
+    <w:p/>
+    <w:p>
+      <w:pPr>
+        <w:pStyle w:val="Heading2"/>
+      </w:pPr>
+      <w:r>
+        <w:t xml:space="preserve">1.6 </w:t>
+      </w:r>
+      <w:r>
+        <w:tab/>
+        <w:t>Colour, Icons, Fonts and Images</w:t>
+      </w:r>
+    </w:p>
+    <w:p/>
+    <w:p>
+      <w:pPr>
+        <w:rPr>
+          <w:lang w:val="en-IE"/>
+        </w:rPr>
+      </w:pPr>
+      <w:r>
+        <w:rPr>
+          <w:lang w:val="en-IE"/>
+        </w:rPr>
+        <w:t xml:space="preserve">I chose a light teal and lavender colour scheme to give </w:t>
+      </w:r>
+      <w:r>
+        <w:rPr>
+          <w:lang w:val="en-IE"/>
+        </w:rPr>
+        <w:t>Health Track</w:t>
+      </w:r>
+      <w:r>
+        <w:rPr>
+          <w:lang w:val="en-IE"/>
+        </w:rPr>
+        <w:t xml:space="preserve"> a calm, consistent appearance. I mainly used the pale colours for card backgrounds and larger surfaces, then used stronger teal or purple for titles, active controls and progress. </w:t>
+      </w:r>
+      <w:r>
+        <w:rPr>
+          <w:lang w:val="en-IE"/>
+        </w:rPr>
+        <w:t>Keeping most content areas,</w:t>
+      </w:r>
+      <w:r>
+        <w:rPr>
+          <w:lang w:val="en-IE"/>
+        </w:rPr>
+        <w:t xml:space="preserve"> </w:t>
+      </w:r>
+      <w:r>
+        <w:rPr>
+          <w:lang w:val="en-IE"/>
+        </w:rPr>
+        <w:t>light helps the health information stand out instead of making the screen feel too busy.</w:t>
+      </w:r>
+    </w:p>
+    <w:p>
+      <w:pPr>
+        <w:rPr>
+          <w:lang w:val="en-IE"/>
+        </w:rPr>
+      </w:pPr>
+      <w:r>
+        <w:rPr>
+          <w:lang w:val="en-IE"/>
+        </w:rPr>
+        <w:t xml:space="preserve">I used icons that relate to the information shown, such as footprints for steps, a moon for sleep, a heart for heart rate and activity images for the exercise history. These icons make sections easier to recognise, but I kept text labels beside </w:t>
+      </w:r>
+      <w:r>
+        <w:rPr>
+          <w:lang w:val="en-IE"/>
+        </w:rPr>
+        <w:t>them,</w:t>
+      </w:r>
+      <w:r>
+        <w:rPr>
+          <w:lang w:val="en-IE"/>
+        </w:rPr>
+        <w:t xml:space="preserve"> so the meaning does not depend on the image alone. I also used larger bold fonts for measurements and section headings, with smaller text for explanations and units, to keep the same hierarchy across pages.</w:t>
+      </w:r>
+    </w:p>
+    <w:p>
+      <w:pPr>
+        <w:rPr>
+          <w:lang w:val="en-IE"/>
+        </w:rPr>
+      </w:pPr>
+      <w:r>
+        <w:rPr>
+          <w:lang w:val="en-IE"/>
+        </w:rPr>
+        <w:t xml:space="preserve">All icons were obtained from </w:t>
+      </w:r>
+      <w:hyperlink r:id="rId24" w:history="1">
+        <w:r>
+          <w:rPr>
+            <w:rStyle w:val="Hyperlink"/>
+            <w:lang w:val="en-IE"/>
+          </w:rPr>
+          <w:t>icons</w:t>
+        </w:r>
+        <w:r>
+          <w:rPr>
+            <w:rStyle w:val="Hyperlink"/>
+            <w:lang w:val="en-IE"/>
+          </w:rPr>
+          <w:t>8</w:t>
+        </w:r>
+        <w:r>
+          <w:rPr>
+            <w:rStyle w:val="Hyperlink"/>
+            <w:lang w:val="en-IE"/>
+          </w:rPr>
+          <w:t>.com</w:t>
+        </w:r>
+      </w:hyperlink>
+      <w:r>
+        <w:rPr>
+          <w:lang w:val="en-IE"/>
+        </w:rPr>
+        <w:t>.</w:t>
+      </w:r>
+    </w:p>
+    <w:p>
+      <w:pPr>
+        <w:jc w:val="center"/>
+        <w:rPr>
+          <w:lang w:val="en-IE"/>
+        </w:rPr>
+      </w:pPr>
+      <w:r>
+        <w:rPr>
+          <w:lang w:val="en-IE"/>
+        </w:rPr>
+        <w:drawing>
+          <wp:inline distT="0" distB="0" distL="0" distR="0" wp14:anchorId="6AD4B74D" wp14:editId="4863AF36">
+            <wp:extent cx="4607170" cy="2591980"/>
+            <wp:effectExtent l="0" t="0" r="3175" b="0"/>
+            <wp:docPr id="2139041753" name="Picture 2"/>
+            <wp:cNvGraphicFramePr>
+              <a:graphicFrameLocks xmlns:a="http://schemas.openxmlformats.org/drawingml/2006/main" noChangeAspect="1"/>
+            </wp:cNvGraphicFramePr>
+            <a:graphic xmlns:a="http://schemas.openxmlformats.org/drawingml/2006/main">
+              <a:graphicData uri="http://schemas.openxmlformats.org/drawingml/2006/picture">
+                <pic:pic xmlns:pic="http://schemas.openxmlformats.org/drawingml/2006/picture">
+                  <pic:nvPicPr>
+                    <pic:cNvPr id="0" name="Picture 6"/>
+                    <pic:cNvPicPr>
+                      <a:picLocks noChangeAspect="1" noChangeArrowheads="1"/>
+                    </pic:cNvPicPr>
+                  </pic:nvPicPr>
+                  <pic:blipFill>
+                    <a:blip r:embed="rId25" cstate="print">
+                      <a:extLst>
+                        <a:ext uri="{28A0092B-C50C-407E-A947-70E740481C1C}">
+                          <a14:useLocalDpi xmlns:a14="http://schemas.microsoft.com/office/drawing/2010/main" val="0"/>
+                        </a:ext>
+                      </a:extLst>
+                    </a:blip>
+                    <a:srcRect/>
+                    <a:stretch>
+                      <a:fillRect/>
+                    </a:stretch>
+                  </pic:blipFill>
+                  <pic:spPr bwMode="auto">
+                    <a:xfrm>
+                      <a:off x="0" y="0"/>
+                      <a:ext cx="4637744" cy="2609181"/>
+                    </a:xfrm>
+                    <a:prstGeom prst="rect">
+                      <a:avLst/>
+                    </a:prstGeom>
+                    <a:noFill/>
+                    <a:ln>
+                      <a:noFill/>
+                    </a:ln>
+                  </pic:spPr>
+                </pic:pic>
+              </a:graphicData>
+            </a:graphic>
+          </wp:inline>
+        </w:drawing>
+      </w:r>
+    </w:p>
+    <w:p>
+      <w:pPr>
+        <w:jc w:val="center"/>
+        <w:rPr>
+          <w:lang w:val="en-IE"/>
+        </w:rPr>
+      </w:pPr>
+      <w:r>
+        <w:rPr>
+          <w:lang w:val="en-IE"/>
+        </w:rPr>
+        <w:t>Figure 12: Teal Colour Palett</w:t>
+      </w:r>
+      <w:r>
+        <w:rPr>
+          <w:lang w:val="en-IE"/>
+        </w:rPr>
+        <w:t>e</w:t>
+      </w:r>
+    </w:p>
+    <w:p>
+      <w:pPr>
+        <w:jc w:val="center"/>
+        <w:rPr>
+          <w:lang w:val="en-IE"/>
+        </w:rPr>
+      </w:pPr>
+    </w:p>
+    <w:p>
+      <w:pPr>
+        <w:jc w:val="center"/>
+        <w:rPr>
+          <w:lang w:val="en-IE"/>
+        </w:rPr>
+      </w:pPr>
+      <w:r>
+        <w:rPr>
+          <w:noProof/>
+          <w:lang w:val="en-IE"/>
+        </w:rPr>
+        <w:drawing>
+          <wp:inline distT="0" distB="0" distL="0" distR="0" wp14:anchorId="68218BA7" wp14:editId="419273CB">
+            <wp:extent cx="633095" cy="633095"/>
+            <wp:effectExtent l="0" t="0" r="0" b="0"/>
+            <wp:docPr id="891331953" name="Picture 3"/>
+            <wp:cNvGraphicFramePr>
+              <a:graphicFrameLocks xmlns:a="http://schemas.openxmlformats.org/drawingml/2006/main" noChangeAspect="1"/>
+            </wp:cNvGraphicFramePr>
+            <a:graphic xmlns:a="http://schemas.openxmlformats.org/drawingml/2006/main">
+              <a:graphicData uri="http://schemas.openxmlformats.org/drawingml/2006/picture">
+                <pic:pic xmlns:pic="http://schemas.openxmlformats.org/drawingml/2006/picture">
+                  <pic:nvPicPr>
+                    <pic:cNvPr id="0" name="Picture 8"/>
+                    <pic:cNvPicPr>
+                      <a:picLocks noChangeAspect="1" noChangeArrowheads="1"/>
+                    </pic:cNvPicPr>
+                  </pic:nvPicPr>
+                  <pic:blipFill>
+                    <a:blip r:embed="rId26">
+                      <a:extLst>
+                        <a:ext uri="{28A0092B-C50C-407E-A947-70E740481C1C}">
+                          <a14:useLocalDpi xmlns:a14="http://schemas.microsoft.com/office/drawing/2010/main" val="0"/>
+                        </a:ext>
+                      </a:extLst>
+                    </a:blip>
+                    <a:srcRect/>
+                    <a:stretch>
+                      <a:fillRect/>
+                    </a:stretch>
+                  </pic:blipFill>
+                  <pic:spPr bwMode="auto">
+                    <a:xfrm>
+                      <a:off x="0" y="0"/>
+                      <a:ext cx="633095" cy="633095"/>
+                    </a:xfrm>
+                    <a:prstGeom prst="rect">
+                      <a:avLst/>
+                    </a:prstGeom>
+                    <a:noFill/>
+                    <a:ln>
+                      <a:noFill/>
+                    </a:ln>
+                  </pic:spPr>
+                </pic:pic>
+              </a:graphicData>
+            </a:graphic>
+          </wp:inline>
+        </w:drawing>
+      </w:r>
+      <w:r>
+        <w:rPr>
+          <w:noProof/>
+          <w:lang w:val="en-IE"/>
+        </w:rPr>
+        <w:drawing>
+          <wp:inline distT="0" distB="0" distL="0" distR="0" wp14:anchorId="1DC1CD30" wp14:editId="5172BE63">
+            <wp:extent cx="633095" cy="633095"/>
+            <wp:effectExtent l="0" t="0" r="0" b="0"/>
+            <wp:docPr id="1684638594" name="Picture 4"/>
+            <wp:cNvGraphicFramePr>
+              <a:graphicFrameLocks xmlns:a="http://schemas.openxmlformats.org/drawingml/2006/main" noChangeAspect="1"/>
+            </wp:cNvGraphicFramePr>
+            <a:graphic xmlns:a="http://schemas.openxmlformats.org/drawingml/2006/main">
+              <a:graphicData uri="http://schemas.openxmlformats.org/drawingml/2006/picture">
+                <pic:pic xmlns:pic="http://schemas.openxmlformats.org/drawingml/2006/picture">
+                  <pic:nvPicPr>
+                    <pic:cNvPr id="0" name="Picture 9"/>
+                    <pic:cNvPicPr>
+                      <a:picLocks noChangeAspect="1" noChangeArrowheads="1"/>
+                    </pic:cNvPicPr>
+                  </pic:nvPicPr>
+                  <pic:blipFill>
+                    <a:blip r:embed="rId27">
+                      <a:extLst>
+                        <a:ext uri="{28A0092B-C50C-407E-A947-70E740481C1C}">
+                          <a14:useLocalDpi xmlns:a14="http://schemas.microsoft.com/office/drawing/2010/main" val="0"/>
+                        </a:ext>
+                      </a:extLst>
+                    </a:blip>
+                    <a:srcRect/>
+                    <a:stretch>
+                      <a:fillRect/>
+                    </a:stretch>
+                  </pic:blipFill>
+                  <pic:spPr bwMode="auto">
+                    <a:xfrm>
+                      <a:off x="0" y="0"/>
+                      <a:ext cx="633095" cy="633095"/>
+                    </a:xfrm>
+                    <a:prstGeom prst="rect">
+                      <a:avLst/>
+                    </a:prstGeom>
+                    <a:noFill/>
+                    <a:ln>
+                      <a:noFill/>
+                    </a:ln>
+                  </pic:spPr>
+                </pic:pic>
+              </a:graphicData>
+            </a:graphic>
+          </wp:inline>
+        </w:drawing>
+      </w:r>
+      <w:r>
+        <w:rPr>
+          <w:noProof/>
+          <w:lang w:val="en-IE"/>
+        </w:rPr>
+        <w:drawing>
+          <wp:inline distT="0" distB="0" distL="0" distR="0" wp14:anchorId="5690B68A" wp14:editId="4D2A762F">
+            <wp:extent cx="855980" cy="855980"/>
+            <wp:effectExtent l="0" t="0" r="1270" b="1270"/>
+            <wp:docPr id="141088283" name="Picture 5"/>
+            <wp:cNvGraphicFramePr>
+              <a:graphicFrameLocks xmlns:a="http://schemas.openxmlformats.org/drawingml/2006/main" noChangeAspect="1"/>
+            </wp:cNvGraphicFramePr>
+            <a:graphic xmlns:a="http://schemas.openxmlformats.org/drawingml/2006/main">
+              <a:graphicData uri="http://schemas.openxmlformats.org/drawingml/2006/picture">
+                <pic:pic xmlns:pic="http://schemas.openxmlformats.org/drawingml/2006/picture">
+                  <pic:nvPicPr>
+                    <pic:cNvPr id="0" name="Picture 10"/>
+                    <pic:cNvPicPr>
+                      <a:picLocks noChangeAspect="1" noChangeArrowheads="1"/>
+                    </pic:cNvPicPr>
+                  </pic:nvPicPr>
+                  <pic:blipFill>
+                    <a:blip r:embed="rId28">
+                      <a:extLst>
+                        <a:ext uri="{28A0092B-C50C-407E-A947-70E740481C1C}">
+                          <a14:useLocalDpi xmlns:a14="http://schemas.microsoft.com/office/drawing/2010/main" val="0"/>
+                        </a:ext>
+                      </a:extLst>
+                    </a:blip>
+                    <a:srcRect/>
+                    <a:stretch>
+                      <a:fillRect/>
+                    </a:stretch>
+                  </pic:blipFill>
+                  <pic:spPr bwMode="auto">
+                    <a:xfrm>
+                      <a:off x="0" y="0"/>
+                      <a:ext cx="855980" cy="855980"/>
+                    </a:xfrm>
+                    <a:prstGeom prst="rect">
+                      <a:avLst/>
+                    </a:prstGeom>
+                    <a:noFill/>
+                    <a:ln>
+                      <a:noFill/>
+                    </a:ln>
+                  </pic:spPr>
+                </pic:pic>
+              </a:graphicData>
+            </a:graphic>
+          </wp:inline>
+        </w:drawing>
+      </w:r>
+      <w:r>
+        <w:rPr>
+          <w:noProof/>
+          <w:lang w:val="en-IE"/>
+        </w:rPr>
+        <w:drawing>
+          <wp:inline distT="0" distB="0" distL="0" distR="0" wp14:anchorId="640CB5DE" wp14:editId="2AC1CD4D">
+            <wp:extent cx="633095" cy="633095"/>
+            <wp:effectExtent l="0" t="0" r="0" b="0"/>
+            <wp:docPr id="543044732" name="Picture 6"/>
+            <wp:cNvGraphicFramePr>
+              <a:graphicFrameLocks xmlns:a="http://schemas.openxmlformats.org/drawingml/2006/main" noChangeAspect="1"/>
+            </wp:cNvGraphicFramePr>
+            <a:graphic xmlns:a="http://schemas.openxmlformats.org/drawingml/2006/main">
+              <a:graphicData uri="http://schemas.openxmlformats.org/drawingml/2006/picture">
+                <pic:pic xmlns:pic="http://schemas.openxmlformats.org/drawingml/2006/picture">
+                  <pic:nvPicPr>
+                    <pic:cNvPr id="0" name="Picture 11"/>
+                    <pic:cNvPicPr>
+                      <a:picLocks noChangeAspect="1" noChangeArrowheads="1"/>
+                    </pic:cNvPicPr>
+                  </pic:nvPicPr>
+                  <pic:blipFill>
+                    <a:blip r:embed="rId29">
+                      <a:extLst>
+                        <a:ext uri="{28A0092B-C50C-407E-A947-70E740481C1C}">
+                          <a14:useLocalDpi xmlns:a14="http://schemas.microsoft.com/office/drawing/2010/main" val="0"/>
+                        </a:ext>
+                      </a:extLst>
+                    </a:blip>
+                    <a:srcRect/>
+                    <a:stretch>
+                      <a:fillRect/>
+                    </a:stretch>
+                  </pic:blipFill>
+                  <pic:spPr bwMode="auto">
+                    <a:xfrm>
+                      <a:off x="0" y="0"/>
+                      <a:ext cx="633095" cy="633095"/>
+                    </a:xfrm>
+                    <a:prstGeom prst="rect">
+                      <a:avLst/>
+                    </a:prstGeom>
+                    <a:noFill/>
+                    <a:ln>
+                      <a:noFill/>
+                    </a:ln>
+                  </pic:spPr>
+                </pic:pic>
+              </a:graphicData>
+            </a:graphic>
+          </wp:inline>
+        </w:drawing>
+      </w:r>
+      <w:r>
+        <w:rPr>
+          <w:noProof/>
+          <w:lang w:val="en-IE"/>
+        </w:rPr>
+        <w:drawing>
+          <wp:inline distT="0" distB="0" distL="0" distR="0" wp14:anchorId="10185BA0" wp14:editId="5C038E34">
+            <wp:extent cx="609600" cy="609600"/>
+            <wp:effectExtent l="0" t="0" r="0" b="0"/>
+            <wp:docPr id="1418270455" name="Picture 7"/>
+            <wp:cNvGraphicFramePr>
+              <a:graphicFrameLocks xmlns:a="http://schemas.openxmlformats.org/drawingml/2006/main" noChangeAspect="1"/>
+            </wp:cNvGraphicFramePr>
+            <a:graphic xmlns:a="http://schemas.openxmlformats.org/drawingml/2006/main">
+              <a:graphicData uri="http://schemas.openxmlformats.org/drawingml/2006/picture">
+                <pic:pic xmlns:pic="http://schemas.openxmlformats.org/drawingml/2006/picture">
+                  <pic:nvPicPr>
+                    <pic:cNvPr id="0" name="Picture 12"/>
+                    <pic:cNvPicPr>
+                      <a:picLocks noChangeAspect="1" noChangeArrowheads="1"/>
+                    </pic:cNvPicPr>
+                  </pic:nvPicPr>
+                  <pic:blipFill>
+                    <a:blip r:embed="rId30">
+                      <a:extLst>
+                        <a:ext uri="{28A0092B-C50C-407E-A947-70E740481C1C}">
+                          <a14:useLocalDpi xmlns:a14="http://schemas.microsoft.com/office/drawing/2010/main" val="0"/>
+                        </a:ext>
+                      </a:extLst>
+                    </a:blip>
+                    <a:srcRect/>
+                    <a:stretch>
+                      <a:fillRect/>
+                    </a:stretch>
+                  </pic:blipFill>
+                  <pic:spPr bwMode="auto">
+                    <a:xfrm>
+                      <a:off x="0" y="0"/>
+                      <a:ext cx="609600" cy="609600"/>
+                    </a:xfrm>
+                    <a:prstGeom prst="rect">
+                      <a:avLst/>
+                    </a:prstGeom>
+                    <a:noFill/>
+                    <a:ln>
+                      <a:noFill/>
+                    </a:ln>
+                  </pic:spPr>
+                </pic:pic>
+              </a:graphicData>
+            </a:graphic>
+          </wp:inline>
+        </w:drawing>
+      </w:r>
+      <w:r>
+        <w:rPr>
+          <w:noProof/>
+          <w:lang w:val="en-IE"/>
+        </w:rPr>
+        <w:drawing>
+          <wp:inline distT="0" distB="0" distL="0" distR="0" wp14:anchorId="7FCB6034" wp14:editId="071AD71C">
+            <wp:extent cx="633095" cy="633095"/>
+            <wp:effectExtent l="0" t="0" r="0" b="0"/>
+            <wp:docPr id="33304711" name="Picture 8"/>
+            <wp:cNvGraphicFramePr>
+              <a:graphicFrameLocks xmlns:a="http://schemas.openxmlformats.org/drawingml/2006/main" noChangeAspect="1"/>
+            </wp:cNvGraphicFramePr>
+            <a:graphic xmlns:a="http://schemas.openxmlformats.org/drawingml/2006/main">
+              <a:graphicData uri="http://schemas.openxmlformats.org/drawingml/2006/picture">
+                <pic:pic xmlns:pic="http://schemas.openxmlformats.org/drawingml/2006/picture">
+                  <pic:nvPicPr>
+                    <pic:cNvPr id="0" name="Picture 13"/>
+                    <pic:cNvPicPr>
+                      <a:picLocks noChangeAspect="1" noChangeArrowheads="1"/>
+                    </pic:cNvPicPr>
+                  </pic:nvPicPr>
+                  <pic:blipFill>
+                    <a:blip r:embed="rId31">
+                      <a:extLst>
+                        <a:ext uri="{28A0092B-C50C-407E-A947-70E740481C1C}">
+                          <a14:useLocalDpi xmlns:a14="http://schemas.microsoft.com/office/drawing/2010/main" val="0"/>
+                        </a:ext>
+                      </a:extLst>
+                    </a:blip>
+                    <a:srcRect/>
+                    <a:stretch>
+                      <a:fillRect/>
+                    </a:stretch>
+                  </pic:blipFill>
+                  <pic:spPr bwMode="auto">
+                    <a:xfrm>
+                      <a:off x="0" y="0"/>
+                      <a:ext cx="633095" cy="633095"/>
+                    </a:xfrm>
+                    <a:prstGeom prst="rect">
+                      <a:avLst/>
+                    </a:prstGeom>
+                    <a:noFill/>
+                    <a:ln>
+                      <a:noFill/>
+                    </a:ln>
+                  </pic:spPr>
+                </pic:pic>
+              </a:graphicData>
+            </a:graphic>
+          </wp:inline>
+        </w:drawing>
+      </w:r>
+      <w:r>
+        <w:rPr>
+          <w:noProof/>
+          <w:lang w:val="en-IE"/>
+        </w:rPr>
+        <w:drawing>
+          <wp:inline distT="0" distB="0" distL="0" distR="0" wp14:anchorId="39DCF47A" wp14:editId="04E1BC52">
+            <wp:extent cx="304800" cy="304800"/>
+            <wp:effectExtent l="0" t="0" r="0" b="0"/>
+            <wp:docPr id="264129929" name="Picture 9"/>
+            <wp:cNvGraphicFramePr>
+              <a:graphicFrameLocks xmlns:a="http://schemas.openxmlformats.org/drawingml/2006/main" noChangeAspect="1"/>
+            </wp:cNvGraphicFramePr>
+            <a:graphic xmlns:a="http://schemas.openxmlformats.org/drawingml/2006/main">
+              <a:graphicData uri="http://schemas.openxmlformats.org/drawingml/2006/picture">
+                <pic:pic xmlns:pic="http://schemas.openxmlformats.org/drawingml/2006/picture">
+                  <pic:nvPicPr>
+                    <pic:cNvPr id="0" name="Picture 14"/>
+                    <pic:cNvPicPr>
+                      <a:picLocks noChangeAspect="1" noChangeArrowheads="1"/>
+                    </pic:cNvPicPr>
+                  </pic:nvPicPr>
+                  <pic:blipFill>
+                    <a:blip r:embed="rId32">
+                      <a:extLst>
+                        <a:ext uri="{28A0092B-C50C-407E-A947-70E740481C1C}">
+                          <a14:useLocalDpi xmlns:a14="http://schemas.microsoft.com/office/drawing/2010/main" val="0"/>
+                        </a:ext>
+                      </a:extLst>
+                    </a:blip>
+                    <a:srcRect/>
+                    <a:stretch>
+                      <a:fillRect/>
+                    </a:stretch>
+                  </pic:blipFill>
+                  <pic:spPr bwMode="auto">
+                    <a:xfrm>
+                      <a:off x="0" y="0"/>
+                      <a:ext cx="304800" cy="304800"/>
+                    </a:xfrm>
+                    <a:prstGeom prst="rect">
+                      <a:avLst/>
+                    </a:prstGeom>
+                    <a:noFill/>
+                    <a:ln>
+                      <a:noFill/>
+                    </a:ln>
+                  </pic:spPr>
+                </pic:pic>
+              </a:graphicData>
+            </a:graphic>
+          </wp:inline>
+        </w:drawing>
+      </w:r>
+      <w:r>
+        <w:rPr>
+          <w:noProof/>
+          <w:lang w:val="en-IE"/>
+        </w:rPr>
+        <w:drawing>
+          <wp:inline distT="0" distB="0" distL="0" distR="0" wp14:anchorId="0AE92D9F" wp14:editId="28405EAC">
+            <wp:extent cx="609600" cy="609600"/>
+            <wp:effectExtent l="0" t="0" r="0" b="0"/>
+            <wp:docPr id="703461047" name="Picture 10"/>
+            <wp:cNvGraphicFramePr>
+              <a:graphicFrameLocks xmlns:a="http://schemas.openxmlformats.org/drawingml/2006/main" noChangeAspect="1"/>
+            </wp:cNvGraphicFramePr>
+            <a:graphic xmlns:a="http://schemas.openxmlformats.org/drawingml/2006/main">
+              <a:graphicData uri="http://schemas.openxmlformats.org/drawingml/2006/picture">
+                <pic:pic xmlns:pic="http://schemas.openxmlformats.org/drawingml/2006/picture">
+                  <pic:nvPicPr>
+                    <pic:cNvPr id="0" name="Picture 15"/>
+                    <pic:cNvPicPr>
+                      <a:picLocks noChangeAspect="1" noChangeArrowheads="1"/>
+                    </pic:cNvPicPr>
+                  </pic:nvPicPr>
+                  <pic:blipFill>
+                    <a:blip r:embed="rId33">
+                      <a:extLst>
+                        <a:ext uri="{28A0092B-C50C-407E-A947-70E740481C1C}">
+                          <a14:useLocalDpi xmlns:a14="http://schemas.microsoft.com/office/drawing/2010/main" val="0"/>
+                        </a:ext>
+                      </a:extLst>
+                    </a:blip>
+                    <a:srcRect/>
+                    <a:stretch>
+                      <a:fillRect/>
+                    </a:stretch>
+                  </pic:blipFill>
+                  <pic:spPr bwMode="auto">
+                    <a:xfrm>
+                      <a:off x="0" y="0"/>
+                      <a:ext cx="609600" cy="609600"/>
+                    </a:xfrm>
+                    <a:prstGeom prst="rect">
+                      <a:avLst/>
+                    </a:prstGeom>
+                    <a:noFill/>
+                    <a:ln>
+                      <a:noFill/>
+                    </a:ln>
+                  </pic:spPr>
+                </pic:pic>
+              </a:graphicData>
+            </a:graphic>
+          </wp:inline>
+        </w:drawing>
+      </w:r>
+    </w:p>
+    <w:p>
+      <w:pPr>
+        <w:jc w:val="center"/>
+        <w:rPr>
+          <w:lang w:val="en-IE"/>
+        </w:rPr>
+      </w:pPr>
+      <w:r>
+        <w:rPr>
+          <w:lang w:val="en-IE"/>
+        </w:rPr>
+        <w:t>Figure 13: Examples of Icons used</w:t>
+      </w:r>
+    </w:p>
+    <w:p>
+      <w:pPr>
+        <w:jc w:val="center"/>
+        <w:rPr>
+          <w:lang w:val="en-IE"/>
+        </w:rPr>
+      </w:pPr>
+    </w:p>
+    <w:p>
+      <w:pPr>
+        <w:pStyle w:val="Heading1"/>
+        <w:numPr>
+          <w:ilvl w:val="0"/>
+          <w:numId w:val="4"/>
+        </w:numPr>
+      </w:pPr>
+      <w:bookmarkStart w:id="3" w:name="_Toc240468790"/>
+      <w:r>
+        <w:t>Application architecture</w:t>
+      </w:r>
+      <w:bookmarkEnd w:id="3"/>
+    </w:p>
+    <w:p>
+      <w:pPr>
+        <w:pStyle w:val="Heading2"/>
+        <w:numPr>
+          <w:ilvl w:val="1"/>
+          <w:numId w:val="4"/>
+        </w:numPr>
+      </w:pPr>
+      <w:r>
+        <w:t xml:space="preserve">Architectural </w:t>
+      </w:r>
+      <w:r>
+        <w:t>Pattern and Justification</w:t>
+      </w:r>
+    </w:p>
+    <w:p>
+      <w:r>
+        <w:t xml:space="preserve">I intend to develop </w:t>
+      </w:r>
+      <w:proofErr w:type="spellStart"/>
+      <w:r>
+        <w:t>HealthTrack</w:t>
+      </w:r>
+      <w:proofErr w:type="spellEnd"/>
+      <w:r>
+        <w:t xml:space="preserve"> using the Model -</w:t>
+      </w:r>
+    </w:p>
+    <w:p/>
+    <w:p>
+      <w:pPr>
+        <w:pStyle w:val="ListParagraph"/>
+        <w:ind w:left="360"/>
+      </w:pPr>
+    </w:p>
+    <w:p/>
+    <w:p/>
+    <w:p/>
+    <w:p/>
+    <w:p/>
+    <w:p/>
+    <w:p>
+      <w:r>
+        <w:t xml:space="preserve">Your architecture for the </w:t>
+      </w:r>
+      <w:proofErr w:type="spellStart"/>
+      <w:r>
+        <w:t>HealthTrack</w:t>
+      </w:r>
+      <w:proofErr w:type="spellEnd"/>
+      <w:r>
+        <w:t xml:space="preserve"> application should address, where applicable the following considerations</w:t>
+      </w:r>
+    </w:p>
+    <w:p>
+      <w:pPr>
+        <w:pStyle w:val="ListParagraph"/>
+        <w:numPr>
+          <w:ilvl w:val="0"/>
+          <w:numId w:val="11"/>
+        </w:numPr>
+      </w:pPr>
+      <w:r>
+        <w:t>Architectural pattern</w:t>
+      </w:r>
+      <w:r>
+        <w:t xml:space="preserve"> </w:t>
+      </w:r>
+      <w:proofErr w:type="gramStart"/>
+      <w:r>
+        <w:t xml:space="preserve">employed </w:t>
+      </w:r>
+      <w:r>
+        <w:t xml:space="preserve"> (</w:t>
+      </w:r>
+      <w:proofErr w:type="gramEnd"/>
+      <w:r>
+        <w:t>e.g.</w:t>
+      </w:r>
+      <w:r>
+        <w:t xml:space="preserve"> MVC, MCP, MVVM)</w:t>
+      </w:r>
+    </w:p>
+    <w:p>
+      <w:pPr>
+        <w:pStyle w:val="ListParagraph"/>
+        <w:numPr>
+          <w:ilvl w:val="0"/>
+          <w:numId w:val="11"/>
+        </w:numPr>
+      </w:pPr>
+      <w:r>
+        <w:t>Services</w:t>
+      </w:r>
+    </w:p>
+    <w:p>
+      <w:pPr>
+        <w:pStyle w:val="ListParagraph"/>
+        <w:numPr>
+          <w:ilvl w:val="0"/>
+          <w:numId w:val="11"/>
+        </w:numPr>
+      </w:pPr>
+      <w:r>
+        <w:t>Data access</w:t>
+      </w:r>
+    </w:p>
+    <w:p>
+      <w:pPr>
+        <w:pStyle w:val="ListParagraph"/>
+        <w:numPr>
+          <w:ilvl w:val="0"/>
+          <w:numId w:val="11"/>
+        </w:numPr>
+      </w:pPr>
+      <w:r>
+        <w:t>Navigation</w:t>
+      </w:r>
+    </w:p>
+    <w:p>
+      <w:pPr>
+        <w:pStyle w:val="ListParagraph"/>
+        <w:numPr>
+          <w:ilvl w:val="0"/>
+          <w:numId w:val="11"/>
+        </w:numPr>
+      </w:pPr>
+      <w:r>
+        <w:t>Application logic</w:t>
+      </w:r>
+    </w:p>
+    <w:p>
+      <w:r>
+        <w:t>This section of the report should explain and justify your approach to the following key questions:</w:t>
+      </w:r>
+    </w:p>
+    <w:p>
+      <w:pPr>
+        <w:pStyle w:val="ListParagraph"/>
+        <w:numPr>
+          <w:ilvl w:val="0"/>
+          <w:numId w:val="12"/>
+        </w:numPr>
+      </w:pPr>
+      <w:r>
+        <w:t>Why the selected architecture is appropriate.</w:t>
+      </w:r>
+    </w:p>
+    <w:p>
+      <w:pPr>
+        <w:pStyle w:val="ListParagraph"/>
+        <w:numPr>
+          <w:ilvl w:val="0"/>
+          <w:numId w:val="12"/>
+        </w:numPr>
+      </w:pPr>
+      <w:r>
+        <w:t>How separation of concerns will be achieved.</w:t>
+      </w:r>
+    </w:p>
+    <w:p>
+      <w:pPr>
+        <w:pStyle w:val="ListParagraph"/>
+        <w:numPr>
+          <w:ilvl w:val="0"/>
+          <w:numId w:val="12"/>
+        </w:numPr>
+      </w:pPr>
+      <w:r>
+        <w:t>Where business logic will reside.</w:t>
+      </w:r>
+    </w:p>
+    <w:p>
+      <w:pPr>
+        <w:pStyle w:val="ListParagraph"/>
+        <w:numPr>
+          <w:ilvl w:val="0"/>
+          <w:numId w:val="12"/>
+        </w:numPr>
+      </w:pPr>
+      <w:r>
+        <w:t>How data will move between the UI and persistence layer.</w:t>
+      </w:r>
+    </w:p>
+    <w:p>
+      <w:pPr>
+        <w:pStyle w:val="ListParagraph"/>
+        <w:numPr>
+          <w:ilvl w:val="0"/>
+          <w:numId w:val="12"/>
+        </w:numPr>
+      </w:pPr>
+      <w:r>
+        <w:lastRenderedPageBreak/>
+        <w:t>How the architecture supports maintainability.</w:t>
+      </w:r>
+    </w:p>
+    <w:p>
+      <w:pPr>
+        <w:pStyle w:val="ListParagraph"/>
+        <w:numPr>
+          <w:ilvl w:val="0"/>
+          <w:numId w:val="12"/>
+        </w:numPr>
+      </w:pPr>
+      <w:r>
+        <w:t>How the design supports cross-platform development.</w:t>
+      </w:r>
+    </w:p>
+    <w:p>
+      <w:pPr>
+        <w:pStyle w:val="Heading1"/>
+      </w:pPr>
+    </w:p>
+    <w:p>
+      <w:pPr>
+        <w:pStyle w:val="Heading1"/>
+        <w:numPr>
+          <w:ilvl w:val="0"/>
+          <w:numId w:val="4"/>
+        </w:numPr>
+      </w:pPr>
+      <w:bookmarkStart w:id="4" w:name="_Toc240468791"/>
+      <w:r>
+        <w:t>Data model</w:t>
       </w:r>
       <w:bookmarkEnd w:id="4"/>
-      <w:r>
-        <w:rPr>
-          <w:color w:val="000000" w:themeColor="text1"/>
-          <w:sz w:val="24"/>
-          <w:szCs w:val="24"/>
-        </w:rPr>
-        <w:t>figure just for reference</w:t>
+    </w:p>
+    <w:p>
+      <w:r>
+        <w:t xml:space="preserve">You should provide </w:t>
+      </w:r>
+      <w:r>
+        <w:t xml:space="preserve">an initial data model showing the information that needs to be stored by the application. This should primarily take the form of a relational database schema using UML. The application may also consist of non-relational data such as user or application preferences. </w:t>
+      </w:r>
+    </w:p>
+    <w:p/>
+    <w:p>
+      <w:pPr>
+        <w:pStyle w:val="Heading1"/>
+        <w:numPr>
+          <w:ilvl w:val="0"/>
+          <w:numId w:val="4"/>
+        </w:numPr>
+      </w:pPr>
+      <w:bookmarkStart w:id="5" w:name="_Toc240468792"/>
+      <w:r>
+        <w:t>Technology selection</w:t>
+      </w:r>
+      <w:r>
+        <w:t xml:space="preserve"> and implementation approach</w:t>
+      </w:r>
+      <w:bookmarkEnd w:id="5"/>
+    </w:p>
+    <w:p>
+      <w:r>
+        <w:t xml:space="preserve">Your application must be developed using C# and .NET MAUI, </w:t>
+      </w:r>
+      <w:proofErr w:type="gramStart"/>
+      <w:r>
+        <w:t>however</w:t>
+      </w:r>
+      <w:proofErr w:type="gramEnd"/>
+      <w:r>
+        <w:t xml:space="preserve"> there exist many </w:t>
+      </w:r>
+      <w:r>
+        <w:t>third-party</w:t>
+      </w:r>
+      <w:r>
+        <w:t xml:space="preserve"> </w:t>
+      </w:r>
+      <w:r>
+        <w:t xml:space="preserve">solutions and toolkits that you could use to assist you in developing the HealthTrack application. </w:t>
+      </w:r>
+      <w:r>
+        <w:t xml:space="preserve">You should use this section of the report to present a justification for why the technology or approach you have selected is appropriate rather than simply describing what technologies you are going to use and what they do. </w:t>
       </w:r>
     </w:p>
     <w:p/>
@@ -2029,279 +3947,28 @@
           <w:b/>
           <w:bCs/>
         </w:rPr>
-        <w:t>Architectural considerations</w:t>
-      </w:r>
-    </w:p>
-    <w:p>
-      <w:r>
-        <w:t>Your architecture for the HealthTrack application should address, where applicable the following considerations</w:t>
-      </w:r>
-    </w:p>
-    <w:p>
-      <w:pPr>
-        <w:pStyle w:val="ListParagraph"/>
-        <w:numPr>
-          <w:ilvl w:val="0"/>
-          <w:numId w:val="11"/>
-        </w:numPr>
-      </w:pPr>
-      <w:r>
-        <w:t>Architectural pattern</w:t>
-      </w:r>
-      <w:r>
-        <w:t xml:space="preserve"> </w:t>
+        <w:t>Screen layout, navigation and UI Components</w:t>
+      </w:r>
+    </w:p>
+    <w:p>
+      <w:r>
+        <w:t xml:space="preserve">Navigation within .NET MAUI applications can be implemented in </w:t>
       </w:r>
       <w:proofErr w:type="gramStart"/>
       <w:r>
-        <w:t xml:space="preserve">employed </w:t>
-      </w:r>
-      <w:r>
-        <w:t xml:space="preserve"> (</w:t>
+        <w:t>many different ways</w:t>
       </w:r>
       <w:proofErr w:type="gramEnd"/>
       <w:r>
-        <w:t>e.g.</w:t>
-      </w:r>
-      <w:r>
-        <w:t xml:space="preserve"> MVC, MCP, MVVM)</w:t>
-      </w:r>
-    </w:p>
-    <w:p>
-      <w:pPr>
-        <w:pStyle w:val="ListParagraph"/>
-        <w:numPr>
-          <w:ilvl w:val="0"/>
-          <w:numId w:val="11"/>
-        </w:numPr>
-      </w:pPr>
-      <w:r>
-        <w:t>Services</w:t>
-      </w:r>
-    </w:p>
-    <w:p>
-      <w:pPr>
-        <w:pStyle w:val="ListParagraph"/>
-        <w:numPr>
-          <w:ilvl w:val="0"/>
-          <w:numId w:val="11"/>
-        </w:numPr>
-      </w:pPr>
-      <w:r>
-        <w:t>Data access</w:t>
-      </w:r>
-    </w:p>
-    <w:p>
-      <w:pPr>
-        <w:pStyle w:val="ListParagraph"/>
-        <w:numPr>
-          <w:ilvl w:val="0"/>
-          <w:numId w:val="11"/>
-        </w:numPr>
-      </w:pPr>
-      <w:r>
-        <w:t>Navigation</w:t>
-      </w:r>
-    </w:p>
-    <w:p>
-      <w:pPr>
-        <w:pStyle w:val="ListParagraph"/>
-        <w:numPr>
-          <w:ilvl w:val="0"/>
-          <w:numId w:val="11"/>
-        </w:numPr>
-      </w:pPr>
-      <w:r>
-        <w:t>Application logic</w:t>
-      </w:r>
-    </w:p>
-    <w:p>
-      <w:r>
-        <w:t>This section of the report should explain and justify your approach to the following key questions:</w:t>
-      </w:r>
-    </w:p>
-    <w:p>
-      <w:pPr>
-        <w:pStyle w:val="ListParagraph"/>
-        <w:numPr>
-          <w:ilvl w:val="0"/>
-          <w:numId w:val="12"/>
-        </w:numPr>
-      </w:pPr>
-      <w:r>
-        <w:t>Why the selected architecture is appropriate.</w:t>
-      </w:r>
-    </w:p>
-    <w:p>
-      <w:pPr>
-        <w:pStyle w:val="ListParagraph"/>
-        <w:numPr>
-          <w:ilvl w:val="0"/>
-          <w:numId w:val="12"/>
-        </w:numPr>
-      </w:pPr>
-      <w:r>
-        <w:t>How separation of concerns will be achieved.</w:t>
-      </w:r>
-    </w:p>
-    <w:p>
-      <w:pPr>
-        <w:pStyle w:val="ListParagraph"/>
-        <w:numPr>
-          <w:ilvl w:val="0"/>
-          <w:numId w:val="12"/>
-        </w:numPr>
-      </w:pPr>
-      <w:r>
-        <w:t>Where business logic will reside.</w:t>
-      </w:r>
-    </w:p>
-    <w:p>
-      <w:pPr>
-        <w:pStyle w:val="ListParagraph"/>
-        <w:numPr>
-          <w:ilvl w:val="0"/>
-          <w:numId w:val="12"/>
-        </w:numPr>
-      </w:pPr>
-      <w:r>
-        <w:t>How data will move between the UI and persistence layer.</w:t>
-      </w:r>
-    </w:p>
-    <w:p>
-      <w:pPr>
-        <w:pStyle w:val="ListParagraph"/>
-        <w:numPr>
-          <w:ilvl w:val="0"/>
-          <w:numId w:val="12"/>
-        </w:numPr>
-      </w:pPr>
-      <w:r>
-        <w:t>How the architecture supports maintainability.</w:t>
-      </w:r>
-    </w:p>
-    <w:p>
-      <w:pPr>
-        <w:pStyle w:val="ListParagraph"/>
-        <w:numPr>
-          <w:ilvl w:val="0"/>
-          <w:numId w:val="12"/>
-        </w:numPr>
-      </w:pPr>
-      <w:r>
-        <w:t>How the design supports cross-platform development.</w:t>
-      </w:r>
-    </w:p>
-    <w:p>
-      <w:pPr>
-        <w:pStyle w:val="Heading1"/>
-      </w:pPr>
-    </w:p>
-    <w:p>
-      <w:pPr>
-        <w:pStyle w:val="Heading1"/>
-        <w:numPr>
-          <w:ilvl w:val="0"/>
-          <w:numId w:val="4"/>
-        </w:numPr>
-      </w:pPr>
-      <w:bookmarkStart w:id="5" w:name="_Toc240468791"/>
-      <w:r>
-        <w:t>Data model</w:t>
-      </w:r>
-      <w:bookmarkEnd w:id="5"/>
-    </w:p>
-    <w:p>
-      <w:r>
-        <w:lastRenderedPageBreak/>
-        <w:t xml:space="preserve">You should provide </w:t>
-      </w:r>
-      <w:r>
-        <w:t xml:space="preserve">an initial data model showing the information that needs to be stored by the application. This should primarily take the form of a relational database schema using UML. The application may also consist of non-relational data such as user or application preferences. </w:t>
+        <w:t xml:space="preserve">, provide a justification of what approach you are going to use and how it provides a consistent and accessible approach to navigation for the user. </w:t>
       </w:r>
     </w:p>
     <w:p/>
     <w:p>
-      <w:pPr>
-        <w:pStyle w:val="Heading1"/>
-        <w:numPr>
-          <w:ilvl w:val="0"/>
-          <w:numId w:val="4"/>
-        </w:numPr>
-      </w:pPr>
-      <w:bookmarkStart w:id="6" w:name="_Toc240468792"/>
-      <w:r>
-        <w:t>Technology selection</w:t>
-      </w:r>
-      <w:r>
-        <w:t xml:space="preserve"> and implementation approach</w:t>
-      </w:r>
-      <w:bookmarkEnd w:id="6"/>
-    </w:p>
-    <w:p>
-      <w:r>
-        <w:t xml:space="preserve">Your application must be developed using C# and .NET MAUI, </w:t>
-      </w:r>
-      <w:proofErr w:type="gramStart"/>
-      <w:r>
-        <w:t>however</w:t>
-      </w:r>
-      <w:proofErr w:type="gramEnd"/>
-      <w:r>
-        <w:t xml:space="preserve"> there exist many </w:t>
-      </w:r>
-      <w:r>
-        <w:t>third-party</w:t>
-      </w:r>
-      <w:r>
-        <w:t xml:space="preserve"> </w:t>
-      </w:r>
-      <w:r>
-        <w:t xml:space="preserve">solutions and toolkits that you could use to assist you in developing the HealthTrack application. </w:t>
-      </w:r>
-      <w:r>
-        <w:t xml:space="preserve">You should use this section of the report to present a justification for why the technology or approach you have selected is appropriate rather than simply describing what technologies you are going to use and what they do. </w:t>
-      </w:r>
-    </w:p>
-    <w:p/>
-    <w:p>
-      <w:pPr>
-        <w:pStyle w:val="ListParagraph"/>
-        <w:numPr>
-          <w:ilvl w:val="1"/>
-          <w:numId w:val="4"/>
-        </w:numPr>
-        <w:rPr>
-          <w:b/>
-          <w:bCs/>
-        </w:rPr>
-      </w:pPr>
-      <w:r>
-        <w:rPr>
-          <w:b/>
-          <w:bCs/>
-        </w:rPr>
-        <w:t>Screen layout, navigation and UI Components</w:t>
-      </w:r>
-    </w:p>
-    <w:p>
-      <w:r>
-        <w:t xml:space="preserve">Navigation within .NET MAUI applications can be implemented in </w:t>
-      </w:r>
-      <w:proofErr w:type="gramStart"/>
-      <w:r>
-        <w:t>many different ways</w:t>
-      </w:r>
-      <w:proofErr w:type="gramEnd"/>
-      <w:r>
-        <w:t xml:space="preserve">, provide a justification of what approach you are going to use and how it provides a consistent and accessible approach to navigation for the user. </w:t>
-      </w:r>
-    </w:p>
-    <w:p/>
-    <w:p>
       <w:r>
         <w:t xml:space="preserve">The look and feel of .NET MAUI applications is highly configurable. Google’s Material 3 design can be enabled as an opt-in feature in .NET MAUI 10 onwards (see: </w:t>
       </w:r>
-      <w:hyperlink r:id="rId15" w:history="1">
+      <w:hyperlink r:id="rId34" w:history="1">
         <w:r>
           <w:rPr>
             <w:rStyle w:val="Hyperlink"/>
@@ -2312,7 +3979,7 @@
       <w:r>
         <w:t>) or by using the Uranium UI extension (</w:t>
       </w:r>
-      <w:hyperlink r:id="rId16" w:history="1">
+      <w:hyperlink r:id="rId35" w:history="1">
         <w:r>
           <w:rPr>
             <w:rStyle w:val="Hyperlink"/>
@@ -2386,52 +4053,53 @@
           <w:numId w:val="4"/>
         </w:numPr>
       </w:pPr>
-      <w:bookmarkStart w:id="7" w:name="_Toc240468793"/>
-      <w:r>
+      <w:bookmarkStart w:id="6" w:name="_Toc240468793"/>
+      <w:r>
+        <w:lastRenderedPageBreak/>
         <w:t>Project plan</w:t>
       </w:r>
+      <w:bookmarkEnd w:id="6"/>
+      <w:r>
+        <w:t xml:space="preserve"> </w:t>
+      </w:r>
+    </w:p>
+    <w:p>
+      <w:r>
+        <w:t xml:space="preserve">Provide an outline of the project plan required to complete the </w:t>
+      </w:r>
+      <w:r>
+        <w:t>HealthTrack</w:t>
+      </w:r>
+      <w:r>
+        <w:t xml:space="preserve"> application by the end of the semester. Detail tasks, deliverables and milestones </w:t>
+      </w:r>
+      <w:r>
+        <w:t>with</w:t>
+      </w:r>
+      <w:r>
+        <w:t xml:space="preserve"> appropriate dates.</w:t>
+      </w:r>
+    </w:p>
+    <w:p>
+      <w:pPr>
+        <w:pStyle w:val="Heading1"/>
+      </w:pPr>
+    </w:p>
+    <w:p>
+      <w:pPr>
+        <w:pStyle w:val="Heading1"/>
+      </w:pPr>
+      <w:bookmarkStart w:id="7" w:name="_Toc240468794"/>
+      <w:r>
+        <w:t>References</w:t>
+      </w:r>
       <w:bookmarkEnd w:id="7"/>
-      <w:r>
-        <w:t xml:space="preserve"> </w:t>
-      </w:r>
-    </w:p>
-    <w:p>
-      <w:r>
-        <w:t xml:space="preserve">Provide an outline of the project plan required to complete the </w:t>
-      </w:r>
-      <w:r>
-        <w:t>HealthTrack</w:t>
-      </w:r>
-      <w:r>
-        <w:t xml:space="preserve"> application by the end of the semester. Detail tasks, deliverables and milestones </w:t>
-      </w:r>
-      <w:r>
-        <w:t>with</w:t>
-      </w:r>
-      <w:r>
-        <w:t xml:space="preserve"> appropriate dates.</w:t>
-      </w:r>
-    </w:p>
-    <w:p>
-      <w:pPr>
-        <w:pStyle w:val="Heading1"/>
-      </w:pPr>
-    </w:p>
-    <w:p>
-      <w:pPr>
-        <w:pStyle w:val="Heading1"/>
-      </w:pPr>
-      <w:bookmarkStart w:id="8" w:name="_Toc240468794"/>
-      <w:r>
-        <w:t>References</w:t>
-      </w:r>
-      <w:bookmarkEnd w:id="8"/>
     </w:p>
     <w:p>
       <w:r>
         <w:t xml:space="preserve">Nielsen Norman Group. ‘10 Usability Heuristics for User Interface Design’. Accessed 16 October 2026. </w:t>
       </w:r>
-      <w:hyperlink r:id="rId17" w:history="1">
+      <w:hyperlink r:id="rId36" w:history="1">
         <w:r>
           <w:rPr>
             <w:rStyle w:val="Hyperlink"/>
@@ -2445,6 +4113,22 @@
     </w:p>
     <w:p>
       <w:r>
+        <w:t xml:space="preserve">Harley, Aurora. ‘Proximity Principle in Visual Design’. Nielsen Norman Group. Accessed 20 October 2026. </w:t>
+      </w:r>
+      <w:hyperlink r:id="rId37" w:history="1">
+        <w:r>
+          <w:rPr>
+            <w:rStyle w:val="Hyperlink"/>
+          </w:rPr>
+          <w:t>https://www.nngroup.com/articles/gestalt-proximity/</w:t>
+        </w:r>
+      </w:hyperlink>
+      <w:r>
+        <w:t>.</w:t>
+      </w:r>
+    </w:p>
+    <w:p>
+      <w:r>
         <w:t>‘The-Basics-of-</w:t>
       </w:r>
       <w:proofErr w:type="spellStart"/>
@@ -2455,7 +4139,7 @@
       <w:r>
         <w:t xml:space="preserve">-Design’. n.d. Accessed 16 October 2026. </w:t>
       </w:r>
-      <w:hyperlink r:id="rId18" w:history="1">
+      <w:hyperlink r:id="rId38" w:history="1">
         <w:r>
           <w:rPr>
             <w:rStyle w:val="Hyperlink"/>
@@ -2494,7 +4178,7 @@
       <w:r>
         <w:t xml:space="preserve"> 10 (September 2024): 20552076241253539. </w:t>
       </w:r>
-      <w:hyperlink r:id="rId19" w:history="1">
+      <w:hyperlink r:id="rId39" w:history="1">
         <w:r>
           <w:rPr>
             <w:rStyle w:val="Hyperlink"/>
@@ -2506,6 +4190,30 @@
         <w:t>.</w:t>
       </w:r>
     </w:p>
+    <w:p>
+      <w:proofErr w:type="spellStart"/>
+      <w:r>
+        <w:t>d</w:t>
+      </w:r>
+      <w:r>
+        <w:t>avidortinau</w:t>
+      </w:r>
+      <w:proofErr w:type="spellEnd"/>
+      <w:r>
+        <w:t xml:space="preserve">. ‘Data Binding and MVVM - .NET MAUI’. Accessed 21 October 2026. </w:t>
+      </w:r>
+      <w:hyperlink r:id="rId40" w:history="1">
+        <w:r>
+          <w:rPr>
+            <w:rStyle w:val="Hyperlink"/>
+          </w:rPr>
+          <w:t>https://learn.microsoft.com/en-us/dotnet/maui/xaml/fundamentals/mvvm?view=net-maui-10.0</w:t>
+        </w:r>
+      </w:hyperlink>
+      <w:r>
+        <w:t>.</w:t>
+      </w:r>
+    </w:p>
     <w:p/>
     <w:p>
       <w:pPr>
@@ -2518,14 +4226,14 @@
       <w:pPr>
         <w:pStyle w:val="Heading1"/>
       </w:pPr>
-      <w:bookmarkStart w:id="9" w:name="_Toc240468795"/>
+      <w:bookmarkStart w:id="8" w:name="_Toc240468795"/>
       <w:r>
         <w:t>Academic Integrity</w:t>
       </w:r>
       <w:r>
         <w:t>:</w:t>
       </w:r>
-      <w:bookmarkEnd w:id="9"/>
+      <w:bookmarkEnd w:id="8"/>
     </w:p>
     <w:p>
       <w:r>
@@ -2602,6 +4310,7 @@
         <w:rPr>
           <w:rFonts w:cstheme="majorHAnsi"/>
         </w:rPr>
+        <w:lastRenderedPageBreak/>
         <w:t>Submitting work as your own for assessment, which has been completed partially or entirely by someone else (including a peer, a family member, or other third party).</w:t>
       </w:r>
     </w:p>
@@ -2746,7 +4455,6 @@
         <w:rPr>
           <w:rFonts w:cstheme="majorHAnsi"/>
         </w:rPr>
-        <w:lastRenderedPageBreak/>
         <w:t>You are required to familiarise yourself with the academic integrity policy and associated documents which are available on the student hub area of the ATU website.</w:t>
       </w:r>
     </w:p>
@@ -2759,14 +4467,14 @@
       <w:pPr>
         <w:pStyle w:val="Heading1"/>
       </w:pPr>
-      <w:bookmarkStart w:id="10" w:name="_Toc240468796"/>
+      <w:bookmarkStart w:id="9" w:name="_Toc240468796"/>
       <w:r>
         <w:t xml:space="preserve">Generative AI </w:t>
       </w:r>
       <w:r>
         <w:t>acknowledgements</w:t>
       </w:r>
-      <w:bookmarkEnd w:id="10"/>
+      <w:bookmarkEnd w:id="9"/>
     </w:p>
     <w:p>
       <w:pPr>
@@ -2826,14 +4534,14 @@
           <w:lang w:eastAsia="en-GB"/>
         </w:rPr>
       </w:pPr>
-      <w:bookmarkStart w:id="11" w:name="_Toc240468797"/>
+      <w:bookmarkStart w:id="10" w:name="_Toc240468797"/>
       <w:r>
         <w:rPr>
           <w:lang w:eastAsia="en-GB"/>
         </w:rPr>
         <w:t>General description of Gen AI usage</w:t>
       </w:r>
-      <w:bookmarkEnd w:id="11"/>
+      <w:bookmarkEnd w:id="10"/>
     </w:p>
     <w:p>
       <w:pPr>
@@ -3121,6 +4829,7 @@
         <w:rPr>
           <w:lang w:eastAsia="en-GB"/>
         </w:rPr>
+        <w:lastRenderedPageBreak/>
         <w:t xml:space="preserve">How the output was changed for use or incorporation into a piece of work (e.g. a tracked-changes document or a descriptive paragraph). If an AI tool was used to generate source code, add comments to your source code clearly labelling AI generated code segments. </w:t>
       </w:r>
     </w:p>
@@ -3140,7 +4849,7 @@
         </w:rPr>
         <w:t xml:space="preserve">For a guide on citing generative AI output see: </w:t>
       </w:r>
-      <w:hyperlink r:id="rId20" w:history="1">
+      <w:hyperlink r:id="rId41" w:history="1">
         <w:r>
           <w:rPr>
             <w:rStyle w:val="Hyperlink"/>
@@ -3154,7 +4863,7 @@
     </w:p>
     <w:p/>
     <w:sectPr>
-      <w:footerReference w:type="default" r:id="rId21"/>
+      <w:footerReference w:type="default" r:id="rId42"/>
       <w:pgSz w:w="11906" w:h="16838"/>
       <w:pgMar w:top="1440" w:right="1440" w:bottom="1440" w:left="1440" w:header="708" w:footer="708" w:gutter="0"/>
       <w:pgNumType w:start="1"/>
@@ -5250,6 +6959,26 @@
       <w:szCs w:val="28"/>
     </w:rPr>
   </w:style>
+  <w:style w:type="paragraph" w:styleId="Heading3">
+    <w:name w:val="heading 3"/>
+    <w:basedOn w:val="Normal"/>
+    <w:next w:val="Normal"/>
+    <w:link w:val="Heading3Char"/>
+    <w:uiPriority w:val="9"/>
+    <w:unhideWhenUsed/>
+    <w:qFormat/>
+    <w:rsid w:val="00B334CD"/>
+    <w:pPr>
+      <w:keepNext/>
+      <w:keepLines/>
+      <w:spacing w:before="40" w:after="0"/>
+      <w:outlineLvl w:val="2"/>
+    </w:pPr>
+    <w:rPr>
+      <w:rFonts w:asciiTheme="majorHAnsi" w:eastAsiaTheme="majorEastAsia" w:hAnsiTheme="majorHAnsi" w:cstheme="majorBidi"/>
+      <w:color w:val="1F3763" w:themeColor="accent1" w:themeShade="7F"/>
+    </w:rPr>
+  </w:style>
   <w:style w:type="character" w:default="1" w:styleId="DefaultParagraphFont">
     <w:name w:val="Default Paragraph Font"/>
     <w:uiPriority w:val="1"/>
@@ -5541,6 +7270,19 @@
     <w:rPr>
       <w:color w:val="954F72" w:themeColor="followedHyperlink"/>
       <w:u w:val="single"/>
+    </w:rPr>
+  </w:style>
+  <w:style w:type="character" w:customStyle="1" w:styleId="Heading3Char">
+    <w:name w:val="Heading 3 Char"/>
+    <w:basedOn w:val="DefaultParagraphFont"/>
+    <w:link w:val="Heading3"/>
+    <w:uiPriority w:val="9"/>
+    <w:rsid w:val="00B334CD"/>
+    <w:rPr>
+      <w:rFonts w:asciiTheme="majorHAnsi" w:eastAsiaTheme="majorEastAsia" w:hAnsiTheme="majorHAnsi" w:cstheme="majorBidi"/>
+      <w:color w:val="1F3763" w:themeColor="accent1" w:themeShade="7F"/>
+      <w:sz w:val="24"/>
+      <w:szCs w:val="24"/>
     </w:rPr>
   </w:style>
 </w:styles>

</xml_diff>

<commit_message>
Doc: #S08: Sections 1,2,3 of the Report Complete - L00183767 - 21/10/2026
</commit_message>
<xml_diff>
--- a/CPDCA1_L00183767_Turner.docx
+++ b/CPDCA1_L00183767_Turner.docx
@@ -1159,13 +1159,7 @@
         </w:tabs>
       </w:pPr>
       <w:r>
-        <w:t xml:space="preserve">Figure </w:t>
-      </w:r>
-      <w:r>
-        <w:t>4</w:t>
-      </w:r>
-      <w:r>
-        <w:t xml:space="preserve"> An image showing the Apps Navigation bar</w:t>
+        <w:t>Figure 4 An image showing the Apps Navigation bar</w:t>
       </w:r>
       <w:r>
         <w:tab/>
@@ -1180,13 +1174,7 @@
         </w:tabs>
       </w:pPr>
       <w:r>
-        <w:t xml:space="preserve">Figure </w:t>
-      </w:r>
-      <w:r>
-        <w:t>5</w:t>
-      </w:r>
-      <w:r>
-        <w:t xml:space="preserve"> An image showing the Apps Navigation bar</w:t>
+        <w:t>Figure 5 An image showing the Apps Navigation bar</w:t>
       </w:r>
       <w:r>
         <w:tab/>
@@ -1201,13 +1189,7 @@
         </w:tabs>
       </w:pPr>
       <w:r>
-        <w:t xml:space="preserve">Figure </w:t>
-      </w:r>
-      <w:r>
-        <w:t>6</w:t>
-      </w:r>
-      <w:r>
-        <w:t xml:space="preserve"> An image showing the Apps Navigation bar</w:t>
+        <w:t>Figure 6 An image showing the Apps Navigation bar</w:t>
       </w:r>
       <w:r>
         <w:tab/>
@@ -1222,13 +1204,7 @@
         </w:tabs>
       </w:pPr>
       <w:r>
-        <w:t xml:space="preserve">Figure </w:t>
-      </w:r>
-      <w:r>
-        <w:t>7</w:t>
-      </w:r>
-      <w:r>
-        <w:t xml:space="preserve"> An image showing the Apps Navigation bar</w:t>
+        <w:t>Figure 7 An image showing the Apps Navigation bar</w:t>
       </w:r>
       <w:r>
         <w:tab/>
@@ -1243,13 +1219,7 @@
         </w:tabs>
       </w:pPr>
       <w:r>
-        <w:t xml:space="preserve">Figure </w:t>
-      </w:r>
-      <w:r>
-        <w:t>8</w:t>
-      </w:r>
-      <w:r>
-        <w:t xml:space="preserve"> An image showing the Apps Navigation bar</w:t>
+        <w:t>Figure 8 An image showing the Apps Navigation bar</w:t>
       </w:r>
       <w:r>
         <w:tab/>
@@ -1264,13 +1234,7 @@
         </w:tabs>
       </w:pPr>
       <w:r>
-        <w:t xml:space="preserve">Figure </w:t>
-      </w:r>
-      <w:r>
-        <w:t xml:space="preserve">9 </w:t>
-      </w:r>
-      <w:r>
-        <w:t>An image showing the Apps Navigation bar</w:t>
+        <w:t>Figure 9 An image showing the Apps Navigation bar</w:t>
       </w:r>
       <w:r>
         <w:tab/>
@@ -1285,13 +1249,7 @@
         </w:tabs>
       </w:pPr>
       <w:r>
-        <w:t xml:space="preserve">Figure </w:t>
-      </w:r>
-      <w:r>
-        <w:t>10</w:t>
-      </w:r>
-      <w:r>
-        <w:t xml:space="preserve"> An image showing the Apps Navigation bar</w:t>
+        <w:t>Figure 10 An image showing the Apps Navigation bar</w:t>
       </w:r>
       <w:r>
         <w:tab/>
@@ -1306,13 +1264,7 @@
         </w:tabs>
       </w:pPr>
       <w:r>
-        <w:t xml:space="preserve">Figure </w:t>
-      </w:r>
-      <w:r>
-        <w:t>11</w:t>
-      </w:r>
-      <w:r>
-        <w:t xml:space="preserve"> An image showing the Apps Navigation bar</w:t>
+        <w:t>Figure 11 An image showing the Apps Navigation bar</w:t>
       </w:r>
       <w:r>
         <w:tab/>
@@ -1327,13 +1279,7 @@
         </w:tabs>
       </w:pPr>
       <w:r>
-        <w:t xml:space="preserve">Figure </w:t>
-      </w:r>
-      <w:r>
-        <w:t>12</w:t>
-      </w:r>
-      <w:r>
-        <w:t xml:space="preserve"> An image showing the Apps Navigation bar</w:t>
+        <w:t>Figure 12 An image showing the Apps Navigation bar</w:t>
       </w:r>
       <w:r>
         <w:tab/>
@@ -1536,7 +1482,7 @@
         <w:t xml:space="preserve">      </w:t>
       </w:r>
       <w:r>
-        <w:t>Screen Layout and Information Hierarchy</w:t>
+        <w:t>Navigation Structure</w:t>
       </w:r>
     </w:p>
     <w:p>
@@ -1647,19 +1593,7 @@
         <w:rPr>
           <w:lang w:val="en-IE"/>
         </w:rPr>
-        <w:t xml:space="preserve"> and heart rate. I used a two-column Grid to group these measurements and a </w:t>
-      </w:r>
-      <w:r>
-        <w:rPr>
-          <w:lang w:val="en-IE"/>
-        </w:rPr>
-        <w:t>Scroll View</w:t>
-      </w:r>
-      <w:r>
-        <w:rPr>
-          <w:lang w:val="en-IE"/>
-        </w:rPr>
-        <w:t xml:space="preserve"> so the dashboard can contain more information than fits on one screen.</w:t>
+        <w:t xml:space="preserve"> and heart rate. I used a two-column Grid to group these measurements and a Scroll View so the dashboard can contain more information than fits on one screen.</w:t>
       </w:r>
     </w:p>
     <w:p>
@@ -1841,6 +1775,7 @@
         <w:rPr>
           <w:lang w:val="en-IE"/>
         </w:rPr>
+        <w:lastRenderedPageBreak/>
         <w:t>I grouped related information inside rounded cards with consistent padding, spacing and background colours. This follows the Gestalt principle of proximity: information placed close together is more likely to be understood as a related group</w:t>
       </w:r>
       <w:r>
@@ -1859,7 +1794,7 @@
         <w:rPr>
           <w:lang w:val="en-IE"/>
         </w:rPr>
-        <w:instrText xml:space="preserve"> ADDIN ZOTERO_ITEM CSL_CITATION {"citationID":"Gx32MZzu","properties":{"unsorted":false,"formattedCitation":"(Harley 2026)","plainCitation":"(Harley 2026)","noteIndex":0},"citationItems":[{"id":73,"uris":["http://zotero.org/users/local/ALZH0Phn/items/ST7DEYNK"],"itemData":{"id":73,"type":"webpage","abstract":"Design elements near each other are perceived as related, while elements spaced apart are perceived as belonging to separate groups.","container-title":"Nielsen Norman Group","language":"en","title":"Proximity Principle in Visual Design","URL":"https://www.nngroup.com/articles/gestalt-proximity/","author":[{"family":"Harley","given":"Aurora"}],"accessed":{"date-parts":[["2026",10,20]]}}}],"schema":"https://github.com/citation-style-language/schema/raw/master/csl-citation.json"} </w:instrText>
+        <w:instrText xml:space="preserve"> ADDIN ZOTERO_ITEM CSL_CITATION {"citationID":"Gx32MZzu","properties":{"unsorted":false,"formattedCitation":"(Harley 2026)","plainCitation":"(Harley 2026)","dontUpdate":true,"noteIndex":0},"citationItems":[{"id":73,"uris":["http://zotero.org/users/local/ALZH0Phn/items/ST7DEYNK"],"itemData":{"id":73,"type":"webpage","abstract":"Design elements near each other are perceived as related, while elements spaced apart are perceived as belonging to separate groups.","container-title":"Nielsen Norman Group","language":"en","title":"Proximity Principle in Visual Design","URL":"https://www.nngroup.com/articles/gestalt-proximity/","author":[{"family":"Harley","given":"Aurora"}],"accessed":{"date-parts":[["2026",10,20]]}}}],"schema":"https://github.com/citation-style-language/schema/raw/master/csl-citation.json"} </w:instrText>
       </w:r>
       <w:r>
         <w:rPr>
@@ -2273,6 +2208,9 @@
         </w:rPr>
       </w:pPr>
       <w:r>
+        <w:rPr>
+          <w:noProof/>
+        </w:rPr>
         <w:drawing>
           <wp:inline distT="0" distB="0" distL="0" distR="0" wp14:anchorId="0A6A2AB5" wp14:editId="25F51E5F">
             <wp:extent cx="2524477" cy="4858428"/>
@@ -2313,6 +2251,9 @@
         <w:t xml:space="preserve">            </w:t>
       </w:r>
       <w:r>
+        <w:rPr>
+          <w:noProof/>
+        </w:rPr>
         <w:drawing>
           <wp:inline distT="0" distB="0" distL="0" distR="0" wp14:anchorId="39DF69DE" wp14:editId="4AED2C8F">
             <wp:extent cx="2572109" cy="4972744"/>
@@ -2407,12 +2348,16 @@
     </w:p>
     <w:p>
       <w:r>
+        <w:lastRenderedPageBreak/>
         <w:t>For Settings, I divided the information into Preferences, Measurement Units, Help and Support, and About. This makes the screen easier to scan and avoids mixing notification preferences with privacy information. I also kept profile editing on the Profile page rather than repeating it in Settings, so the same task has one main location.</w:t>
       </w:r>
     </w:p>
     <w:p/>
     <w:p>
       <w:r>
+        <w:rPr>
+          <w:noProof/>
+        </w:rPr>
         <w:drawing>
           <wp:inline distT="0" distB="0" distL="0" distR="0" wp14:anchorId="7FE28B16" wp14:editId="30FEB58B">
             <wp:extent cx="2581635" cy="5391902"/>
@@ -2453,6 +2398,9 @@
         <w:t xml:space="preserve">                 </w:t>
       </w:r>
       <w:r>
+        <w:rPr>
+          <w:noProof/>
+        </w:rPr>
         <w:drawing>
           <wp:inline distT="0" distB="0" distL="0" distR="0" wp14:anchorId="16909943" wp14:editId="445456A3">
             <wp:extent cx="2591162" cy="5458587"/>
@@ -2558,6 +2506,7 @@
         <w:pStyle w:val="Heading2"/>
       </w:pPr>
       <w:r>
+        <w:lastRenderedPageBreak/>
         <w:t>1.4</w:t>
       </w:r>
       <w:r>
@@ -2782,6 +2731,7 @@
         <w:rPr>
           <w:lang w:val="en-IE"/>
         </w:rPr>
+        <w:lastRenderedPageBreak/>
         <w:t xml:space="preserve">When I add the backend, I will also need to validate entries and show feedback when a measurement or activity is saved. </w:t>
       </w:r>
       <w:r>
@@ -2946,15 +2896,9 @@
         <w:rPr>
           <w:lang w:val="en-IE"/>
         </w:rPr>
+        <w:lastRenderedPageBreak/>
         <w:t>The Statistics page uses a bar chart for daily step counts, making it easier to compare the days of the week than reading a list of numbers. I placed day labels underneath and summary cards below the chart to show totals and averages. On the Goals page, the weekly activity bars show how close each day came to the step target, giving users another way of checking their progress.</w:t>
       </w:r>
-    </w:p>
-    <w:p>
-      <w:pPr>
-        <w:rPr>
-          <w:lang w:val="en-IE"/>
-        </w:rPr>
-      </w:pPr>
     </w:p>
     <w:p>
       <w:r>
@@ -3061,21 +3005,7 @@
             <w:rStyle w:val="Hyperlink"/>
             <w:lang w:val="en-IE"/>
           </w:rPr>
-          <w:t>icons</w:t>
-        </w:r>
-        <w:r>
-          <w:rPr>
-            <w:rStyle w:val="Hyperlink"/>
-            <w:lang w:val="en-IE"/>
-          </w:rPr>
-          <w:t>8</w:t>
-        </w:r>
-        <w:r>
-          <w:rPr>
-            <w:rStyle w:val="Hyperlink"/>
-            <w:lang w:val="en-IE"/>
-          </w:rPr>
-          <w:t>.com</w:t>
+          <w:t>icons8.com</w:t>
         </w:r>
       </w:hyperlink>
       <w:r>
@@ -3094,10 +3024,11 @@
       </w:pPr>
       <w:r>
         <w:rPr>
+          <w:noProof/>
           <w:lang w:val="en-IE"/>
         </w:rPr>
         <w:drawing>
-          <wp:inline distT="0" distB="0" distL="0" distR="0" wp14:anchorId="6AD4B74D" wp14:editId="4863AF36">
+          <wp:inline distT="0" distB="0" distL="0" distR="0" wp14:anchorId="6AD4B74D" wp14:editId="50D02BC8">
             <wp:extent cx="4607170" cy="2591980"/>
             <wp:effectExtent l="0" t="0" r="3175" b="0"/>
             <wp:docPr id="2139041753" name="Picture 2"/>
@@ -3157,7 +3088,19 @@
         <w:rPr>
           <w:lang w:val="en-IE"/>
         </w:rPr>
-        <w:t>Figure 12: Teal Colour Palett</w:t>
+        <w:t xml:space="preserve">Figure 12: Teal </w:t>
+      </w:r>
+      <w:r>
+        <w:rPr>
+          <w:lang w:val="en-IE"/>
+        </w:rPr>
+        <w:t>Colour</w:t>
+      </w:r>
+      <w:r>
+        <w:rPr>
+          <w:lang w:val="en-IE"/>
+        </w:rPr>
+        <w:t xml:space="preserve"> Palett</w:t>
       </w:r>
       <w:r>
         <w:rPr>
@@ -3186,6 +3129,7 @@
           <w:noProof/>
           <w:lang w:val="en-IE"/>
         </w:rPr>
+        <w:lastRenderedPageBreak/>
         <w:drawing>
           <wp:inline distT="0" distB="0" distL="0" distR="0" wp14:anchorId="68218BA7" wp14:editId="419273CB">
             <wp:extent cx="633095" cy="633095"/>
@@ -3675,15 +3619,825 @@
       </w:r>
       <w:proofErr w:type="spellEnd"/>
       <w:r>
-        <w:t xml:space="preserve"> using the Model -</w:t>
+        <w:t xml:space="preserve"> using the Model–View–</w:t>
+      </w:r>
+      <w:proofErr w:type="spellStart"/>
+      <w:r>
+        <w:t>ViewModel</w:t>
+      </w:r>
+      <w:proofErr w:type="spellEnd"/>
+      <w:r>
+        <w:t xml:space="preserve"> (MVVM)</w:t>
+      </w:r>
+      <w:r>
+        <w:t xml:space="preserve"> architectural pattern. </w:t>
+      </w:r>
+      <w:r>
+        <w:t>So far</w:t>
+      </w:r>
+      <w:r>
+        <w:t xml:space="preserve">, I have built the main screens in XAML, including Dashboard, Activities, Goals, Statistics, Profile, and Settings pages. Most values displayed on these screens are currently hard-coded examples used to demonstrate the wireframe. As I implement the </w:t>
+      </w:r>
+      <w:r>
+        <w:t>application backend</w:t>
+      </w:r>
+      <w:r>
+        <w:t>, I will replace these fixed values with information retrieved from saved health records and user input.</w:t>
+      </w:r>
+    </w:p>
+    <w:p>
+      <w:pPr>
+        <w:rPr>
+          <w:lang w:val="en-IE"/>
+        </w:rPr>
+      </w:pPr>
+      <w:r>
+        <w:rPr>
+          <w:lang w:val="en-IE"/>
+        </w:rPr>
+        <w:t xml:space="preserve">The current </w:t>
+      </w:r>
+      <w:proofErr w:type="spellStart"/>
+      <w:r>
+        <w:rPr>
+          <w:lang w:val="en-IE"/>
+        </w:rPr>
+        <w:t>HealthTrack</w:t>
+      </w:r>
+      <w:proofErr w:type="spellEnd"/>
+      <w:r>
+        <w:rPr>
+          <w:lang w:val="en-IE"/>
+        </w:rPr>
+        <w:t xml:space="preserve"> wireframe uses a code-behind, event-driven approach</w:t>
+      </w:r>
+      <w:r>
+        <w:rPr>
+          <w:lang w:val="en-IE"/>
+        </w:rPr>
+        <w:t>. The user interface is built in XAML, and C# methods in the corresponding code-behind files handle interactions</w:t>
+      </w:r>
+      <w:r>
+        <w:rPr>
+          <w:lang w:val="en-IE"/>
+        </w:rPr>
+        <w:t xml:space="preserve">. This approach </w:t>
+      </w:r>
+      <w:r>
+        <w:rPr>
+          <w:lang w:val="en-IE"/>
+        </w:rPr>
+        <w:t>lets</w:t>
+      </w:r>
+      <w:r>
+        <w:rPr>
+          <w:lang w:val="en-IE"/>
+        </w:rPr>
+        <w:t xml:space="preserve"> me develop the initial screens and navigation without adding</w:t>
+      </w:r>
+      <w:r>
+        <w:rPr>
+          <w:lang w:val="en-IE"/>
+        </w:rPr>
+        <w:t xml:space="preserve"> unnecessary complexity.</w:t>
+      </w:r>
+    </w:p>
+    <w:p>
+      <w:r>
+        <w:t xml:space="preserve">I chose MVVM because it </w:t>
+      </w:r>
+      <w:r>
+        <w:t xml:space="preserve">lets me keep the visual layout separate from the code that handles </w:t>
+      </w:r>
+      <w:r>
+        <w:t xml:space="preserve">logic, data, and user actions. Microsoft explains that separating the View, </w:t>
+      </w:r>
+      <w:proofErr w:type="spellStart"/>
+      <w:r>
+        <w:t>ViewModel</w:t>
+      </w:r>
+      <w:proofErr w:type="spellEnd"/>
+      <w:r>
+        <w:t xml:space="preserve">, and Model makes an application easier to maintain and test </w:t>
+      </w:r>
+      <w:r>
+        <w:fldChar w:fldCharType="begin"/>
+      </w:r>
+      <w:r>
+        <w:instrText xml:space="preserve"> ADDIN ZOTERO_ITEM CSL_CITATION {"citationID":"25Cgb4IF","properties":{"unsorted":false,"formattedCitation":"(davidortinau 2026a)","plainCitation":"(davidortinau 2026a)","noteIndex":0},"citationItems":[{"id":77,"uris":["http://zotero.org/users/local/ALZH0Phn/items/35VJVHHY"],"itemData":{"id":77,"type":"webpage","abstract":"The Model-View-ViewModel (MVVM) pattern enforces a separation between three software layers — the XAML user interface, called the view, the underlying data, called the model, and an intermediary between the view and the model, called the viewmodel.","language":"en-us","title":"Data binding and MVVM - .NET MAUI","URL":"https://learn.microsoft.com/en-us/dotnet/maui/xaml/fundamentals/mvvm?view=net-maui-10.0","author":[{"family":"davidortinau","given":""}],"accessed":{"date-parts":[["2026",10,21]]}}}],"schema":"https://github.com/citation-style-language/schema/raw/master/csl-citation.json"} </w:instrText>
+      </w:r>
+      <w:r>
+        <w:fldChar w:fldCharType="separate"/>
+      </w:r>
+      <w:r>
+        <w:t>(</w:t>
+      </w:r>
+      <w:proofErr w:type="spellStart"/>
+      <w:r>
+        <w:t>davidortinau</w:t>
+      </w:r>
+      <w:proofErr w:type="spellEnd"/>
+      <w:r>
+        <w:t xml:space="preserve"> 2026a)</w:t>
+      </w:r>
+      <w:r>
+        <w:fldChar w:fldCharType="end"/>
+      </w:r>
+      <w:r>
+        <w:t>. I plan to introduce MVVM gradually instead of rewriting my existing pages.</w:t>
       </w:r>
     </w:p>
     <w:p/>
     <w:p>
       <w:pPr>
-        <w:pStyle w:val="ListParagraph"/>
-        <w:ind w:left="360"/>
-      </w:pPr>
+        <w:pStyle w:val="Heading2"/>
+        <w:numPr>
+          <w:ilvl w:val="1"/>
+          <w:numId w:val="4"/>
+        </w:numPr>
+      </w:pPr>
+      <w:r>
+        <w:t xml:space="preserve">Main Components </w:t>
+      </w:r>
+      <w:r>
+        <w:t>and Separation of Concerns</w:t>
+      </w:r>
+    </w:p>
+    <w:p>
+      <w:r>
+        <w:t>The View layer will consist of my existing XAML pages. These pages will remain responsible for displaying buttons, cards, progress bars, and other controls.</w:t>
+      </w:r>
+    </w:p>
+    <w:p>
+      <w:r>
+        <w:t xml:space="preserve">The </w:t>
+      </w:r>
+      <w:proofErr w:type="spellStart"/>
+      <w:r>
+        <w:t>ViewModels</w:t>
+      </w:r>
+      <w:proofErr w:type="spellEnd"/>
+      <w:r>
+        <w:t xml:space="preserve"> will provide information needed by the pages and respond to users' interactions. For example, a </w:t>
+      </w:r>
+      <w:proofErr w:type="spellStart"/>
+      <w:r>
+        <w:t>DashboardViewModel</w:t>
+      </w:r>
+      <w:proofErr w:type="spellEnd"/>
+      <w:r>
+        <w:t xml:space="preserve"> could supply the daily step count, sleep duration, and recent activity list, while the </w:t>
+      </w:r>
+      <w:proofErr w:type="spellStart"/>
+      <w:r>
+        <w:t>GoalsViewModel</w:t>
+      </w:r>
+      <w:proofErr w:type="spellEnd"/>
+      <w:r>
+        <w:t xml:space="preserve"> could calculate the progress towards the user’s targets.</w:t>
+      </w:r>
+    </w:p>
+    <w:p>
+      <w:r>
+        <w:t>The Models</w:t>
+      </w:r>
+      <w:r>
+        <w:t xml:space="preserve"> will represent the information being stored, such as an Activity, Measurements (Height and Weight), </w:t>
+      </w:r>
+      <w:r>
+        <w:t>Sleep Record</w:t>
+      </w:r>
+      <w:r>
+        <w:t>, Goal</w:t>
+      </w:r>
+      <w:r>
+        <w:t>,</w:t>
+      </w:r>
+      <w:r>
+        <w:t xml:space="preserve"> and </w:t>
+      </w:r>
+      <w:r>
+        <w:t>User Profile.</w:t>
+      </w:r>
+    </w:p>
+    <w:p/>
+    <w:p>
+      <w:r>
+        <w:lastRenderedPageBreak/>
+        <w:drawing>
+          <wp:inline distT="0" distB="0" distL="0" distR="0" wp14:anchorId="645247D3" wp14:editId="1E4B041D">
+            <wp:extent cx="5731510" cy="2254885"/>
+            <wp:effectExtent l="0" t="0" r="2540" b="0"/>
+            <wp:docPr id="1529882761" name="Picture 1"/>
+            <wp:cNvGraphicFramePr>
+              <a:graphicFrameLocks xmlns:a="http://schemas.openxmlformats.org/drawingml/2006/main" noChangeAspect="1"/>
+            </wp:cNvGraphicFramePr>
+            <a:graphic xmlns:a="http://schemas.openxmlformats.org/drawingml/2006/main">
+              <a:graphicData uri="http://schemas.openxmlformats.org/drawingml/2006/picture">
+                <pic:pic xmlns:pic="http://schemas.openxmlformats.org/drawingml/2006/picture">
+                  <pic:nvPicPr>
+                    <pic:cNvPr id="1529882761" name=""/>
+                    <pic:cNvPicPr/>
+                  </pic:nvPicPr>
+                  <pic:blipFill>
+                    <a:blip r:embed="rId34"/>
+                    <a:stretch>
+                      <a:fillRect/>
+                    </a:stretch>
+                  </pic:blipFill>
+                  <pic:spPr>
+                    <a:xfrm>
+                      <a:off x="0" y="0"/>
+                      <a:ext cx="5731510" cy="2254885"/>
+                    </a:xfrm>
+                    <a:prstGeom prst="rect">
+                      <a:avLst/>
+                    </a:prstGeom>
+                  </pic:spPr>
+                </pic:pic>
+              </a:graphicData>
+            </a:graphic>
+          </wp:inline>
+        </w:drawing>
+      </w:r>
+    </w:p>
+    <w:p>
+      <w:pPr>
+        <w:jc w:val="center"/>
+      </w:pPr>
+      <w:r>
+        <w:t>Figure</w:t>
+      </w:r>
+      <w:r>
+        <w:t xml:space="preserve"> 1</w:t>
+      </w:r>
+      <w:r>
+        <w:t>4</w:t>
+      </w:r>
+      <w:r>
+        <w:t>: Proposed</w:t>
+      </w:r>
+      <w:r>
+        <w:t xml:space="preserve"> architectural diagram</w:t>
+      </w:r>
+    </w:p>
+    <w:p/>
+    <w:p/>
+    <w:p>
+      <w:pPr>
+        <w:pStyle w:val="Heading2"/>
+        <w:numPr>
+          <w:ilvl w:val="1"/>
+          <w:numId w:val="4"/>
+        </w:numPr>
+      </w:pPr>
+      <w:r>
+        <w:t>Services and Application Logic</w:t>
+      </w:r>
+    </w:p>
+    <w:p>
+      <w:r>
+        <w:t xml:space="preserve">I plan to add a small </w:t>
+      </w:r>
+      <w:proofErr w:type="spellStart"/>
+      <w:r>
+        <w:t>HealthDataService</w:t>
+      </w:r>
+      <w:proofErr w:type="spellEnd"/>
+      <w:r>
+        <w:t xml:space="preserve"> class to handle common operations, including recording activities, retrieving measurements, and working out weekly summaries. The service can be called by multiple </w:t>
+      </w:r>
+      <w:proofErr w:type="spellStart"/>
+      <w:r>
+        <w:t>ViewModels</w:t>
+      </w:r>
+      <w:proofErr w:type="spellEnd"/>
+      <w:r>
+        <w:t xml:space="preserve"> rather than repeating calculations on the dashboard, goals, and statistics pages</w:t>
+      </w:r>
+    </w:p>
+    <w:p>
+      <w:r>
+        <w:t>An example of this would be that the total weekly step count and daily average should be calculated from stored records rather than being entered separately into each screen.</w:t>
+      </w:r>
+    </w:p>
+    <w:p>
+      <w:r>
+        <w:t>I will also complete input validation on any user inputs before saving them to the database. A measurement must contain numerical values that are relevant to its unit. An Activity must have relevant details like name, duration, est. calories burned, and date. A failed recording should display a clear error message, while a successful one should update the affected screens.</w:t>
+      </w:r>
+    </w:p>
+    <w:p/>
+    <w:p>
+      <w:pPr>
+        <w:pStyle w:val="Heading2"/>
+        <w:numPr>
+          <w:ilvl w:val="1"/>
+          <w:numId w:val="4"/>
+        </w:numPr>
+      </w:pPr>
+      <w:r>
+        <w:t>Data Access and Storage</w:t>
+      </w:r>
+    </w:p>
+    <w:p>
+      <w:r>
+        <w:t xml:space="preserve">For the functional version, I plan to use a local SQLite database through the </w:t>
+      </w:r>
+      <w:proofErr w:type="spellStart"/>
+      <w:r>
+        <w:t>sqlite</w:t>
+      </w:r>
+      <w:proofErr w:type="spellEnd"/>
+      <w:r>
+        <w:t>-net-</w:t>
+      </w:r>
+      <w:proofErr w:type="spellStart"/>
+      <w:r>
+        <w:t>pcl</w:t>
+      </w:r>
+      <w:proofErr w:type="spellEnd"/>
+      <w:r>
+        <w:t xml:space="preserve"> package. Microsoft provides guidance for this approach in the .NET MAUI applications </w:t>
+      </w:r>
+      <w:r>
+        <w:fldChar w:fldCharType="begin"/>
+      </w:r>
+      <w:r>
+        <w:instrText xml:space="preserve"> ADDIN ZOTERO_ITEM CSL_CITATION {"citationID":"VMuGF0FJ","properties":{"unsorted":false,"formattedCitation":"(davidortinau 2026b)","plainCitation":"(davidortinau 2026b)","noteIndex":0},"citationItems":[{"id":81,"uris":["http://zotero.org/users/local/ALZH0Phn/items/XNXE32PS"],"itemData":{"id":81,"type":"webpage","abstract":".NET MAUI supports database-driven applications using the SQLite database engine, which makes it possible to load and save objects in shared code. This article describes how .NET MAUI applications can read and write data to a local SQLite database using SQLite-net","language":"en-us","title":".NET MAUI local databases - .NET MAUI","URL":"https://learn.microsoft.com/en-us/dotnet/maui/data-cloud/database-sqlite?view=net-maui-10.0","author":[{"family":"davidortinau","given":""}],"accessed":{"date-parts":[["2026",10,21]]}}}],"schema":"https://github.com/citation-style-language/schema/raw/master/csl-citation.json"} </w:instrText>
+      </w:r>
+      <w:r>
+        <w:fldChar w:fldCharType="separate"/>
+      </w:r>
+      <w:r>
+        <w:t>(</w:t>
+      </w:r>
+      <w:proofErr w:type="spellStart"/>
+      <w:r>
+        <w:t>davidortinau</w:t>
+      </w:r>
+      <w:proofErr w:type="spellEnd"/>
+      <w:r>
+        <w:t xml:space="preserve"> 2026b)</w:t>
+      </w:r>
+      <w:r>
+        <w:fldChar w:fldCharType="end"/>
+      </w:r>
+      <w:r>
+        <w:t>.</w:t>
+      </w:r>
+    </w:p>
+    <w:p>
+      <w:r>
+        <w:t xml:space="preserve">I chose to use SQLite because the </w:t>
+      </w:r>
+      <w:proofErr w:type="spellStart"/>
+      <w:r>
+        <w:t>HealthTrack</w:t>
+      </w:r>
+      <w:proofErr w:type="spellEnd"/>
+      <w:r>
+        <w:t xml:space="preserve"> app mainly needs to store structured records, and a local database will be simpler to set up than maintaining a web server. It will also let the app read previously saved records without requiring an internet connection. Although it won't require an internet connection, it’s still a relevant angle to consider.</w:t>
+      </w:r>
+    </w:p>
+    <w:p>
+      <w:r>
+        <w:lastRenderedPageBreak/>
+        <w:t xml:space="preserve">A </w:t>
+      </w:r>
+      <w:proofErr w:type="spellStart"/>
+      <w:r>
+        <w:t>HealthTrackDatabase</w:t>
+      </w:r>
+      <w:proofErr w:type="spellEnd"/>
+      <w:r>
+        <w:t xml:space="preserve"> class will handle basic database operations. I intend to save user profile details, activities, body measurements, sleep records, and goals in separate tables, with their relationships explained in section 3 of my report.</w:t>
+      </w:r>
+    </w:p>
+    <w:p>
+      <w:r>
+        <w:t>For the settings screen, I will use the built-in .NET MAUI Preferences API to store smaller options such as reminder switches and preferred measurement units</w:t>
+      </w:r>
+      <w:r>
+        <w:t xml:space="preserve"> </w:t>
+      </w:r>
+      <w:r>
+        <w:fldChar w:fldCharType="begin"/>
+      </w:r>
+      <w:r>
+        <w:instrText xml:space="preserve"> ADDIN ZOTERO_ITEM CSL_CITATION {"citationID":"Y4eZduqL","properties":{"unsorted":false,"formattedCitation":"(davidortinau 2026c)","plainCitation":"(davidortinau 2026c)","noteIndex":0},"citationItems":[{"id":82,"uris":["http://zotero.org/users/local/ALZH0Phn/items/HTSACISK"],"itemData":{"id":82,"type":"webpage","abstract":"Learn how to read and write application preferences, in .NET MAUI. The IPreferences interface can save and load application preferences in a key/value store.","language":"en-us","title":"Preferences - .NET MAUI","URL":"https://learn.microsoft.com/en-us/dotnet/maui/platform-integration/storage/preferences?view=net-maui-10.0","author":[{"family":"davidortinau","given":""}],"accessed":{"date-parts":[["2026",10,21]]}}}],"schema":"https://github.com/citation-style-language/schema/raw/master/csl-citation.json"} </w:instrText>
+      </w:r>
+      <w:r>
+        <w:fldChar w:fldCharType="separate"/>
+      </w:r>
+      <w:r>
+        <w:t>(</w:t>
+      </w:r>
+      <w:proofErr w:type="spellStart"/>
+      <w:r>
+        <w:t>davidortinau</w:t>
+      </w:r>
+      <w:proofErr w:type="spellEnd"/>
+      <w:r>
+        <w:t xml:space="preserve"> 2026c)</w:t>
+      </w:r>
+      <w:r>
+        <w:fldChar w:fldCharType="end"/>
+      </w:r>
+      <w:r>
+        <w:t>.</w:t>
+      </w:r>
+    </w:p>
+    <w:p>
+      <w:r>
+        <w:t xml:space="preserve">When a user logs an activity, the form will pass the entered values to its </w:t>
+      </w:r>
+      <w:proofErr w:type="spellStart"/>
+      <w:r>
+        <w:t>ViewModel</w:t>
+      </w:r>
+      <w:proofErr w:type="spellEnd"/>
+      <w:r>
+        <w:t xml:space="preserve">. The </w:t>
+      </w:r>
+      <w:proofErr w:type="spellStart"/>
+      <w:r>
+        <w:t>ViewModel</w:t>
+      </w:r>
+      <w:proofErr w:type="spellEnd"/>
+      <w:r>
+        <w:t xml:space="preserve"> will communicate with the service</w:t>
+      </w:r>
+      <w:r>
+        <w:t>,</w:t>
+      </w:r>
+      <w:r>
+        <w:t xml:space="preserve"> asking it to validate the </w:t>
+      </w:r>
+      <w:r>
+        <w:t>details and save the record through the database class. When the user returns to the Dashboard or Statistics page, the saved data can be loaded and used to update the recent-activity list and the weekly activity sections, as well as update the activity goal progression.</w:t>
+      </w:r>
+      <w:r>
+        <w:t xml:space="preserve"> </w:t>
+      </w:r>
+    </w:p>
+    <w:p>
+      <w:r>
+        <w:t>The Login and Register pages are still just placeholder pages. During implementation, I will add account creation and authentication.</w:t>
+      </w:r>
+    </w:p>
+    <w:p/>
+    <w:p/>
+    <w:p>
+      <w:pPr>
+        <w:pStyle w:val="Heading2"/>
+        <w:numPr>
+          <w:ilvl w:val="1"/>
+          <w:numId w:val="4"/>
+        </w:numPr>
+      </w:pPr>
+      <w:r>
+        <w:t>Navigation and Page Relationships</w:t>
+      </w:r>
+    </w:p>
+    <w:p>
+      <w:r>
+        <w:t>I will continue using the .NET MAUI Shell, which provides the bottom navigation used in my wireframe. The main tabs are Home, Statistics, Goals, and Settings. Other pages, including Profile and Logging screens, can be opened from relevant buttons or via quick actions.</w:t>
+      </w:r>
+    </w:p>
+    <w:p>
+      <w:r>
+        <w:t>Shell supports navigation through named routes and includes a navigation stack for returning to earlier screens</w:t>
+      </w:r>
+      <w:r>
+        <w:t xml:space="preserve"> </w:t>
+      </w:r>
+      <w:r>
+        <w:fldChar w:fldCharType="begin"/>
+      </w:r>
+      <w:r>
+        <w:instrText xml:space="preserve"> ADDIN ZOTERO_ITEM CSL_CITATION {"citationID":"AFIiVZnK","properties":{"unsorted":false,"formattedCitation":"(davidortinau 2026d)","plainCitation":"(davidortinau 2026d)","noteIndex":0},"citationItems":[{"id":83,"uris":["http://zotero.org/users/local/ALZH0Phn/items/F5JGMKVM"],"itemData":{"id":83,"type":"webpage","abstract":"Learn how .NET MAUI Shell apps can utilize a URI-based navigation experience that permits navigation to any page in the app, without having to follow a set navigation hierarchy.","language":"en-us","title":".NET MAUI Shell navigation - .NET MAUI","URL":"https://learn.microsoft.com/en-us/dotnet/maui/fundamentals/shell/navigation?view=net-maui-10.0","author":[{"family":"davidortinau","given":""}],"accessed":{"date-parts":[["2026",10,21]]}}}],"schema":"https://github.com/citation-style-language/schema/raw/master/csl-citation.json"} </w:instrText>
+      </w:r>
+      <w:r>
+        <w:fldChar w:fldCharType="separate"/>
+      </w:r>
+      <w:r>
+        <w:t>(</w:t>
+      </w:r>
+      <w:proofErr w:type="spellStart"/>
+      <w:r>
+        <w:t>davidortinau</w:t>
+      </w:r>
+      <w:proofErr w:type="spellEnd"/>
+      <w:r>
+        <w:t xml:space="preserve"> 2026d)</w:t>
+      </w:r>
+      <w:r>
+        <w:fldChar w:fldCharType="end"/>
+      </w:r>
+      <w:r>
+        <w:t>.</w:t>
+      </w:r>
+    </w:p>
+    <w:p>
+      <w:proofErr w:type="gramStart"/>
+      <w:r>
+        <w:t>Due to the fact that</w:t>
+      </w:r>
+      <w:proofErr w:type="gramEnd"/>
+      <w:r>
+        <w:t xml:space="preserve"> my navigation is straightforward, I do not think a separate navigation framework is necessary. I can keep the basic navigation calls in the page code-behind while moving calculations and data handling into </w:t>
+      </w:r>
+      <w:proofErr w:type="spellStart"/>
+      <w:r>
+        <w:t>ViewModels</w:t>
+      </w:r>
+      <w:proofErr w:type="spellEnd"/>
+      <w:r>
+        <w:t xml:space="preserve"> and services.</w:t>
+      </w:r>
+    </w:p>
+    <w:p/>
+    <w:p>
+      <w:pPr>
+        <w:pStyle w:val="Heading2"/>
+        <w:numPr>
+          <w:ilvl w:val="1"/>
+          <w:numId w:val="4"/>
+        </w:numPr>
+      </w:pPr>
+      <w:r>
+        <w:t>Maintainability and Cross-Platform Development</w:t>
+      </w:r>
+    </w:p>
+    <w:p>
+      <w:r>
+        <w:t xml:space="preserve">I want to keep the implementation manageable by starting with one shared database class, a small number of services and </w:t>
+      </w:r>
+      <w:proofErr w:type="spellStart"/>
+      <w:r>
+        <w:t>ViewModels</w:t>
+      </w:r>
+      <w:proofErr w:type="spellEnd"/>
+      <w:r>
+        <w:t xml:space="preserve"> for the pages that need live data.</w:t>
+      </w:r>
+    </w:p>
+    <w:p>
+      <w:r>
+        <w:t>I can register these classes using the dependency injection features already provided by .NET MAUI instead of adding a separate library</w:t>
+      </w:r>
+      <w:r>
+        <w:t xml:space="preserve"> </w:t>
+      </w:r>
+      <w:r>
+        <w:fldChar w:fldCharType="begin"/>
+      </w:r>
+      <w:r>
+        <w:instrText xml:space="preserve"> ADDIN ZOTERO_ITEM CSL_CITATION {"citationID":"82rrQTgl","properties":{"unsorted":false,"formattedCitation":"(davidortinau 2026e)","plainCitation":"(davidortinau 2026e)","noteIndex":0},"citationItems":[{"id":84,"uris":["http://zotero.org/users/local/ALZH0Phn/items/QQGBSCLF"],"itemData":{"id":84,"type":"webpage","abstract":"Learn how to inject dependencies in a .NET MAUI app, to decouple concrete types from the code that depends on these types.","language":"en-us","title":"Dependency injection in .NET MAUI - .NET MAUI","URL":"https://learn.microsoft.com/en-us/dotnet/maui/fundamentals/dependency-injection?view=net-maui-10.0","author":[{"family":"davidortinau","given":""}],"accessed":{"date-parts":[["2026",10,21]]}}}],"schema":"https://github.com/citation-style-language/schema/raw/master/csl-citation.json"} </w:instrText>
+      </w:r>
+      <w:r>
+        <w:fldChar w:fldCharType="separate"/>
+      </w:r>
+      <w:r>
+        <w:t>(</w:t>
+      </w:r>
+      <w:proofErr w:type="spellStart"/>
+      <w:r>
+        <w:t>davidortinau</w:t>
+      </w:r>
+      <w:proofErr w:type="spellEnd"/>
+      <w:r>
+        <w:t xml:space="preserve"> 2026e)</w:t>
+      </w:r>
+      <w:r>
+        <w:fldChar w:fldCharType="end"/>
+      </w:r>
+      <w:r>
+        <w:t>. This should make it easier to update components or test calculations without depending on the user interface.</w:t>
+      </w:r>
+    </w:p>
+    <w:p>
+      <w:r>
+        <w:t xml:space="preserve">Using shared XAML, C# Models, </w:t>
+      </w:r>
+      <w:proofErr w:type="spellStart"/>
+      <w:r>
+        <w:t>ViewModels</w:t>
+      </w:r>
+      <w:proofErr w:type="spellEnd"/>
+      <w:r>
+        <w:t>, and services should help me support multiple platforms without making separate versions of the app.</w:t>
+      </w:r>
+    </w:p>
+    <w:p/>
+    <w:p>
+      <w:pPr>
+        <w:pStyle w:val="Heading1"/>
+        <w:numPr>
+          <w:ilvl w:val="0"/>
+          <w:numId w:val="4"/>
+        </w:numPr>
+      </w:pPr>
+      <w:bookmarkStart w:id="4" w:name="_Toc240468791"/>
+      <w:r>
+        <w:lastRenderedPageBreak/>
+        <w:t>Data model</w:t>
+      </w:r>
+      <w:bookmarkEnd w:id="4"/>
+    </w:p>
+    <w:p>
+      <w:pPr>
+        <w:rPr>
+          <w:lang w:val="en-US"/>
+        </w:rPr>
+      </w:pPr>
+      <w:r>
+        <w:t>I created a UML diagram to</w:t>
+      </w:r>
+      <w:r>
+        <w:rPr>
+          <w:lang w:val="en-US"/>
+        </w:rPr>
+        <w:t xml:space="preserve"> </w:t>
+      </w:r>
+      <w:r>
+        <w:rPr>
+          <w:lang w:val="en-US"/>
+        </w:rPr>
+        <w:t>represent the proposed database structure for Health Track</w:t>
+      </w:r>
+      <w:r>
+        <w:rPr>
+          <w:lang w:val="en-US"/>
+        </w:rPr>
+        <w:t xml:space="preserve">, as shown in the figure. The database consists of 6 tables, with the </w:t>
+      </w:r>
+      <w:r>
+        <w:rPr>
+          <w:lang w:val="en-US"/>
+        </w:rPr>
+        <w:t>User</w:t>
+      </w:r>
+      <w:r>
+        <w:rPr>
+          <w:lang w:val="en-US"/>
+        </w:rPr>
+        <w:t xml:space="preserve"> table acting as a central table</w:t>
+      </w:r>
+      <w:r>
+        <w:rPr>
+          <w:lang w:val="en-US"/>
+        </w:rPr>
+        <w:t>.</w:t>
+      </w:r>
+    </w:p>
+    <w:p>
+      <w:pPr>
+        <w:rPr>
+          <w:lang w:val="en-US"/>
+        </w:rPr>
+      </w:pPr>
+      <w:r>
+        <w:rPr>
+          <w:lang w:val="en-US"/>
+        </w:rPr>
+        <w:t>I used one-to-many relationships between the User table and the other five tables. This allows each user to have multiple activities, health measurements, sleep records, goals, and daily health records.</w:t>
+      </w:r>
+    </w:p>
+    <w:p>
+      <w:pPr>
+        <w:rPr>
+          <w:lang w:val="en-US"/>
+        </w:rPr>
+      </w:pPr>
+      <w:r>
+        <w:rPr>
+          <w:lang w:val="en-US"/>
+        </w:rPr>
+        <w:t xml:space="preserve">Each table contains a primary key to uniquely identify individual records, while the </w:t>
+      </w:r>
+      <w:proofErr w:type="spellStart"/>
+      <w:r>
+        <w:rPr>
+          <w:lang w:val="en-US"/>
+        </w:rPr>
+        <w:t>UserID</w:t>
+      </w:r>
+      <w:proofErr w:type="spellEnd"/>
+      <w:r>
+        <w:rPr>
+          <w:lang w:val="en-US"/>
+        </w:rPr>
+        <w:t xml:space="preserve"> foreign key links the records to their associated user. I separated the data into individual tables to keep the database organized and make it easier to retrieve information for the different sections of the application.</w:t>
+      </w:r>
+    </w:p>
+    <w:p>
+      <w:pPr>
+        <w:rPr>
+          <w:lang w:val="en-US"/>
+        </w:rPr>
+      </w:pPr>
+      <w:r>
+        <w:rPr>
+          <w:lang w:val="en-US"/>
+        </w:rPr>
+        <w:t xml:space="preserve">I decided not to create a separate table for measurement units, as </w:t>
+      </w:r>
+      <w:proofErr w:type="spellStart"/>
+      <w:r>
+        <w:rPr>
+          <w:lang w:val="en-US"/>
+        </w:rPr>
+        <w:t>HealthTrack</w:t>
+      </w:r>
+      <w:proofErr w:type="spellEnd"/>
+      <w:r>
+        <w:rPr>
+          <w:lang w:val="en-US"/>
+        </w:rPr>
+        <w:t xml:space="preserve"> only requires a small number of predefined units. Instead, I included a Unit attribute within the </w:t>
+      </w:r>
+      <w:proofErr w:type="spellStart"/>
+      <w:r>
+        <w:rPr>
+          <w:lang w:val="en-US"/>
+        </w:rPr>
+        <w:t>HealthMeasurements</w:t>
+      </w:r>
+      <w:proofErr w:type="spellEnd"/>
+      <w:r>
+        <w:rPr>
+          <w:lang w:val="en-US"/>
+        </w:rPr>
+        <w:t xml:space="preserve"> table. User preferences, such as choosing between metric and imperial measurements, will be stored using the .NET MAUI Preferences API to avoid adding unnecessary complexity to the database.</w:t>
+      </w:r>
+    </w:p>
+    <w:p/>
+    <w:p>
+      <w:pPr>
+        <w:jc w:val="center"/>
+      </w:pPr>
+      <w:r>
+        <w:drawing>
+          <wp:inline distT="0" distB="0" distL="0" distR="0" wp14:anchorId="3E2B9EBE" wp14:editId="08028882">
+            <wp:extent cx="4752996" cy="4000500"/>
+            <wp:effectExtent l="0" t="0" r="9525" b="0"/>
+            <wp:docPr id="1841783152" name="Picture 1"/>
+            <wp:cNvGraphicFramePr>
+              <a:graphicFrameLocks xmlns:a="http://schemas.openxmlformats.org/drawingml/2006/main" noChangeAspect="1"/>
+            </wp:cNvGraphicFramePr>
+            <a:graphic xmlns:a="http://schemas.openxmlformats.org/drawingml/2006/main">
+              <a:graphicData uri="http://schemas.openxmlformats.org/drawingml/2006/picture">
+                <pic:pic xmlns:pic="http://schemas.openxmlformats.org/drawingml/2006/picture">
+                  <pic:nvPicPr>
+                    <pic:cNvPr id="1841783152" name=""/>
+                    <pic:cNvPicPr/>
+                  </pic:nvPicPr>
+                  <pic:blipFill>
+                    <a:blip r:embed="rId35"/>
+                    <a:stretch>
+                      <a:fillRect/>
+                    </a:stretch>
+                  </pic:blipFill>
+                  <pic:spPr>
+                    <a:xfrm>
+                      <a:off x="0" y="0"/>
+                      <a:ext cx="4755937" cy="4002975"/>
+                    </a:xfrm>
+                    <a:prstGeom prst="rect">
+                      <a:avLst/>
+                    </a:prstGeom>
+                  </pic:spPr>
+                </pic:pic>
+              </a:graphicData>
+            </a:graphic>
+          </wp:inline>
+        </w:drawing>
+      </w:r>
+    </w:p>
+    <w:p>
+      <w:pPr>
+        <w:jc w:val="center"/>
+      </w:pPr>
+      <w:r>
+        <w:t>Figure 1</w:t>
+      </w:r>
+      <w:r>
+        <w:t>5</w:t>
+      </w:r>
+      <w:r>
+        <w:t xml:space="preserve">: Relational Database Diagram of </w:t>
+      </w:r>
+      <w:proofErr w:type="spellStart"/>
+      <w:r>
+        <w:t>HealthTrack</w:t>
+      </w:r>
+      <w:proofErr w:type="spellEnd"/>
+    </w:p>
+    <w:p>
+      <w:r>
+        <w:tab/>
+      </w:r>
     </w:p>
     <w:p/>
     <w:p/>
@@ -3691,179 +4445,21 @@
     <w:p/>
     <w:p/>
     <w:p/>
-    <w:p>
-      <w:r>
-        <w:t xml:space="preserve">Your architecture for the </w:t>
-      </w:r>
-      <w:proofErr w:type="spellStart"/>
-      <w:r>
-        <w:t>HealthTrack</w:t>
-      </w:r>
-      <w:proofErr w:type="spellEnd"/>
-      <w:r>
-        <w:t xml:space="preserve"> application should address, where applicable the following considerations</w:t>
-      </w:r>
-    </w:p>
-    <w:p>
-      <w:pPr>
-        <w:pStyle w:val="ListParagraph"/>
-        <w:numPr>
-          <w:ilvl w:val="0"/>
-          <w:numId w:val="11"/>
-        </w:numPr>
-      </w:pPr>
-      <w:r>
-        <w:t>Architectural pattern</w:t>
-      </w:r>
-      <w:r>
-        <w:t xml:space="preserve"> </w:t>
-      </w:r>
-      <w:proofErr w:type="gramStart"/>
-      <w:r>
-        <w:t xml:space="preserve">employed </w:t>
-      </w:r>
-      <w:r>
-        <w:t xml:space="preserve"> (</w:t>
-      </w:r>
-      <w:proofErr w:type="gramEnd"/>
-      <w:r>
-        <w:t>e.g.</w:t>
-      </w:r>
-      <w:r>
-        <w:t xml:space="preserve"> MVC, MCP, MVVM)</w:t>
-      </w:r>
-    </w:p>
-    <w:p>
-      <w:pPr>
-        <w:pStyle w:val="ListParagraph"/>
-        <w:numPr>
-          <w:ilvl w:val="0"/>
-          <w:numId w:val="11"/>
-        </w:numPr>
-      </w:pPr>
-      <w:r>
-        <w:t>Services</w:t>
-      </w:r>
-    </w:p>
-    <w:p>
-      <w:pPr>
-        <w:pStyle w:val="ListParagraph"/>
-        <w:numPr>
-          <w:ilvl w:val="0"/>
-          <w:numId w:val="11"/>
-        </w:numPr>
-      </w:pPr>
-      <w:r>
-        <w:t>Data access</w:t>
-      </w:r>
-    </w:p>
-    <w:p>
-      <w:pPr>
-        <w:pStyle w:val="ListParagraph"/>
-        <w:numPr>
-          <w:ilvl w:val="0"/>
-          <w:numId w:val="11"/>
-        </w:numPr>
-      </w:pPr>
-      <w:r>
-        <w:t>Navigation</w:t>
-      </w:r>
-    </w:p>
-    <w:p>
-      <w:pPr>
-        <w:pStyle w:val="ListParagraph"/>
-        <w:numPr>
-          <w:ilvl w:val="0"/>
-          <w:numId w:val="11"/>
-        </w:numPr>
-      </w:pPr>
-      <w:r>
-        <w:t>Application logic</w:t>
-      </w:r>
-    </w:p>
-    <w:p>
-      <w:r>
-        <w:t>This section of the report should explain and justify your approach to the following key questions:</w:t>
-      </w:r>
-    </w:p>
-    <w:p>
-      <w:pPr>
-        <w:pStyle w:val="ListParagraph"/>
-        <w:numPr>
-          <w:ilvl w:val="0"/>
-          <w:numId w:val="12"/>
-        </w:numPr>
-      </w:pPr>
-      <w:r>
-        <w:t>Why the selected architecture is appropriate.</w:t>
-      </w:r>
-    </w:p>
-    <w:p>
-      <w:pPr>
-        <w:pStyle w:val="ListParagraph"/>
-        <w:numPr>
-          <w:ilvl w:val="0"/>
-          <w:numId w:val="12"/>
-        </w:numPr>
-      </w:pPr>
-      <w:r>
-        <w:t>How separation of concerns will be achieved.</w:t>
-      </w:r>
-    </w:p>
-    <w:p>
-      <w:pPr>
-        <w:pStyle w:val="ListParagraph"/>
-        <w:numPr>
-          <w:ilvl w:val="0"/>
-          <w:numId w:val="12"/>
-        </w:numPr>
-      </w:pPr>
-      <w:r>
-        <w:t>Where business logic will reside.</w:t>
-      </w:r>
-    </w:p>
-    <w:p>
-      <w:pPr>
-        <w:pStyle w:val="ListParagraph"/>
-        <w:numPr>
-          <w:ilvl w:val="0"/>
-          <w:numId w:val="12"/>
-        </w:numPr>
-      </w:pPr>
-      <w:r>
-        <w:t>How data will move between the UI and persistence layer.</w:t>
-      </w:r>
-    </w:p>
-    <w:p>
-      <w:pPr>
-        <w:pStyle w:val="ListParagraph"/>
-        <w:numPr>
-          <w:ilvl w:val="0"/>
-          <w:numId w:val="12"/>
-        </w:numPr>
-      </w:pPr>
-      <w:r>
-        <w:lastRenderedPageBreak/>
-        <w:t>How the architecture supports maintainability.</w:t>
-      </w:r>
-    </w:p>
-    <w:p>
-      <w:pPr>
-        <w:pStyle w:val="ListParagraph"/>
-        <w:numPr>
-          <w:ilvl w:val="0"/>
-          <w:numId w:val="12"/>
-        </w:numPr>
-      </w:pPr>
-      <w:r>
-        <w:t>How the design supports cross-platform development.</w:t>
-      </w:r>
-    </w:p>
-    <w:p>
-      <w:pPr>
-        <w:pStyle w:val="Heading1"/>
-      </w:pPr>
-    </w:p>
+    <w:p/>
+    <w:p/>
+    <w:p/>
+    <w:p/>
+    <w:p/>
+    <w:p/>
+    <w:p/>
+    <w:p/>
+    <w:p/>
+    <w:p/>
+    <w:p/>
+    <w:p/>
+    <w:p/>
+    <w:p/>
+    <w:p/>
     <w:p>
       <w:pPr>
         <w:pStyle w:val="Heading1"/>
@@ -3872,29 +4468,6 @@
           <w:numId w:val="4"/>
         </w:numPr>
       </w:pPr>
-      <w:bookmarkStart w:id="4" w:name="_Toc240468791"/>
-      <w:r>
-        <w:t>Data model</w:t>
-      </w:r>
-      <w:bookmarkEnd w:id="4"/>
-    </w:p>
-    <w:p>
-      <w:r>
-        <w:t xml:space="preserve">You should provide </w:t>
-      </w:r>
-      <w:r>
-        <w:t xml:space="preserve">an initial data model showing the information that needs to be stored by the application. This should primarily take the form of a relational database schema using UML. The application may also consist of non-relational data such as user or application preferences. </w:t>
-      </w:r>
-    </w:p>
-    <w:p/>
-    <w:p>
-      <w:pPr>
-        <w:pStyle w:val="Heading1"/>
-        <w:numPr>
-          <w:ilvl w:val="0"/>
-          <w:numId w:val="4"/>
-        </w:numPr>
-      </w:pPr>
       <w:bookmarkStart w:id="5" w:name="_Toc240468792"/>
       <w:r>
         <w:t>Technology selection</w:t>
@@ -3952,6 +4525,7 @@
     </w:p>
     <w:p>
       <w:r>
+        <w:lastRenderedPageBreak/>
         <w:t xml:space="preserve">Navigation within .NET MAUI applications can be implemented in </w:t>
       </w:r>
       <w:proofErr w:type="gramStart"/>
@@ -3968,7 +4542,7 @@
       <w:r>
         <w:t xml:space="preserve">The look and feel of .NET MAUI applications is highly configurable. Google’s Material 3 design can be enabled as an opt-in feature in .NET MAUI 10 onwards (see: </w:t>
       </w:r>
-      <w:hyperlink r:id="rId34" w:history="1">
+      <w:hyperlink r:id="rId36" w:history="1">
         <w:r>
           <w:rPr>
             <w:rStyle w:val="Hyperlink"/>
@@ -3979,7 +4553,7 @@
       <w:r>
         <w:t>) or by using the Uranium UI extension (</w:t>
       </w:r>
-      <w:hyperlink r:id="rId35" w:history="1">
+      <w:hyperlink r:id="rId37" w:history="1">
         <w:r>
           <w:rPr>
             <w:rStyle w:val="Hyperlink"/>
@@ -4055,51 +4629,60 @@
       </w:pPr>
       <w:bookmarkStart w:id="6" w:name="_Toc240468793"/>
       <w:r>
+        <w:t>Project plan</w:t>
+      </w:r>
+      <w:bookmarkEnd w:id="6"/>
+      <w:r>
+        <w:t xml:space="preserve"> </w:t>
+      </w:r>
+    </w:p>
+    <w:p>
+      <w:r>
+        <w:t xml:space="preserve">Provide an outline of the project plan required to complete the </w:t>
+      </w:r>
+      <w:r>
+        <w:t>HealthTrack</w:t>
+      </w:r>
+      <w:r>
+        <w:t xml:space="preserve"> application by the end of the semester. Detail tasks, deliverables and milestones </w:t>
+      </w:r>
+      <w:r>
+        <w:t>with</w:t>
+      </w:r>
+      <w:r>
+        <w:t xml:space="preserve"> appropriate dates.</w:t>
+      </w:r>
+    </w:p>
+    <w:p>
+      <w:pPr>
+        <w:pStyle w:val="Heading1"/>
+      </w:pPr>
+    </w:p>
+    <w:p/>
+    <w:p/>
+    <w:p/>
+    <w:p/>
+    <w:p/>
+    <w:p/>
+    <w:p/>
+    <w:p/>
+    <w:p/>
+    <w:p>
+      <w:pPr>
+        <w:pStyle w:val="Heading1"/>
+      </w:pPr>
+      <w:bookmarkStart w:id="7" w:name="_Toc240468794"/>
+      <w:r>
+        <w:t>References</w:t>
+      </w:r>
+      <w:bookmarkEnd w:id="7"/>
+    </w:p>
+    <w:p>
+      <w:r>
         <w:lastRenderedPageBreak/>
-        <w:t>Project plan</w:t>
-      </w:r>
-      <w:bookmarkEnd w:id="6"/>
-      <w:r>
-        <w:t xml:space="preserve"> </w:t>
-      </w:r>
-    </w:p>
-    <w:p>
-      <w:r>
-        <w:t xml:space="preserve">Provide an outline of the project plan required to complete the </w:t>
-      </w:r>
-      <w:r>
-        <w:t>HealthTrack</w:t>
-      </w:r>
-      <w:r>
-        <w:t xml:space="preserve"> application by the end of the semester. Detail tasks, deliverables and milestones </w:t>
-      </w:r>
-      <w:r>
-        <w:t>with</w:t>
-      </w:r>
-      <w:r>
-        <w:t xml:space="preserve"> appropriate dates.</w:t>
-      </w:r>
-    </w:p>
-    <w:p>
-      <w:pPr>
-        <w:pStyle w:val="Heading1"/>
-      </w:pPr>
-    </w:p>
-    <w:p>
-      <w:pPr>
-        <w:pStyle w:val="Heading1"/>
-      </w:pPr>
-      <w:bookmarkStart w:id="7" w:name="_Toc240468794"/>
-      <w:r>
-        <w:t>References</w:t>
-      </w:r>
-      <w:bookmarkEnd w:id="7"/>
-    </w:p>
-    <w:p>
-      <w:r>
         <w:t xml:space="preserve">Nielsen Norman Group. ‘10 Usability Heuristics for User Interface Design’. Accessed 16 October 2026. </w:t>
       </w:r>
-      <w:hyperlink r:id="rId36" w:history="1">
+      <w:hyperlink r:id="rId38" w:history="1">
         <w:r>
           <w:rPr>
             <w:rStyle w:val="Hyperlink"/>
@@ -4115,7 +4698,7 @@
       <w:r>
         <w:t xml:space="preserve">Harley, Aurora. ‘Proximity Principle in Visual Design’. Nielsen Norman Group. Accessed 20 October 2026. </w:t>
       </w:r>
-      <w:hyperlink r:id="rId37" w:history="1">
+      <w:hyperlink r:id="rId39" w:history="1">
         <w:r>
           <w:rPr>
             <w:rStyle w:val="Hyperlink"/>
@@ -4139,7 +4722,7 @@
       <w:r>
         <w:t xml:space="preserve">-Design’. n.d. Accessed 16 October 2026. </w:t>
       </w:r>
-      <w:hyperlink r:id="rId38" w:history="1">
+      <w:hyperlink r:id="rId40" w:history="1">
         <w:r>
           <w:rPr>
             <w:rStyle w:val="Hyperlink"/>
@@ -4178,7 +4761,7 @@
       <w:r>
         <w:t xml:space="preserve"> 10 (September 2024): 20552076241253539. </w:t>
       </w:r>
-      <w:hyperlink r:id="rId39" w:history="1">
+      <w:hyperlink r:id="rId41" w:history="1">
         <w:r>
           <w:rPr>
             <w:rStyle w:val="Hyperlink"/>
@@ -4191,18 +4774,18 @@
       </w:r>
     </w:p>
     <w:p>
+      <w:pPr>
+        <w:ind w:hanging="480"/>
+      </w:pPr>
       <w:proofErr w:type="spellStart"/>
       <w:r>
-        <w:t>d</w:t>
-      </w:r>
-      <w:r>
-        <w:t>avidortinau</w:t>
+        <w:t>davidortinau</w:t>
       </w:r>
       <w:proofErr w:type="spellEnd"/>
       <w:r>
         <w:t xml:space="preserve">. ‘Data Binding and MVVM - .NET MAUI’. Accessed 21 October 2026. </w:t>
       </w:r>
-      <w:hyperlink r:id="rId40" w:history="1">
+      <w:hyperlink r:id="rId42" w:history="1">
         <w:r>
           <w:rPr>
             <w:rStyle w:val="Hyperlink"/>
@@ -4213,8 +4796,157 @@
       <w:r>
         <w:t>.</w:t>
       </w:r>
+      <w:r>
+        <w:t xml:space="preserve"> </w:t>
+      </w:r>
+    </w:p>
+    <w:p>
+      <w:pPr>
+        <w:ind w:hanging="480"/>
+      </w:pPr>
+      <w:proofErr w:type="spellStart"/>
+      <w:r>
+        <w:t>davidortinau</w:t>
+      </w:r>
+      <w:proofErr w:type="spellEnd"/>
+      <w:r>
+        <w:t xml:space="preserve">. ‘Dependency Injection in .NET MAUI - .NET MAUI’. Accessed 21 October 2026. </w:t>
+      </w:r>
+      <w:hyperlink r:id="rId43" w:history="1">
+        <w:r>
+          <w:rPr>
+            <w:rStyle w:val="Hyperlink"/>
+          </w:rPr>
+          <w:t>https://learn.microsoft.com/en-us/dotnet/maui/fundamentals/dependency-injection?view=net-maui-10.0</w:t>
+        </w:r>
+      </w:hyperlink>
+      <w:r>
+        <w:t>.</w:t>
+      </w:r>
+      <w:r>
+        <w:t xml:space="preserve"> </w:t>
+      </w:r>
+    </w:p>
+    <w:p>
+      <w:pPr>
+        <w:ind w:hanging="480"/>
+      </w:pPr>
+      <w:r>
+        <w:t xml:space="preserve">Sergio0694. ‘Introduction to the MVVM Toolkit - Community Toolkits for .NET’. Accessed 21 October 2026. </w:t>
+      </w:r>
+      <w:hyperlink r:id="rId44" w:history="1">
+        <w:r>
+          <w:rPr>
+            <w:rStyle w:val="Hyperlink"/>
+          </w:rPr>
+          <w:t>https://learn.microsoft.com/en-us/dotnet/communitytoolkit/mvvm/</w:t>
+        </w:r>
+      </w:hyperlink>
+      <w:r>
+        <w:t>.</w:t>
+      </w:r>
+    </w:p>
+    <w:p>
+      <w:pPr>
+        <w:ind w:hanging="480"/>
+      </w:pPr>
+      <w:proofErr w:type="spellStart"/>
+      <w:r>
+        <w:t>davidortinau</w:t>
+      </w:r>
+      <w:proofErr w:type="spellEnd"/>
+      <w:r>
+        <w:t xml:space="preserve">. </w:t>
+      </w:r>
+      <w:proofErr w:type="gramStart"/>
+      <w:r>
+        <w:t>.‘</w:t>
+      </w:r>
+      <w:proofErr w:type="gramEnd"/>
+      <w:r>
+        <w:t xml:space="preserve">.NET MAUI Local Databases - .NET MAUI’. Accessed 21 October 2026. </w:t>
+      </w:r>
+      <w:hyperlink r:id="rId45" w:history="1">
+        <w:r>
+          <w:rPr>
+            <w:rStyle w:val="Hyperlink"/>
+          </w:rPr>
+          <w:t>https://learn.microsoft.com/en-us/dotnet/maui/data-cloud/database-sqlite?view=net-maui-10.0</w:t>
+        </w:r>
+      </w:hyperlink>
+      <w:r>
+        <w:t>.</w:t>
+      </w:r>
+    </w:p>
+    <w:p>
+      <w:pPr>
+        <w:ind w:hanging="480"/>
+      </w:pPr>
+      <w:proofErr w:type="spellStart"/>
+      <w:r>
+        <w:t>davidortinau</w:t>
+      </w:r>
+      <w:proofErr w:type="spellEnd"/>
+      <w:r>
+        <w:t xml:space="preserve">. </w:t>
+      </w:r>
+      <w:proofErr w:type="gramStart"/>
+      <w:r>
+        <w:t>.‘</w:t>
+      </w:r>
+      <w:proofErr w:type="gramEnd"/>
+      <w:r>
+        <w:t xml:space="preserve">.NET MAUI Shell Navigation - .NET MAUI’. Accessed 21 October 2026. </w:t>
+      </w:r>
+      <w:hyperlink r:id="rId46" w:history="1">
+        <w:r>
+          <w:rPr>
+            <w:rStyle w:val="Hyperlink"/>
+          </w:rPr>
+          <w:t>https://learn.microsoft.com/en-us/dotnet/maui/fundamentals/shell/navigation?view=net-maui-10.0</w:t>
+        </w:r>
+      </w:hyperlink>
+      <w:r>
+        <w:t>.</w:t>
+      </w:r>
+    </w:p>
+    <w:p>
+      <w:pPr>
+        <w:ind w:hanging="480"/>
+      </w:pPr>
+      <w:proofErr w:type="spellStart"/>
+      <w:r>
+        <w:t>davidortinau</w:t>
+      </w:r>
+      <w:proofErr w:type="spellEnd"/>
+      <w:r>
+        <w:t xml:space="preserve">. ‘Preferences - .NET MAUI’. Accessed 21 October 2026. </w:t>
+      </w:r>
+      <w:hyperlink r:id="rId47" w:history="1">
+        <w:r>
+          <w:rPr>
+            <w:rStyle w:val="Hyperlink"/>
+          </w:rPr>
+          <w:t>https://learn.microsoft.com/en-us/dotnet/maui/platform-integration/storage/preferences?view=net-maui-10.0</w:t>
+        </w:r>
+      </w:hyperlink>
+      <w:r>
+        <w:t>.</w:t>
+      </w:r>
+    </w:p>
+    <w:p>
+      <w:pPr>
+        <w:ind w:hanging="480"/>
+      </w:pPr>
     </w:p>
     <w:p/>
+    <w:p/>
+    <w:p/>
+    <w:p>
+      <w:r>
+        <w:t>=</w:t>
+      </w:r>
+    </w:p>
     <w:p>
       <w:pPr>
         <w:rPr>
@@ -4237,6 +4969,7 @@
     </w:p>
     <w:p>
       <w:r>
+        <w:lastRenderedPageBreak/>
         <w:t>ATU has adopted the NAIN (2021) definition of academic integrity that is derived from the</w:t>
       </w:r>
       <w:r>
@@ -4310,7 +5043,6 @@
         <w:rPr>
           <w:rFonts w:cstheme="majorHAnsi"/>
         </w:rPr>
-        <w:lastRenderedPageBreak/>
         <w:t>Submitting work as your own for assessment, which has been completed partially or entirely by someone else (including a peer, a family member, or other third party).</w:t>
       </w:r>
     </w:p>
@@ -4617,6 +5349,7 @@
           <w:color w:val="000000"/>
           <w:lang w:eastAsia="en-GB"/>
         </w:rPr>
+        <w:lastRenderedPageBreak/>
         <w:t xml:space="preserve">For each </w:t>
       </w:r>
       <w:r>
@@ -4829,7 +5562,6 @@
         <w:rPr>
           <w:lang w:eastAsia="en-GB"/>
         </w:rPr>
-        <w:lastRenderedPageBreak/>
         <w:t xml:space="preserve">How the output was changed for use or incorporation into a piece of work (e.g. a tracked-changes document or a descriptive paragraph). If an AI tool was used to generate source code, add comments to your source code clearly labelling AI generated code segments. </w:t>
       </w:r>
     </w:p>
@@ -4849,7 +5581,7 @@
         </w:rPr>
         <w:t xml:space="preserve">For a guide on citing generative AI output see: </w:t>
       </w:r>
-      <w:hyperlink r:id="rId41" w:history="1">
+      <w:hyperlink r:id="rId48" w:history="1">
         <w:r>
           <w:rPr>
             <w:rStyle w:val="Hyperlink"/>
@@ -4863,7 +5595,7 @@
     </w:p>
     <w:p/>
     <w:sectPr>
-      <w:footerReference w:type="default" r:id="rId42"/>
+      <w:footerReference w:type="default" r:id="rId49"/>
       <w:pgSz w:w="11906" w:h="16838"/>
       <w:pgMar w:top="1440" w:right="1440" w:bottom="1440" w:left="1440" w:header="708" w:footer="708" w:gutter="0"/>
       <w:pgNumType w:start="1"/>
@@ -7285,6 +8017,25 @@
       <w:szCs w:val="24"/>
     </w:rPr>
   </w:style>
+  <w:style w:type="table" w:styleId="TableGrid">
+    <w:name w:val="Table Grid"/>
+    <w:basedOn w:val="TableNormal"/>
+    <w:uiPriority w:val="39"/>
+    <w:rsid w:val="003B1CD4"/>
+    <w:pPr>
+      <w:spacing w:after="0" w:line="240" w:lineRule="auto"/>
+    </w:pPr>
+    <w:tblPr>
+      <w:tblBorders>
+        <w:top w:val="single" w:sz="4" w:space="0" w:color="auto"/>
+        <w:left w:val="single" w:sz="4" w:space="0" w:color="auto"/>
+        <w:bottom w:val="single" w:sz="4" w:space="0" w:color="auto"/>
+        <w:right w:val="single" w:sz="4" w:space="0" w:color="auto"/>
+        <w:insideH w:val="single" w:sz="4" w:space="0" w:color="auto"/>
+        <w:insideV w:val="single" w:sz="4" w:space="0" w:color="auto"/>
+      </w:tblBorders>
+    </w:tblPr>
+  </w:style>
 </w:styles>
 </file>
 

</xml_diff>